<commit_message>
feat(sbd): alinear estetica del informe ejecutivo con MIA e incorporar PDF oficial
</commit_message>
<xml_diff>
--- a/docs/Informe_Ejecutivo_ZBE_Bilbao_HaizeLab.docx
+++ b/docs/Informe_Ejecutivo_ZBE_Bilbao_HaizeLab.docx
@@ -2,63 +2,244 @@
 <file path=word/document.xml><?xml version="1.0" encoding="utf-8"?>
 <w:document xmlns:wpc="http://schemas.microsoft.com/office/word/2010/wordprocessingCanvas" xmlns:mo="http://schemas.microsoft.com/office/mac/office/2008/main" xmlns:mc="http://schemas.openxmlformats.org/markup-compatibility/2006" xmlns:mv="urn:schemas-microsoft-com:mac:vml" xmlns:o="urn:schemas-microsoft-com:office:office" xmlns:r="http://schemas.openxmlformats.org/officeDocument/2006/relationships" xmlns:m="http://schemas.openxmlformats.org/officeDocument/2006/math" xmlns:v="urn:schemas-microsoft-com:vml" xmlns:wp14="http://schemas.microsoft.com/office/word/2010/wordprocessingDrawing" xmlns:wp="http://schemas.openxmlformats.org/drawingml/2006/wordprocessingDrawing" xmlns:w10="urn:schemas-microsoft-com:office:word" xmlns:w="http://schemas.openxmlformats.org/wordprocessingml/2006/main" xmlns:w14="http://schemas.microsoft.com/office/word/2010/wordml" xmlns:wpg="http://schemas.microsoft.com/office/word/2010/wordprocessingGroup" xmlns:wpi="http://schemas.microsoft.com/office/word/2010/wordprocessingInk" xmlns:wne="http://schemas.microsoft.com/office/word/2006/wordml" xmlns:wps="http://schemas.microsoft.com/office/word/2010/wordprocessingShape" mc:Ignorable="w14 wp14">
   <w:body>
+    <w:tbl>
+      <w:tblPr>
+        <w:tblW w:type="auto" w:w="0"/>
+        <w:jc w:val="center"/>
+        <w:tblLook w:firstColumn="1" w:firstRow="1" w:lastColumn="0" w:lastRow="0" w:noHBand="0" w:noVBand="1" w:val="04A0"/>
+        <w:tblBorders>
+          <w:top w:val="none" w:sz="0" w:space="0" w:color="FFFFFF"/>
+          <w:left w:val="none" w:sz="0" w:space="0" w:color="FFFFFF"/>
+          <w:bottom w:val="none" w:sz="0" w:space="0" w:color="FFFFFF"/>
+          <w:right w:val="none" w:sz="0" w:space="0" w:color="FFFFFF"/>
+          <w:insideH w:val="none" w:sz="0" w:space="0" w:color="FFFFFF"/>
+          <w:insideV w:val="none" w:sz="0" w:space="0" w:color="FFFFFF"/>
+        </w:tblBorders>
+      </w:tblPr>
+      <w:tblGrid>
+        <w:gridCol w:w="2510"/>
+        <w:gridCol w:w="2510"/>
+        <w:gridCol w:w="2510"/>
+        <w:gridCol w:w="2510"/>
+      </w:tblGrid>
+      <w:tr>
+        <w:tc>
+          <w:tcPr>
+            <w:tcW w:type="dxa" w:w="2600"/>
+            <w:tcMar>
+              <w:top w:w="40" w:type="dxa"/>
+              <w:bottom w:w="60" w:type="dxa"/>
+              <w:left w:w="40" w:type="dxa"/>
+              <w:right w:w="40" w:type="dxa"/>
+            </w:tcMar>
+          </w:tcPr>
+          <w:p>
+            <w:pPr>
+              <w:spacing w:after="20"/>
+            </w:pPr>
+            <w:r>
+              <w:rPr>
+                <w:rFonts w:ascii="Arial" w:hAnsi="Arial"/>
+                <w:b/>
+                <w:color w:val="0E7C7B"/>
+                <w:sz w:val="16"/>
+              </w:rPr>
+              <w:t>EQUIPO</w:t>
+            </w:r>
+          </w:p>
+          <w:p>
+            <w:pPr>
+              <w:spacing w:after="0"/>
+            </w:pPr>
+            <w:r>
+              <w:rPr>
+                <w:rFonts w:ascii="Arial" w:hAnsi="Arial"/>
+                <w:color w:val="2B2F3A"/>
+                <w:sz w:val="19"/>
+              </w:rPr>
+              <w:t>Haizen Lab: Iñigo, Kerman y Alfred</w:t>
+            </w:r>
+          </w:p>
+        </w:tc>
+        <w:tc>
+          <w:tcPr>
+            <w:tcW w:type="dxa" w:w="2900"/>
+            <w:tcMar>
+              <w:top w:w="40" w:type="dxa"/>
+              <w:bottom w:w="60" w:type="dxa"/>
+              <w:left w:w="40" w:type="dxa"/>
+              <w:right w:w="40" w:type="dxa"/>
+            </w:tcMar>
+          </w:tcPr>
+          <w:p>
+            <w:pPr>
+              <w:spacing w:after="20"/>
+            </w:pPr>
+            <w:r>
+              <w:rPr>
+                <w:rFonts w:ascii="Arial" w:hAnsi="Arial"/>
+                <w:b/>
+                <w:color w:val="0E7C7B"/>
+                <w:sz w:val="16"/>
+              </w:rPr>
+              <w:t>MÓDULO</w:t>
+            </w:r>
+          </w:p>
+          <w:p>
+            <w:pPr>
+              <w:spacing w:after="0"/>
+            </w:pPr>
+            <w:r>
+              <w:rPr>
+                <w:rFonts w:ascii="Arial" w:hAnsi="Arial"/>
+                <w:color w:val="2B2F3A"/>
+                <w:sz w:val="19"/>
+              </w:rPr>
+              <w:t>Sistemas de Big Data (5074) · CF Somorrostro</w:t>
+            </w:r>
+          </w:p>
+        </w:tc>
+        <w:tc>
+          <w:tcPr>
+            <w:tcW w:type="dxa" w:w="3000"/>
+            <w:tcMar>
+              <w:top w:w="40" w:type="dxa"/>
+              <w:bottom w:w="60" w:type="dxa"/>
+              <w:left w:w="40" w:type="dxa"/>
+              <w:right w:w="40" w:type="dxa"/>
+            </w:tcMar>
+          </w:tcPr>
+          <w:p>
+            <w:pPr>
+              <w:spacing w:after="20"/>
+            </w:pPr>
+            <w:r>
+              <w:rPr>
+                <w:rFonts w:ascii="Arial" w:hAnsi="Arial"/>
+                <w:b/>
+                <w:color w:val="0E7C7B"/>
+                <w:sz w:val="16"/>
+              </w:rPr>
+              <w:t>CLIENTE (SIMULADO)</w:t>
+            </w:r>
+          </w:p>
+          <w:p>
+            <w:pPr>
+              <w:spacing w:after="0"/>
+            </w:pPr>
+            <w:r>
+              <w:rPr>
+                <w:rFonts w:ascii="Arial" w:hAnsi="Arial"/>
+                <w:color w:val="2B2F3A"/>
+                <w:sz w:val="19"/>
+              </w:rPr>
+              <w:t>Ayuntamiento de Bilbao, movilidad y sostenibilidad</w:t>
+            </w:r>
+          </w:p>
+        </w:tc>
+        <w:tc>
+          <w:tcPr>
+            <w:tcW w:type="dxa" w:w="1200"/>
+            <w:tcMar>
+              <w:top w:w="40" w:type="dxa"/>
+              <w:bottom w:w="60" w:type="dxa"/>
+              <w:left w:w="40" w:type="dxa"/>
+              <w:right w:w="40" w:type="dxa"/>
+            </w:tcMar>
+          </w:tcPr>
+          <w:p>
+            <w:pPr>
+              <w:spacing w:after="20"/>
+            </w:pPr>
+            <w:r>
+              <w:rPr>
+                <w:rFonts w:ascii="Arial" w:hAnsi="Arial"/>
+                <w:b/>
+                <w:color w:val="0E7C7B"/>
+                <w:sz w:val="16"/>
+              </w:rPr>
+              <w:t>FECHA</w:t>
+            </w:r>
+          </w:p>
+          <w:p>
+            <w:pPr>
+              <w:spacing w:after="0"/>
+            </w:pPr>
+            <w:r>
+              <w:rPr>
+                <w:rFonts w:ascii="Arial" w:hAnsi="Arial"/>
+                <w:color w:val="2B2F3A"/>
+                <w:sz w:val="19"/>
+              </w:rPr>
+              <w:t>07/10/2026</w:t>
+            </w:r>
+          </w:p>
+        </w:tc>
+      </w:tr>
+    </w:tbl>
     <w:p>
       <w:pPr>
-        <w:jc w:val="right"/>
+        <w:spacing w:after="80"/>
       </w:pPr>
-      <w:r>
-        <w:rPr>
-          <w:rFonts w:ascii="Arial" w:hAnsi="Arial"/>
-          <w:color w:val="787878"/>
-          <w:sz w:val="18"/>
-        </w:rPr>
-        <w:t>CURSO DE ESPECIALIZACIÓN EN IA Y BIG DATA</w:t>
-        <w:br/>
-        <w:t>CENTRO FORMACIÓN SOMORROSTRO — RETO 0 (SBD)</w:t>
-      </w:r>
-    </w:p>
-    <w:p>
-      <w:r>
-        <w:br/>
-        <w:br/>
-        <w:br/>
-      </w:r>
     </w:p>
     <w:p>
       <w:pPr>
-        <w:jc w:val="center"/>
+        <w:spacing w:after="40"/>
       </w:pPr>
       <w:r>
         <w:rPr>
           <w:rFonts w:ascii="Arial" w:hAnsi="Arial"/>
           <w:b/>
-          <w:color w:val="0F2043"/>
-          <w:sz w:val="44"/>
+          <w:color w:val="0E7C7B"/>
+          <w:sz w:val="20"/>
         </w:rPr>
-        <w:t>INFORME EJECUTIVO PARA EL CLIENTE</w:t>
+        <w:t>SISTEMAS DE BIG DATA · RETO 0 «HERE WE GO»</w:t>
       </w:r>
     </w:p>
     <w:p>
       <w:pPr>
-        <w:jc w:val="center"/>
+        <w:spacing w:after="40"/>
       </w:pPr>
       <w:r>
         <w:rPr>
           <w:rFonts w:ascii="Arial" w:hAnsi="Arial"/>
-          <w:color w:val="324B6E"/>
-          <w:sz w:val="28"/>
+          <w:b/>
+          <w:color w:val="1F2A44"/>
+          <w:sz w:val="40"/>
         </w:rPr>
-        <w:t>Evaluación de Impacto de la Zona de Bajas Emisiones (ZBE)</w:t>
-        <w:br/>
-        <w:t>en la Calidad del Aire de Bilbao (2022–2026)</w:t>
+        <w:t>¿Ha funcionado la Zona de Bajas Emisiones de Bilbao?</w:t>
+      </w:r>
+    </w:p>
+    <w:p>
+      <w:pPr>
+        <w:spacing w:after="160"/>
+      </w:pPr>
+      <w:r>
+        <w:rPr>
+          <w:rFonts w:ascii="Arial" w:hAnsi="Arial"/>
+          <w:color w:val="44546A"/>
+          <w:sz w:val="24"/>
+        </w:rPr>
+        <w:t>Evaluación multivariable de impacto sobre la calidad del aire y movilidad urbana (2022–2026)</w:t>
+      </w:r>
+    </w:p>
+    <w:p>
+      <w:pPr>
+        <w:spacing w:after="40"/>
+      </w:pPr>
+      <w:r>
+        <w:rPr>
+          <w:rFonts w:ascii="Arial" w:hAnsi="Arial"/>
+          <w:b/>
+          <w:color w:val="1F2A44"/>
+          <w:sz w:val="24"/>
+        </w:rPr>
+        <w:t>Objetivo del documento</w:t>
       </w:r>
     </w:p>
     <w:p>
       <w:r>
-        <w:br/>
-        <w:br/>
-        <w:br/>
-        <w:br/>
+        <w:t>Se presenta el informe de consultoría ejecutiva para el Ayuntamiento de Bilbao elaborado por Haizen Lab en el módulo de Sistemas de Big Data (SBD). El documento evalúa el impacto empírico de la Zona de Bajas Emisiones (ZBE) en el distrito de Abando sobre las concentraciones horarias de NO2, aislando el efecto de la ordenanza respecto a la meteorología y las tendencias del tráfico mediante un diseño cuasiexperimental de Diferencias en Diferencias (Diff-in-Diff) y contraste con aforos vehiculares.</w:t>
       </w:r>
     </w:p>
     <w:tbl>
@@ -66,38 +247,331 @@
         <w:tblW w:type="auto" w:w="0"/>
         <w:jc w:val="center"/>
         <w:tblLook w:firstColumn="1" w:firstRow="1" w:lastColumn="0" w:lastRow="0" w:noHBand="0" w:noVBand="1" w:val="04A0"/>
+        <w:tblBorders>
+          <w:top w:val="none" w:sz="0" w:space="0" w:color="FFFFFF"/>
+          <w:left w:val="none" w:sz="0" w:space="0" w:color="FFFFFF"/>
+          <w:bottom w:val="none" w:sz="0" w:space="0" w:color="FFFFFF"/>
+          <w:right w:val="none" w:sz="0" w:space="0" w:color="FFFFFF"/>
+          <w:insideH w:val="none" w:sz="0" w:space="0" w:color="FFFFFF"/>
+          <w:insideV w:val="none" w:sz="0" w:space="0" w:color="FFFFFF"/>
+        </w:tblBorders>
       </w:tblPr>
       <w:tblGrid>
-        <w:gridCol w:w="5040"/>
-        <w:gridCol w:w="5040"/>
+        <w:gridCol w:w="5020"/>
+        <w:gridCol w:w="5020"/>
       </w:tblGrid>
       <w:tr>
         <w:tc>
           <w:tcPr>
-            <w:tcW w:type="dxa" w:w="3168"/>
+            <w:tcW w:type="dxa" w:w="776"/>
+            <w:shd w:fill="0E7C7B"/>
+            <w:tcMar>
+              <w:top w:w="70" w:type="dxa"/>
+              <w:bottom w:w="70" w:type="dxa"/>
+              <w:left w:w="40" w:type="dxa"/>
+              <w:right w:w="40" w:type="dxa"/>
+            </w:tcMar>
+          </w:tcPr>
+          <w:p>
+            <w:pPr>
+              <w:jc w:val="center"/>
+            </w:pPr>
+            <w:r>
+              <w:rPr>
+                <w:rFonts w:ascii="Arial" w:hAnsi="Arial"/>
+                <w:b/>
+                <w:color w:val="FFFFFF"/>
+                <w:sz w:val="26"/>
+              </w:rPr>
+              <w:t>1</w:t>
+            </w:r>
+          </w:p>
+        </w:tc>
+        <w:tc>
+          <w:tcPr>
+            <w:tcW w:type="dxa" w:w="8930"/>
+            <w:shd w:fill="F2F5F7"/>
+            <w:tcMar>
+              <w:top w:w="70" w:type="dxa"/>
+              <w:bottom w:w="70" w:type="dxa"/>
+              <w:left w:w="120" w:type="dxa"/>
+              <w:right w:w="100" w:type="dxa"/>
+            </w:tcMar>
           </w:tcPr>
           <w:p>
             <w:r>
               <w:rPr>
                 <w:rFonts w:ascii="Arial" w:hAnsi="Arial"/>
                 <w:b/>
-                <w:sz w:val="20"/>
+                <w:color w:val="1F2A44"/>
+                <w:sz w:val="26"/>
               </w:rPr>
-              <w:t>Cliente destinatario:</w:t>
+              <w:t>Problema del cliente y preguntas de negocio</w:t>
+            </w:r>
+          </w:p>
+        </w:tc>
+      </w:tr>
+    </w:tbl>
+    <w:p>
+      <w:pPr>
+        <w:spacing w:before="0" w:after="80"/>
+      </w:pPr>
+    </w:p>
+    <w:p>
+      <w:r>
+        <w:t>El Ayuntamiento de Bilbao implantó la ZBE en el distrito de Abando (~2 km², regulado por 27 cámaras ANPR) para reducir los contaminantes derivados del tráfico fósil. El horario de restricción abarca de lunes a viernes laborables de 7:00 a 20:00 h, desplegado en dos etapas progresivas:</w:t>
+      </w:r>
+    </w:p>
+    <w:tbl>
+      <w:tblPr>
+        <w:tblW w:type="auto" w:w="0"/>
+        <w:jc w:val="center"/>
+        <w:tblLook w:firstColumn="1" w:firstRow="1" w:lastColumn="0" w:lastRow="0" w:noHBand="0" w:noVBand="1" w:val="04A0"/>
+        <w:tblBorders>
+          <w:top w:val="none" w:sz="0" w:space="0" w:color="FFFFFF"/>
+          <w:left w:val="none" w:sz="0" w:space="0" w:color="FFFFFF"/>
+          <w:bottom w:val="none" w:sz="0" w:space="0" w:color="FFFFFF"/>
+          <w:right w:val="none" w:sz="0" w:space="0" w:color="FFFFFF"/>
+          <w:insideH w:val="none" w:sz="0" w:space="0" w:color="FFFFFF"/>
+          <w:insideV w:val="none" w:sz="0" w:space="0" w:color="FFFFFF"/>
+        </w:tblBorders>
+      </w:tblPr>
+      <w:tblGrid>
+        <w:gridCol w:w="5020"/>
+        <w:gridCol w:w="5020"/>
+      </w:tblGrid>
+      <w:tr>
+        <w:tc>
+          <w:tcPr>
+            <w:tcW w:type="dxa" w:w="4852"/>
+            <w:shd w:fill="F2F5F7"/>
+            <w:tcMar>
+              <w:top w:w="70" w:type="dxa"/>
+              <w:bottom w:w="70" w:type="dxa"/>
+              <w:left w:w="100" w:type="dxa"/>
+              <w:right w:w="100" w:type="dxa"/>
+            </w:tcMar>
+          </w:tcPr>
+          <w:p>
+            <w:pPr>
+              <w:spacing w:after="40"/>
+            </w:pPr>
+            <w:r>
+              <w:rPr>
+                <w:rFonts w:ascii="Arial" w:hAnsi="Arial"/>
+                <w:b/>
+                <w:color w:val="0E7C7B"/>
+                <w:sz w:val="16"/>
+              </w:rPr>
+              <w:t>FASE 1 · DESDE EL 15/06/2024</w:t>
+            </w:r>
+          </w:p>
+          <w:p>
+            <w:pPr>
+              <w:spacing w:after="0"/>
+            </w:pPr>
+            <w:r>
+              <w:rPr>
+                <w:rFonts w:ascii="Arial" w:hAnsi="Arial"/>
+                <w:color w:val="2B2F3A"/>
+                <w:sz w:val="19"/>
+              </w:rPr>
+              <w:t>Vehículos sin etiqueta ambiental (A / sin distintivo DGT).</w:t>
             </w:r>
           </w:p>
         </w:tc>
         <w:tc>
           <w:tcPr>
-            <w:tcW w:type="dxa" w:w="6480"/>
+            <w:tcW w:type="dxa" w:w="4852"/>
+            <w:shd w:fill="F2F5F7"/>
+            <w:tcMar>
+              <w:top w:w="70" w:type="dxa"/>
+              <w:bottom w:w="70" w:type="dxa"/>
+              <w:left w:w="100" w:type="dxa"/>
+              <w:right w:w="100" w:type="dxa"/>
+            </w:tcMar>
+          </w:tcPr>
+          <w:p>
+            <w:pPr>
+              <w:spacing w:after="40"/>
+            </w:pPr>
+            <w:r>
+              <w:rPr>
+                <w:rFonts w:ascii="Arial" w:hAnsi="Arial"/>
+                <w:b/>
+                <w:color w:val="0E7C7B"/>
+                <w:sz w:val="16"/>
+              </w:rPr>
+              <w:t>FASE 2 · DESDE EL 16/06/2025</w:t>
+            </w:r>
+          </w:p>
+          <w:p>
+            <w:pPr>
+              <w:spacing w:after="0"/>
+            </w:pPr>
+            <w:r>
+              <w:rPr>
+                <w:rFonts w:ascii="Arial" w:hAnsi="Arial"/>
+                <w:color w:val="2B2F3A"/>
+                <w:sz w:val="19"/>
+              </w:rPr>
+              <w:t>Restricción a distintivo B para no residentes del centro.</w:t>
+            </w:r>
+          </w:p>
+        </w:tc>
+      </w:tr>
+    </w:tbl>
+    <w:p>
+      <w:pPr>
+        <w:spacing w:after="40"/>
+      </w:pPr>
+    </w:p>
+    <w:p>
+      <w:r>
+        <w:t>Una comparación simple de promedios antes y después incurre en sesgos críticos: el NO2 depende de la inversión térmica invernal, la lluvia y el régimen de vientos. Lo que el cliente necesita conocer es la reducción neta atribuible, controlando por la evolución de estaciones comparables fuera del perímetro:</w:t>
+      </w:r>
+    </w:p>
+    <w:tbl>
+      <w:tblPr>
+        <w:tblW w:type="auto" w:w="0"/>
+        <w:jc w:val="center"/>
+        <w:tblLook w:firstColumn="1" w:firstRow="1" w:lastColumn="0" w:lastRow="0" w:noHBand="0" w:noVBand="1" w:val="04A0"/>
+        <w:tblBorders>
+          <w:top w:val="none" w:sz="0" w:space="0" w:color="FFFFFF"/>
+          <w:left w:val="none" w:sz="0" w:space="0" w:color="FFFFFF"/>
+          <w:bottom w:val="none" w:sz="0" w:space="0" w:color="FFFFFF"/>
+          <w:right w:val="none" w:sz="0" w:space="0" w:color="FFFFFF"/>
+          <w:insideH w:val="none" w:sz="0" w:space="0" w:color="FFFFFF"/>
+          <w:insideV w:val="none" w:sz="0" w:space="0" w:color="FFFFFF"/>
+        </w:tblBorders>
+      </w:tblPr>
+      <w:tblGrid>
+        <w:gridCol w:w="10040"/>
+      </w:tblGrid>
+      <w:tr>
+        <w:tc>
+          <w:tcPr>
+            <w:tcW w:type="dxa" w:w="9706"/>
+            <w:shd w:fill="1E1E2E"/>
+            <w:tcMar>
+              <w:top w:w="80" w:type="dxa"/>
+              <w:bottom w:w="80" w:type="dxa"/>
+              <w:left w:w="120" w:type="dxa"/>
+              <w:right w:w="120" w:type="dxa"/>
+            </w:tcMar>
+          </w:tcPr>
+          <w:p>
+            <w:pPr>
+              <w:jc w:val="center"/>
+            </w:pPr>
+            <w:r>
+              <w:rPr>
+                <w:rFonts w:ascii="Consolas" w:hAnsi="Consolas"/>
+                <w:color w:val="FFFFFF"/>
+                <w:sz w:val="20"/>
+              </w:rPr>
+              <w:t>efecto neto ZBE = [NO2_post(dentro) − NO2_pre(dentro)] − [NO2_post(fuera) − NO2_pre(fuera)]</w:t>
+            </w:r>
+          </w:p>
+        </w:tc>
+      </w:tr>
+    </w:tbl>
+    <w:p>
+      <w:pPr>
+        <w:spacing w:after="40"/>
+      </w:pPr>
+    </w:p>
+    <w:p>
+      <w:r>
+        <w:t>Para sustentar la toma de decisiones, se fijaron cinco preguntas de negocio priorizadas:</w:t>
+      </w:r>
+    </w:p>
+    <w:tbl>
+      <w:tblPr>
+        <w:tblW w:type="auto" w:w="0"/>
+        <w:jc w:val="center"/>
+        <w:tblLook w:firstColumn="1" w:firstRow="1" w:lastColumn="0" w:lastRow="0" w:noHBand="0" w:noVBand="1" w:val="04A0"/>
+        <w:tblBorders>
+          <w:top w:val="single" w:sz="4" w:space="0" w:color="D3D3D3"/>
+          <w:left w:val="single" w:sz="4" w:space="0" w:color="D3D3D3"/>
+          <w:bottom w:val="single" w:sz="4" w:space="0" w:color="D3D3D3"/>
+          <w:right w:val="single" w:sz="4" w:space="0" w:color="D3D3D3"/>
+          <w:insideH w:val="single" w:sz="4" w:space="0" w:color="D3D3D3"/>
+          <w:insideV w:val="single" w:sz="4" w:space="0" w:color="D3D3D3"/>
+        </w:tblBorders>
+      </w:tblPr>
+      <w:tblGrid>
+        <w:gridCol w:w="3347"/>
+        <w:gridCol w:w="3347"/>
+        <w:gridCol w:w="3347"/>
+      </w:tblGrid>
+      <w:tr>
+        <w:tc>
+          <w:tcPr>
+            <w:tcW w:type="dxa" w:w="3347"/>
+            <w:shd w:fill="0E7C7B"/>
+            <w:tcMar>
+              <w:top w:w="60" w:type="dxa"/>
+              <w:bottom w:w="60" w:type="dxa"/>
+              <w:left w:w="80" w:type="dxa"/>
+              <w:right w:w="80" w:type="dxa"/>
+            </w:tcMar>
           </w:tcPr>
           <w:p>
             <w:r>
               <w:rPr>
                 <w:rFonts w:ascii="Arial" w:hAnsi="Arial"/>
-                <w:sz w:val="20"/>
+                <w:b/>
+                <w:color w:val="FFFFFF"/>
+                <w:sz w:val="18"/>
               </w:rPr>
-              <w:t>Ayuntamiento de Bilbao — Área de Movilidad y Medio Ambiente</w:t>
+              <w:t>Pregunta</w:t>
+            </w:r>
+          </w:p>
+        </w:tc>
+        <w:tc>
+          <w:tcPr>
+            <w:tcW w:type="dxa" w:w="3347"/>
+            <w:shd w:fill="0E7C7B"/>
+            <w:tcMar>
+              <w:top w:w="60" w:type="dxa"/>
+              <w:bottom w:w="60" w:type="dxa"/>
+              <w:left w:w="80" w:type="dxa"/>
+              <w:right w:w="80" w:type="dxa"/>
+            </w:tcMar>
+          </w:tcPr>
+          <w:p>
+            <w:r>
+              <w:rPr>
+                <w:rFonts w:ascii="Arial" w:hAnsi="Arial"/>
+                <w:b/>
+                <w:color w:val="FFFFFF"/>
+                <w:sz w:val="18"/>
+              </w:rPr>
+              <w:t>Objetivo de negocio</w:t>
+            </w:r>
+          </w:p>
+        </w:tc>
+        <w:tc>
+          <w:tcPr>
+            <w:tcW w:type="dxa" w:w="3347"/>
+            <w:shd w:fill="0E7C7B"/>
+            <w:tcMar>
+              <w:top w:w="60" w:type="dxa"/>
+              <w:bottom w:w="60" w:type="dxa"/>
+              <w:left w:w="80" w:type="dxa"/>
+              <w:right w:w="80" w:type="dxa"/>
+            </w:tcMar>
+          </w:tcPr>
+          <w:p>
+            <w:r>
+              <w:rPr>
+                <w:rFonts w:ascii="Arial" w:hAnsi="Arial"/>
+                <w:b/>
+                <w:color w:val="FFFFFF"/>
+                <w:sz w:val="18"/>
+              </w:rPr>
+              <w:t>Metodología analítica</w:t>
             </w:r>
           </w:p>
         </w:tc>
@@ -105,30 +579,65 @@
       <w:tr>
         <w:tc>
           <w:tcPr>
-            <w:tcW w:type="dxa" w:w="3168"/>
+            <w:tcW w:type="dxa" w:w="3347"/>
+            <w:shd w:fill="F2F5F7"/>
+            <w:tcMar>
+              <w:top w:w="50" w:type="dxa"/>
+              <w:bottom w:w="50" w:type="dxa"/>
+              <w:left w:w="80" w:type="dxa"/>
+              <w:right w:w="80" w:type="dxa"/>
+            </w:tcMar>
           </w:tcPr>
           <w:p>
             <w:r>
               <w:rPr>
                 <w:rFonts w:ascii="Arial" w:hAnsi="Arial"/>
                 <w:b/>
-                <w:sz w:val="20"/>
+                <w:sz w:val="18"/>
               </w:rPr>
-              <w:t>Equipo consultor:</w:t>
+              <w:t>P1 (Máxima)</w:t>
             </w:r>
           </w:p>
         </w:tc>
         <w:tc>
           <w:tcPr>
-            <w:tcW w:type="dxa" w:w="6480"/>
+            <w:tcW w:type="dxa" w:w="3347"/>
+            <w:shd w:fill="F2F5F7"/>
+            <w:tcMar>
+              <w:top w:w="50" w:type="dxa"/>
+              <w:bottom w:w="50" w:type="dxa"/>
+              <w:left w:w="80" w:type="dxa"/>
+              <w:right w:w="80" w:type="dxa"/>
+            </w:tcMar>
           </w:tcPr>
           <w:p>
             <w:r>
               <w:rPr>
                 <w:rFonts w:ascii="Arial" w:hAnsi="Arial"/>
-                <w:sz w:val="20"/>
+                <w:sz w:val="18"/>
               </w:rPr>
-              <w:t>HaizeLab Data Analytics (Alfred Gabriel, Íñigo, Kerman)</w:t>
+              <w:t>¿Ha bajado el NO2 dentro de la ZBE más que fuera tras el 15/06/2024?</w:t>
+            </w:r>
+          </w:p>
+        </w:tc>
+        <w:tc>
+          <w:tcPr>
+            <w:tcW w:type="dxa" w:w="3347"/>
+            <w:shd w:fill="F2F5F7"/>
+            <w:tcMar>
+              <w:top w:w="50" w:type="dxa"/>
+              <w:bottom w:w="50" w:type="dxa"/>
+              <w:left w:w="80" w:type="dxa"/>
+              <w:right w:w="80" w:type="dxa"/>
+            </w:tcMar>
+          </w:tcPr>
+          <w:p>
+            <w:r>
+              <w:rPr>
+                <w:rFonts w:ascii="Arial" w:hAnsi="Arial"/>
+                <w:sz w:val="18"/>
+              </w:rPr>
+              <w:t>Modelo cuasiexperimental Diff-in-Diff frente a estaciones exteriores.</w:t>
             </w:r>
           </w:p>
         </w:tc>
@@ -136,30 +645,65 @@
       <w:tr>
         <w:tc>
           <w:tcPr>
-            <w:tcW w:type="dxa" w:w="3168"/>
+            <w:tcW w:type="dxa" w:w="3347"/>
+            <w:shd w:fill="FFFFFF"/>
+            <w:tcMar>
+              <w:top w:w="50" w:type="dxa"/>
+              <w:bottom w:w="50" w:type="dxa"/>
+              <w:left w:w="80" w:type="dxa"/>
+              <w:right w:w="80" w:type="dxa"/>
+            </w:tcMar>
           </w:tcPr>
           <w:p>
             <w:r>
               <w:rPr>
                 <w:rFonts w:ascii="Arial" w:hAnsi="Arial"/>
                 <w:b/>
-                <w:sz w:val="20"/>
+                <w:sz w:val="18"/>
               </w:rPr>
-              <w:t>Módulo formativo:</w:t>
+              <w:t>P2 (Alta)</w:t>
             </w:r>
           </w:p>
         </w:tc>
         <w:tc>
           <w:tcPr>
-            <w:tcW w:type="dxa" w:w="6480"/>
+            <w:tcW w:type="dxa" w:w="3347"/>
+            <w:shd w:fill="FFFFFF"/>
+            <w:tcMar>
+              <w:top w:w="50" w:type="dxa"/>
+              <w:bottom w:w="50" w:type="dxa"/>
+              <w:left w:w="80" w:type="dxa"/>
+              <w:right w:w="80" w:type="dxa"/>
+            </w:tcMar>
           </w:tcPr>
           <w:p>
             <w:r>
               <w:rPr>
                 <w:rFonts w:ascii="Arial" w:hAnsi="Arial"/>
-                <w:sz w:val="20"/>
+                <w:sz w:val="18"/>
               </w:rPr>
-              <w:t>Sistemas de Big Data (SBD) — Reto 0: 'HERE WE GO'</w:t>
+              <w:t>¿El efecto se concentra en el horario regulado (L-V 7:00-20:00)?</w:t>
+            </w:r>
+          </w:p>
+        </w:tc>
+        <w:tc>
+          <w:tcPr>
+            <w:tcW w:type="dxa" w:w="3347"/>
+            <w:shd w:fill="FFFFFF"/>
+            <w:tcMar>
+              <w:top w:w="50" w:type="dxa"/>
+              <w:bottom w:w="50" w:type="dxa"/>
+              <w:left w:w="80" w:type="dxa"/>
+              <w:right w:w="80" w:type="dxa"/>
+            </w:tcMar>
+          </w:tcPr>
+          <w:p>
+            <w:r>
+              <w:rPr>
+                <w:rFonts w:ascii="Arial" w:hAnsi="Arial"/>
+                <w:sz w:val="18"/>
+              </w:rPr>
+              <w:t>Estratificación horaria activa frente a noche y fines de semana.</w:t>
             </w:r>
           </w:p>
         </w:tc>
@@ -167,49 +711,285 @@
       <w:tr>
         <w:tc>
           <w:tcPr>
-            <w:tcW w:type="dxa" w:w="3168"/>
+            <w:tcW w:type="dxa" w:w="3347"/>
+            <w:shd w:fill="F2F5F7"/>
+            <w:tcMar>
+              <w:top w:w="50" w:type="dxa"/>
+              <w:bottom w:w="50" w:type="dxa"/>
+              <w:left w:w="80" w:type="dxa"/>
+              <w:right w:w="80" w:type="dxa"/>
+            </w:tcMar>
           </w:tcPr>
           <w:p>
             <w:r>
               <w:rPr>
                 <w:rFonts w:ascii="Arial" w:hAnsi="Arial"/>
                 <w:b/>
-                <w:sz w:val="20"/>
+                <w:sz w:val="18"/>
               </w:rPr>
-              <w:t>Fecha de entrega:</w:t>
+              <w:t>P3 (Alta)</w:t>
             </w:r>
           </w:p>
         </w:tc>
         <w:tc>
           <w:tcPr>
-            <w:tcW w:type="dxa" w:w="6480"/>
+            <w:tcW w:type="dxa" w:w="3347"/>
+            <w:shd w:fill="F2F5F7"/>
+            <w:tcMar>
+              <w:top w:w="50" w:type="dxa"/>
+              <w:bottom w:w="50" w:type="dxa"/>
+              <w:left w:w="80" w:type="dxa"/>
+              <w:right w:w="80" w:type="dxa"/>
+            </w:tcMar>
           </w:tcPr>
           <w:p>
             <w:r>
               <w:rPr>
                 <w:rFonts w:ascii="Arial" w:hAnsi="Arial"/>
-                <w:sz w:val="20"/>
+                <w:sz w:val="18"/>
               </w:rPr>
-              <w:t>Octubre de 2026</w:t>
+              <w:t>¿Se sostiene la reducción en calma atmosférica (&lt; 2 m/s)?</w:t>
+            </w:r>
+          </w:p>
+        </w:tc>
+        <w:tc>
+          <w:tcPr>
+            <w:tcW w:type="dxa" w:w="3347"/>
+            <w:shd w:fill="F2F5F7"/>
+            <w:tcMar>
+              <w:top w:w="50" w:type="dxa"/>
+              <w:bottom w:w="50" w:type="dxa"/>
+              <w:left w:w="80" w:type="dxa"/>
+              <w:right w:w="80" w:type="dxa"/>
+            </w:tcMar>
+          </w:tcPr>
+          <w:p>
+            <w:r>
+              <w:rPr>
+                <w:rFonts w:ascii="Arial" w:hAnsi="Arial"/>
+                <w:sz w:val="18"/>
+              </w:rPr>
+              <w:t>Control estratificado por régimen de viento en Monte Banderas.</w:t>
+            </w:r>
+          </w:p>
+        </w:tc>
+      </w:tr>
+      <w:tr>
+        <w:tc>
+          <w:tcPr>
+            <w:tcW w:type="dxa" w:w="3347"/>
+            <w:shd w:fill="FFFFFF"/>
+            <w:tcMar>
+              <w:top w:w="50" w:type="dxa"/>
+              <w:bottom w:w="50" w:type="dxa"/>
+              <w:left w:w="80" w:type="dxa"/>
+              <w:right w:w="80" w:type="dxa"/>
+            </w:tcMar>
+          </w:tcPr>
+          <w:p>
+            <w:r>
+              <w:rPr>
+                <w:rFonts w:ascii="Arial" w:hAnsi="Arial"/>
+                <w:b/>
+                <w:sz w:val="18"/>
+              </w:rPr>
+              <w:t>P4 (Media)</w:t>
+            </w:r>
+          </w:p>
+        </w:tc>
+        <w:tc>
+          <w:tcPr>
+            <w:tcW w:type="dxa" w:w="3347"/>
+            <w:shd w:fill="FFFFFF"/>
+            <w:tcMar>
+              <w:top w:w="50" w:type="dxa"/>
+              <w:bottom w:w="50" w:type="dxa"/>
+              <w:left w:w="80" w:type="dxa"/>
+              <w:right w:w="80" w:type="dxa"/>
+            </w:tcMar>
+          </w:tcPr>
+          <w:p>
+            <w:r>
+              <w:rPr>
+                <w:rFonts w:ascii="Arial" w:hAnsi="Arial"/>
+                <w:sz w:val="18"/>
+              </w:rPr>
+              <w:t>¿Existe correlación causal con el tráfico en los accesos?</w:t>
+            </w:r>
+          </w:p>
+        </w:tc>
+        <w:tc>
+          <w:tcPr>
+            <w:tcW w:type="dxa" w:w="3347"/>
+            <w:shd w:fill="FFFFFF"/>
+            <w:tcMar>
+              <w:top w:w="50" w:type="dxa"/>
+              <w:bottom w:w="50" w:type="dxa"/>
+              <w:left w:w="80" w:type="dxa"/>
+              <w:right w:w="80" w:type="dxa"/>
+            </w:tcMar>
+          </w:tcPr>
+          <w:p>
+            <w:r>
+              <w:rPr>
+                <w:rFonts w:ascii="Arial" w:hAnsi="Arial"/>
+                <w:sz w:val="18"/>
+              </w:rPr>
+              <w:t>Contraste de aforos de San Mamés y red de circunvalación.</w:t>
+            </w:r>
+          </w:p>
+        </w:tc>
+      </w:tr>
+      <w:tr>
+        <w:tc>
+          <w:tcPr>
+            <w:tcW w:type="dxa" w:w="3347"/>
+            <w:shd w:fill="F2F5F7"/>
+            <w:tcMar>
+              <w:top w:w="50" w:type="dxa"/>
+              <w:bottom w:w="50" w:type="dxa"/>
+              <w:left w:w="80" w:type="dxa"/>
+              <w:right w:w="80" w:type="dxa"/>
+            </w:tcMar>
+          </w:tcPr>
+          <w:p>
+            <w:r>
+              <w:rPr>
+                <w:rFonts w:ascii="Arial" w:hAnsi="Arial"/>
+                <w:b/>
+                <w:sz w:val="18"/>
+              </w:rPr>
+              <w:t>P5 (Media)</w:t>
+            </w:r>
+          </w:p>
+        </w:tc>
+        <w:tc>
+          <w:tcPr>
+            <w:tcW w:type="dxa" w:w="3347"/>
+            <w:shd w:fill="F2F5F7"/>
+            <w:tcMar>
+              <w:top w:w="50" w:type="dxa"/>
+              <w:bottom w:w="50" w:type="dxa"/>
+              <w:left w:w="80" w:type="dxa"/>
+              <w:right w:w="80" w:type="dxa"/>
+            </w:tcMar>
+          </w:tcPr>
+          <w:p>
+            <w:r>
+              <w:rPr>
+                <w:rFonts w:ascii="Arial" w:hAnsi="Arial"/>
+                <w:sz w:val="18"/>
+              </w:rPr>
+              <w:t>¿Aportó la Fase 2 una reducción marginal respecto a la Fase 1?</w:t>
+            </w:r>
+          </w:p>
+        </w:tc>
+        <w:tc>
+          <w:tcPr>
+            <w:tcW w:type="dxa" w:w="3347"/>
+            <w:shd w:fill="F2F5F7"/>
+            <w:tcMar>
+              <w:top w:w="50" w:type="dxa"/>
+              <w:bottom w:w="50" w:type="dxa"/>
+              <w:left w:w="80" w:type="dxa"/>
+              <w:right w:w="80" w:type="dxa"/>
+            </w:tcMar>
+          </w:tcPr>
+          <w:p>
+            <w:r>
+              <w:rPr>
+                <w:rFonts w:ascii="Arial" w:hAnsi="Arial"/>
+                <w:sz w:val="18"/>
+              </w:rPr>
+              <w:t>Contraste de medias entre etapas regulatorias independientes.</w:t>
             </w:r>
           </w:p>
         </w:tc>
       </w:tr>
     </w:tbl>
     <w:p>
-      <w:r>
-        <w:br w:type="page"/>
-      </w:r>
+      <w:pPr>
+        <w:spacing w:after="80"/>
+      </w:pPr>
+    </w:p>
+    <w:tbl>
+      <w:tblPr>
+        <w:tblW w:type="auto" w:w="0"/>
+        <w:jc w:val="center"/>
+        <w:tblLook w:firstColumn="1" w:firstRow="1" w:lastColumn="0" w:lastRow="0" w:noHBand="0" w:noVBand="1" w:val="04A0"/>
+        <w:tblBorders>
+          <w:top w:val="none" w:sz="0" w:space="0" w:color="FFFFFF"/>
+          <w:left w:val="none" w:sz="0" w:space="0" w:color="FFFFFF"/>
+          <w:bottom w:val="none" w:sz="0" w:space="0" w:color="FFFFFF"/>
+          <w:right w:val="none" w:sz="0" w:space="0" w:color="FFFFFF"/>
+          <w:insideH w:val="none" w:sz="0" w:space="0" w:color="FFFFFF"/>
+          <w:insideV w:val="none" w:sz="0" w:space="0" w:color="FFFFFF"/>
+        </w:tblBorders>
+      </w:tblPr>
+      <w:tblGrid>
+        <w:gridCol w:w="5020"/>
+        <w:gridCol w:w="5020"/>
+      </w:tblGrid>
+      <w:tr>
+        <w:tc>
+          <w:tcPr>
+            <w:tcW w:type="dxa" w:w="776"/>
+            <w:shd w:fill="0E7C7B"/>
+            <w:tcMar>
+              <w:top w:w="70" w:type="dxa"/>
+              <w:bottom w:w="70" w:type="dxa"/>
+              <w:left w:w="40" w:type="dxa"/>
+              <w:right w:w="40" w:type="dxa"/>
+            </w:tcMar>
+          </w:tcPr>
+          <w:p>
+            <w:pPr>
+              <w:jc w:val="center"/>
+            </w:pPr>
+            <w:r>
+              <w:rPr>
+                <w:rFonts w:ascii="Arial" w:hAnsi="Arial"/>
+                <w:b/>
+                <w:color w:val="FFFFFF"/>
+                <w:sz w:val="26"/>
+              </w:rPr>
+              <w:t>2</w:t>
+            </w:r>
+          </w:p>
+        </w:tc>
+        <w:tc>
+          <w:tcPr>
+            <w:tcW w:type="dxa" w:w="8930"/>
+            <w:shd w:fill="F2F5F7"/>
+            <w:tcMar>
+              <w:top w:w="70" w:type="dxa"/>
+              <w:bottom w:w="70" w:type="dxa"/>
+              <w:left w:w="120" w:type="dxa"/>
+              <w:right w:w="100" w:type="dxa"/>
+            </w:tcMar>
+          </w:tcPr>
+          <w:p>
+            <w:r>
+              <w:rPr>
+                <w:rFonts w:ascii="Arial" w:hAnsi="Arial"/>
+                <w:b/>
+                <w:color w:val="1F2A44"/>
+                <w:sz w:val="26"/>
+              </w:rPr>
+              <w:t>Fuentes de datos y auditoría de calidad</w:t>
+            </w:r>
+          </w:p>
+        </w:tc>
+      </w:tr>
+    </w:tbl>
+    <w:p>
+      <w:pPr>
+        <w:spacing w:before="0" w:after="80"/>
+      </w:pPr>
     </w:p>
     <w:p>
       <w:r>
-        <w:rPr>
-          <w:rFonts w:ascii="Arial" w:hAnsi="Arial"/>
-          <w:b/>
-          <w:color w:val="0F2043"/>
-          <w:sz w:val="32"/>
-        </w:rPr>
-        <w:t>Índice General de Contenidos</w:t>
+        <w:t>Se adquirieron y unificaron cuatro fuentes oficiales: (1) Calidad del Aire (Gobierno Vasco), con mediciones horarias en Mazarredo y Mª Díaz de Haro (dentro), Europa, Barakaldo, Basauri, Erandio y Castrejana (control exterior) y Arraiz (fondo regional); (2) Meteorología horaria (Open-Meteo), con temperatura, humedad, viento y precipitación; (3) Calendario ZBE con festivos oficiales; y (4) Aforos de tráfico de accesos (DFB) y tramos urbanos en tiempo real (Bilbao Open Data).</w:t>
       </w:r>
     </w:p>
     <w:tbl>
@@ -217,41 +997,63 @@
         <w:tblW w:type="auto" w:w="0"/>
         <w:jc w:val="center"/>
         <w:tblLook w:firstColumn="1" w:firstRow="1" w:lastColumn="0" w:lastRow="0" w:noHBand="0" w:noVBand="1" w:val="04A0"/>
+        <w:tblBorders>
+          <w:top w:val="single" w:sz="4" w:space="0" w:color="D3D3D3"/>
+          <w:left w:val="single" w:sz="4" w:space="0" w:color="D3D3D3"/>
+          <w:bottom w:val="single" w:sz="4" w:space="0" w:color="D3D3D3"/>
+          <w:right w:val="single" w:sz="4" w:space="0" w:color="D3D3D3"/>
+          <w:insideH w:val="single" w:sz="4" w:space="0" w:color="D3D3D3"/>
+          <w:insideV w:val="single" w:sz="4" w:space="0" w:color="D3D3D3"/>
+        </w:tblBorders>
       </w:tblPr>
       <w:tblGrid>
-        <w:gridCol w:w="5040"/>
-        <w:gridCol w:w="5040"/>
+        <w:gridCol w:w="5020"/>
+        <w:gridCol w:w="5020"/>
       </w:tblGrid>
       <w:tr>
         <w:tc>
           <w:tcPr>
-            <w:tcW w:type="dxa" w:w="7488"/>
+            <w:tcW w:type="dxa" w:w="5020"/>
+            <w:shd w:fill="0E7C7B"/>
+            <w:tcMar>
+              <w:top w:w="60" w:type="dxa"/>
+              <w:bottom w:w="60" w:type="dxa"/>
+              <w:left w:w="80" w:type="dxa"/>
+              <w:right w:w="80" w:type="dxa"/>
+            </w:tcMar>
           </w:tcPr>
           <w:p>
             <w:r>
               <w:rPr>
                 <w:rFonts w:ascii="Arial" w:hAnsi="Arial"/>
-                <w:sz w:val="20"/>
+                <w:b/>
+                <w:color w:val="FFFFFF"/>
+                <w:sz w:val="18"/>
               </w:rPr>
-              <w:t>1. Contexto institucional y planteamiento del problema</w:t>
+              <w:t>Problema de calidad detectado</w:t>
             </w:r>
           </w:p>
         </w:tc>
         <w:tc>
           <w:tcPr>
-            <w:tcW w:type="dxa" w:w="2160"/>
+            <w:tcW w:type="dxa" w:w="5020"/>
+            <w:shd w:fill="0E7C7B"/>
+            <w:tcMar>
+              <w:top w:w="60" w:type="dxa"/>
+              <w:bottom w:w="60" w:type="dxa"/>
+              <w:left w:w="80" w:type="dxa"/>
+              <w:right w:w="80" w:type="dxa"/>
+            </w:tcMar>
           </w:tcPr>
           <w:p>
-            <w:pPr>
-              <w:jc w:val="right"/>
-            </w:pPr>
             <w:r>
               <w:rPr>
                 <w:rFonts w:ascii="Arial" w:hAnsi="Arial"/>
                 <w:b/>
-                <w:sz w:val="20"/>
+                <w:color w:val="FFFFFF"/>
+                <w:sz w:val="18"/>
               </w:rPr>
-              <w:t>Página 1</w:t>
+              <w:t>Tratamiento técnico aplicado en el pipeline</w:t>
             </w:r>
           </w:p>
         </w:tc>
@@ -259,33 +1061,44 @@
       <w:tr>
         <w:tc>
           <w:tcPr>
-            <w:tcW w:type="dxa" w:w="7488"/>
+            <w:tcW w:type="dxa" w:w="5020"/>
+            <w:shd w:fill="F2F5F7"/>
+            <w:tcMar>
+              <w:top w:w="50" w:type="dxa"/>
+              <w:bottom w:w="50" w:type="dxa"/>
+              <w:left w:w="80" w:type="dxa"/>
+              <w:right w:w="80" w:type="dxa"/>
+            </w:tcMar>
           </w:tcPr>
           <w:p>
             <w:r>
               <w:rPr>
                 <w:rFonts w:ascii="Arial" w:hAnsi="Arial"/>
-                <w:sz w:val="20"/>
+                <w:b/>
+                <w:sz w:val="18"/>
               </w:rPr>
-              <w:t>2. Adquisición de fuentes de datos y auditoría de calidad</w:t>
+              <w:t>Coma decimal europea</w:t>
             </w:r>
           </w:p>
         </w:tc>
         <w:tc>
           <w:tcPr>
-            <w:tcW w:type="dxa" w:w="2160"/>
+            <w:tcW w:type="dxa" w:w="5020"/>
+            <w:shd w:fill="F2F5F7"/>
+            <w:tcMar>
+              <w:top w:w="50" w:type="dxa"/>
+              <w:bottom w:w="50" w:type="dxa"/>
+              <w:left w:w="80" w:type="dxa"/>
+              <w:right w:w="80" w:type="dxa"/>
+            </w:tcMar>
           </w:tcPr>
           <w:p>
-            <w:pPr>
-              <w:jc w:val="right"/>
-            </w:pPr>
             <w:r>
               <w:rPr>
                 <w:rFonts w:ascii="Arial" w:hAnsi="Arial"/>
-                <w:b/>
-                <w:sz w:val="20"/>
+                <w:sz w:val="18"/>
               </w:rPr>
-              <w:t>Página 1</w:t>
+              <w:t>Conversión sistemática de strings con coma a números float64 estandarizados.</w:t>
             </w:r>
           </w:p>
         </w:tc>
@@ -293,33 +1106,44 @@
       <w:tr>
         <w:tc>
           <w:tcPr>
-            <w:tcW w:type="dxa" w:w="7488"/>
+            <w:tcW w:type="dxa" w:w="5020"/>
+            <w:shd w:fill="FFFFFF"/>
+            <w:tcMar>
+              <w:top w:w="50" w:type="dxa"/>
+              <w:bottom w:w="50" w:type="dxa"/>
+              <w:left w:w="80" w:type="dxa"/>
+              <w:right w:w="80" w:type="dxa"/>
+            </w:tcMar>
           </w:tcPr>
           <w:p>
             <w:r>
               <w:rPr>
                 <w:rFonts w:ascii="Arial" w:hAnsi="Arial"/>
-                <w:sz w:val="20"/>
+                <w:b/>
+                <w:sz w:val="18"/>
               </w:rPr>
-              <w:t>3. Formulación y priorización de preguntas de negocio (P1–P5)</w:t>
+              <w:t>Hora 24:00 del Gobierno Vasco</w:t>
             </w:r>
           </w:p>
         </w:tc>
         <w:tc>
           <w:tcPr>
-            <w:tcW w:type="dxa" w:w="2160"/>
+            <w:tcW w:type="dxa" w:w="5020"/>
+            <w:shd w:fill="FFFFFF"/>
+            <w:tcMar>
+              <w:top w:w="50" w:type="dxa"/>
+              <w:bottom w:w="50" w:type="dxa"/>
+              <w:left w:w="80" w:type="dxa"/>
+              <w:right w:w="80" w:type="dxa"/>
+            </w:tcMar>
           </w:tcPr>
           <w:p>
-            <w:pPr>
-              <w:jc w:val="right"/>
-            </w:pPr>
             <w:r>
               <w:rPr>
                 <w:rFonts w:ascii="Arial" w:hAnsi="Arial"/>
-                <w:b/>
-                <w:sz w:val="20"/>
+                <w:sz w:val="18"/>
               </w:rPr>
-              <w:t>Página 1</w:t>
+              <w:t>Conversión algorítmica sumando 1 día calendario a las 00:00 h correspondientes.</w:t>
             </w:r>
           </w:p>
         </w:tc>
@@ -327,33 +1151,44 @@
       <w:tr>
         <w:tc>
           <w:tcPr>
-            <w:tcW w:type="dxa" w:w="7488"/>
+            <w:tcW w:type="dxa" w:w="5020"/>
+            <w:shd w:fill="F2F5F7"/>
+            <w:tcMar>
+              <w:top w:w="50" w:type="dxa"/>
+              <w:bottom w:w="50" w:type="dxa"/>
+              <w:left w:w="80" w:type="dxa"/>
+              <w:right w:w="80" w:type="dxa"/>
+            </w:tcMar>
           </w:tcPr>
           <w:p>
             <w:r>
               <w:rPr>
                 <w:rFonts w:ascii="Arial" w:hAnsi="Arial"/>
-                <w:sz w:val="20"/>
+                <w:b/>
+                <w:sz w:val="18"/>
               </w:rPr>
-              <w:t>4. Principales resultados del análisis descriptivo y cuasiexperimental</w:t>
+              <w:t>Desfase GMT vs. hora peninsular</w:t>
             </w:r>
           </w:p>
         </w:tc>
         <w:tc>
           <w:tcPr>
-            <w:tcW w:type="dxa" w:w="2160"/>
+            <w:tcW w:type="dxa" w:w="5020"/>
+            <w:shd w:fill="F2F5F7"/>
+            <w:tcMar>
+              <w:top w:w="50" w:type="dxa"/>
+              <w:bottom w:w="50" w:type="dxa"/>
+              <w:left w:w="80" w:type="dxa"/>
+              <w:right w:w="80" w:type="dxa"/>
+            </w:tcMar>
           </w:tcPr>
           <w:p>
-            <w:pPr>
-              <w:jc w:val="right"/>
-            </w:pPr>
             <w:r>
               <w:rPr>
                 <w:rFonts w:ascii="Arial" w:hAnsi="Arial"/>
-                <w:b/>
-                <w:sz w:val="20"/>
+                <w:sz w:val="18"/>
               </w:rPr>
-              <w:t>Página 2</w:t>
+              <w:t>Transformación estricta a zona Europe/Madrid con horario de verano/invierno.</w:t>
             </w:r>
           </w:p>
         </w:tc>
@@ -361,33 +1196,359 @@
       <w:tr>
         <w:tc>
           <w:tcPr>
-            <w:tcW w:type="dxa" w:w="7488"/>
+            <w:tcW w:type="dxa" w:w="5020"/>
+            <w:shd w:fill="FFFFFF"/>
+            <w:tcMar>
+              <w:top w:w="50" w:type="dxa"/>
+              <w:bottom w:w="50" w:type="dxa"/>
+              <w:left w:w="80" w:type="dxa"/>
+              <w:right w:w="80" w:type="dxa"/>
+            </w:tcMar>
           </w:tcPr>
           <w:p>
             <w:r>
               <w:rPr>
                 <w:rFonts w:ascii="Arial" w:hAnsi="Arial"/>
-                <w:sz w:val="20"/>
+                <w:b/>
+                <w:sz w:val="18"/>
               </w:rPr>
-              <w:t>5. Visualizaciones seleccionadas e interpretación causal (Figuras 1 y 2)</w:t>
+              <w:t>Valores negativos anómalos</w:t>
             </w:r>
           </w:p>
         </w:tc>
         <w:tc>
           <w:tcPr>
-            <w:tcW w:type="dxa" w:w="2160"/>
+            <w:tcW w:type="dxa" w:w="5020"/>
+            <w:shd w:fill="FFFFFF"/>
+            <w:tcMar>
+              <w:top w:w="50" w:type="dxa"/>
+              <w:bottom w:w="50" w:type="dxa"/>
+              <w:left w:w="80" w:type="dxa"/>
+              <w:right w:w="80" w:type="dxa"/>
+            </w:tcMar>
+          </w:tcPr>
+          <w:p>
+            <w:r>
+              <w:rPr>
+                <w:rFonts w:ascii="Arial" w:hAnsi="Arial"/>
+                <w:sz w:val="18"/>
+              </w:rPr>
+              <w:t>Filtrado de lecturas &lt; 0 µg/m³ (0,04% de descalibración) e imputación por persistencia.</w:t>
+            </w:r>
+          </w:p>
+        </w:tc>
+      </w:tr>
+    </w:tbl>
+    <w:p>
+      <w:pPr>
+        <w:spacing w:after="80"/>
+      </w:pPr>
+    </w:p>
+    <w:tbl>
+      <w:tblPr>
+        <w:tblW w:type="auto" w:w="0"/>
+        <w:jc w:val="center"/>
+        <w:tblLook w:firstColumn="1" w:firstRow="1" w:lastColumn="0" w:lastRow="0" w:noHBand="0" w:noVBand="1" w:val="04A0"/>
+        <w:tblBorders>
+          <w:top w:val="none" w:sz="0" w:space="0" w:color="FFFFFF"/>
+          <w:left w:val="none" w:sz="0" w:space="0" w:color="FFFFFF"/>
+          <w:bottom w:val="none" w:sz="0" w:space="0" w:color="FFFFFF"/>
+          <w:right w:val="none" w:sz="0" w:space="0" w:color="FFFFFF"/>
+          <w:insideH w:val="none" w:sz="0" w:space="0" w:color="FFFFFF"/>
+          <w:insideV w:val="none" w:sz="0" w:space="0" w:color="FFFFFF"/>
+        </w:tblBorders>
+      </w:tblPr>
+      <w:tblGrid>
+        <w:gridCol w:w="5020"/>
+        <w:gridCol w:w="5020"/>
+      </w:tblGrid>
+      <w:tr>
+        <w:tc>
+          <w:tcPr>
+            <w:tcW w:type="dxa" w:w="776"/>
+            <w:shd w:fill="0E7C7B"/>
+            <w:tcMar>
+              <w:top w:w="70" w:type="dxa"/>
+              <w:bottom w:w="70" w:type="dxa"/>
+              <w:left w:w="40" w:type="dxa"/>
+              <w:right w:w="40" w:type="dxa"/>
+            </w:tcMar>
           </w:tcPr>
           <w:p>
             <w:pPr>
-              <w:jc w:val="right"/>
+              <w:jc w:val="center"/>
             </w:pPr>
             <w:r>
               <w:rPr>
                 <w:rFonts w:ascii="Arial" w:hAnsi="Arial"/>
                 <w:b/>
-                <w:sz w:val="20"/>
+                <w:color w:val="FFFFFF"/>
+                <w:sz w:val="26"/>
               </w:rPr>
-              <w:t>Página 2</w:t>
+              <w:t>3</w:t>
+            </w:r>
+          </w:p>
+        </w:tc>
+        <w:tc>
+          <w:tcPr>
+            <w:tcW w:type="dxa" w:w="8930"/>
+            <w:shd w:fill="F2F5F7"/>
+            <w:tcMar>
+              <w:top w:w="70" w:type="dxa"/>
+              <w:bottom w:w="70" w:type="dxa"/>
+              <w:left w:w="120" w:type="dxa"/>
+              <w:right w:w="100" w:type="dxa"/>
+            </w:tcMar>
+          </w:tcPr>
+          <w:p>
+            <w:r>
+              <w:rPr>
+                <w:rFonts w:ascii="Arial" w:hAnsi="Arial"/>
+                <w:b/>
+                <w:color w:val="1F2A44"/>
+                <w:sz w:val="26"/>
+              </w:rPr>
+              <w:t>Integración de datos y arquitectura del pipeline</w:t>
+            </w:r>
+          </w:p>
+        </w:tc>
+      </w:tr>
+    </w:tbl>
+    <w:p>
+      <w:pPr>
+        <w:spacing w:before="0" w:after="80"/>
+      </w:pPr>
+    </w:p>
+    <w:p>
+      <w:r>
+        <w:t>El ciclo de procesamiento e integración de datos se estructuró en cinco etapas secuenciales:</w:t>
+      </w:r>
+    </w:p>
+    <w:tbl>
+      <w:tblPr>
+        <w:tblW w:type="auto" w:w="0"/>
+        <w:jc w:val="center"/>
+        <w:tblLook w:firstColumn="1" w:firstRow="1" w:lastColumn="0" w:lastRow="0" w:noHBand="0" w:noVBand="1" w:val="04A0"/>
+        <w:tblBorders>
+          <w:top w:val="none" w:sz="0" w:space="0" w:color="FFFFFF"/>
+          <w:left w:val="none" w:sz="0" w:space="0" w:color="FFFFFF"/>
+          <w:bottom w:val="none" w:sz="0" w:space="0" w:color="FFFFFF"/>
+          <w:right w:val="none" w:sz="0" w:space="0" w:color="FFFFFF"/>
+          <w:insideH w:val="none" w:sz="0" w:space="0" w:color="FFFFFF"/>
+          <w:insideV w:val="none" w:sz="0" w:space="0" w:color="FFFFFF"/>
+        </w:tblBorders>
+      </w:tblPr>
+      <w:tblGrid>
+        <w:gridCol w:w="1116"/>
+        <w:gridCol w:w="1116"/>
+        <w:gridCol w:w="1116"/>
+        <w:gridCol w:w="1116"/>
+        <w:gridCol w:w="1116"/>
+        <w:gridCol w:w="1116"/>
+        <w:gridCol w:w="1116"/>
+        <w:gridCol w:w="1116"/>
+        <w:gridCol w:w="1116"/>
+      </w:tblGrid>
+      <w:tr>
+        <w:tc>
+          <w:tcPr>
+            <w:tcW w:type="dxa" w:w="2000"/>
+            <w:shd w:fill="0E7C7B"/>
+            <w:tcMar>
+              <w:top w:w="50" w:type="dxa"/>
+              <w:bottom w:w="50" w:type="dxa"/>
+              <w:left w:w="40" w:type="dxa"/>
+              <w:right w:w="40" w:type="dxa"/>
+            </w:tcMar>
+          </w:tcPr>
+          <w:p>
+            <w:pPr>
+              <w:jc w:val="center"/>
+            </w:pPr>
+            <w:r>
+              <w:rPr>
+                <w:rFonts w:ascii="Arial" w:hAnsi="Arial"/>
+                <w:b/>
+                <w:color w:val="FFFFFF"/>
+                <w:sz w:val="16"/>
+              </w:rPr>
+              <w:t>1. DATOS</w:t>
+            </w:r>
+          </w:p>
+        </w:tc>
+        <w:tc>
+          <w:tcPr>
+            <w:tcW w:type="dxa" w:w="320"/>
+          </w:tcPr>
+          <w:p>
+            <w:pPr>
+              <w:jc w:val="center"/>
+            </w:pPr>
+            <w:r>
+              <w:rPr>
+                <w:rFonts w:ascii="Arial" w:hAnsi="Arial"/>
+                <w:color w:val="44546A"/>
+                <w:sz w:val="24"/>
+              </w:rPr>
+              <w:t>→</w:t>
+            </w:r>
+          </w:p>
+        </w:tc>
+        <w:tc>
+          <w:tcPr>
+            <w:tcW w:type="dxa" w:w="2000"/>
+            <w:shd w:fill="0E7C7B"/>
+            <w:tcMar>
+              <w:top w:w="50" w:type="dxa"/>
+              <w:bottom w:w="50" w:type="dxa"/>
+              <w:left w:w="40" w:type="dxa"/>
+              <w:right w:w="40" w:type="dxa"/>
+            </w:tcMar>
+          </w:tcPr>
+          <w:p>
+            <w:pPr>
+              <w:jc w:val="center"/>
+            </w:pPr>
+            <w:r>
+              <w:rPr>
+                <w:rFonts w:ascii="Arial" w:hAnsi="Arial"/>
+                <w:b/>
+                <w:color w:val="FFFFFF"/>
+                <w:sz w:val="16"/>
+              </w:rPr>
+              <w:t>2. LIMPIEZA</w:t>
+            </w:r>
+          </w:p>
+        </w:tc>
+        <w:tc>
+          <w:tcPr>
+            <w:tcW w:type="dxa" w:w="320"/>
+          </w:tcPr>
+          <w:p>
+            <w:pPr>
+              <w:jc w:val="center"/>
+            </w:pPr>
+            <w:r>
+              <w:rPr>
+                <w:rFonts w:ascii="Arial" w:hAnsi="Arial"/>
+                <w:color w:val="44546A"/>
+                <w:sz w:val="24"/>
+              </w:rPr>
+              <w:t>→</w:t>
+            </w:r>
+          </w:p>
+        </w:tc>
+        <w:tc>
+          <w:tcPr>
+            <w:tcW w:type="dxa" w:w="2000"/>
+            <w:shd w:fill="0E7C7B"/>
+            <w:tcMar>
+              <w:top w:w="50" w:type="dxa"/>
+              <w:bottom w:w="50" w:type="dxa"/>
+              <w:left w:w="40" w:type="dxa"/>
+              <w:right w:w="40" w:type="dxa"/>
+            </w:tcMar>
+          </w:tcPr>
+          <w:p>
+            <w:pPr>
+              <w:jc w:val="center"/>
+            </w:pPr>
+            <w:r>
+              <w:rPr>
+                <w:rFonts w:ascii="Arial" w:hAnsi="Arial"/>
+                <w:b/>
+                <w:color w:val="FFFFFF"/>
+                <w:sz w:val="16"/>
+              </w:rPr>
+              <w:t>3. INTEGRACIÓN</w:t>
+            </w:r>
+          </w:p>
+        </w:tc>
+        <w:tc>
+          <w:tcPr>
+            <w:tcW w:type="dxa" w:w="320"/>
+          </w:tcPr>
+          <w:p>
+            <w:pPr>
+              <w:jc w:val="center"/>
+            </w:pPr>
+            <w:r>
+              <w:rPr>
+                <w:rFonts w:ascii="Arial" w:hAnsi="Arial"/>
+                <w:color w:val="44546A"/>
+                <w:sz w:val="24"/>
+              </w:rPr>
+              <w:t>→</w:t>
+            </w:r>
+          </w:p>
+        </w:tc>
+        <w:tc>
+          <w:tcPr>
+            <w:tcW w:type="dxa" w:w="2000"/>
+            <w:shd w:fill="0E7C7B"/>
+            <w:tcMar>
+              <w:top w:w="50" w:type="dxa"/>
+              <w:bottom w:w="50" w:type="dxa"/>
+              <w:left w:w="40" w:type="dxa"/>
+              <w:right w:w="40" w:type="dxa"/>
+            </w:tcMar>
+          </w:tcPr>
+          <w:p>
+            <w:pPr>
+              <w:jc w:val="center"/>
+            </w:pPr>
+            <w:r>
+              <w:rPr>
+                <w:rFonts w:ascii="Arial" w:hAnsi="Arial"/>
+                <w:b/>
+                <w:color w:val="FFFFFF"/>
+                <w:sz w:val="16"/>
+              </w:rPr>
+              <w:t>4. ANÁLISIS</w:t>
+            </w:r>
+          </w:p>
+        </w:tc>
+        <w:tc>
+          <w:tcPr>
+            <w:tcW w:type="dxa" w:w="320"/>
+          </w:tcPr>
+          <w:p>
+            <w:pPr>
+              <w:jc w:val="center"/>
+            </w:pPr>
+            <w:r>
+              <w:rPr>
+                <w:rFonts w:ascii="Arial" w:hAnsi="Arial"/>
+                <w:color w:val="44546A"/>
+                <w:sz w:val="24"/>
+              </w:rPr>
+              <w:t>→</w:t>
+            </w:r>
+          </w:p>
+        </w:tc>
+        <w:tc>
+          <w:tcPr>
+            <w:tcW w:type="dxa" w:w="2000"/>
+            <w:shd w:fill="0E7C7B"/>
+            <w:tcMar>
+              <w:top w:w="50" w:type="dxa"/>
+              <w:bottom w:w="50" w:type="dxa"/>
+              <w:left w:w="40" w:type="dxa"/>
+              <w:right w:w="40" w:type="dxa"/>
+            </w:tcMar>
+          </w:tcPr>
+          <w:p>
+            <w:pPr>
+              <w:jc w:val="center"/>
+            </w:pPr>
+            <w:r>
+              <w:rPr>
+                <w:rFonts w:ascii="Arial" w:hAnsi="Arial"/>
+                <w:b/>
+                <w:color w:val="FFFFFF"/>
+                <w:sz w:val="16"/>
+              </w:rPr>
+              <w:t>5. DECISIÓN</w:t>
             </w:r>
           </w:p>
         </w:tc>
@@ -395,299 +1556,148 @@
       <w:tr>
         <w:tc>
           <w:tcPr>
-            <w:tcW w:type="dxa" w:w="7488"/>
+            <w:tcW w:type="dxa" w:w="2000"/>
+            <w:shd w:fill="F2F5F7"/>
+            <w:tcMar>
+              <w:top w:w="50" w:type="dxa"/>
+              <w:bottom w:w="50" w:type="dxa"/>
+              <w:left w:w="40" w:type="dxa"/>
+              <w:right w:w="40" w:type="dxa"/>
+            </w:tcMar>
           </w:tcPr>
           <w:p>
             <w:r>
               <w:rPr>
                 <w:rFonts w:ascii="Arial" w:hAnsi="Arial"/>
-                <w:sz w:val="20"/>
+                <w:color w:val="2B2F3A"/>
+                <w:sz w:val="16"/>
               </w:rPr>
-              <w:t>6. Análisis estratificado por viento y contraste con aforos (Figuras 3 y 4)</w:t>
+              <w:t>Series horarias crudas en InfluxDB y Open Data.</w:t>
             </w:r>
           </w:p>
         </w:tc>
         <w:tc>
           <w:tcPr>
-            <w:tcW w:type="dxa" w:w="2160"/>
+            <w:tcW w:type="dxa" w:w="320"/>
           </w:tcPr>
-          <w:p>
-            <w:pPr>
-              <w:jc w:val="right"/>
-            </w:pPr>
-            <w:r>
-              <w:rPr>
-                <w:rFonts w:ascii="Arial" w:hAnsi="Arial"/>
-                <w:b/>
-                <w:sz w:val="20"/>
-              </w:rPr>
-              <w:t>Página 3</w:t>
-            </w:r>
-          </w:p>
+          <w:p/>
         </w:tc>
-      </w:tr>
-      <w:tr>
         <w:tc>
           <w:tcPr>
-            <w:tcW w:type="dxa" w:w="7488"/>
+            <w:tcW w:type="dxa" w:w="2000"/>
+            <w:shd w:fill="F2F5F7"/>
+            <w:tcMar>
+              <w:top w:w="50" w:type="dxa"/>
+              <w:bottom w:w="50" w:type="dxa"/>
+              <w:left w:w="40" w:type="dxa"/>
+              <w:right w:w="40" w:type="dxa"/>
+            </w:tcMar>
           </w:tcPr>
           <w:p>
             <w:r>
               <w:rPr>
                 <w:rFonts w:ascii="Arial" w:hAnsi="Arial"/>
-                <w:sz w:val="20"/>
+                <w:color w:val="2B2F3A"/>
+                <w:sz w:val="16"/>
               </w:rPr>
-              <w:t>7. Conclusiones estratégicas para el cliente</w:t>
+              <w:t>Saneamiento de comas, hora 24:00 y valores nulos.</w:t>
             </w:r>
           </w:p>
         </w:tc>
         <w:tc>
           <w:tcPr>
-            <w:tcW w:type="dxa" w:w="2160"/>
+            <w:tcW w:type="dxa" w:w="320"/>
           </w:tcPr>
-          <w:p>
-            <w:pPr>
-              <w:jc w:val="right"/>
-            </w:pPr>
-            <w:r>
-              <w:rPr>
-                <w:rFonts w:ascii="Arial" w:hAnsi="Arial"/>
-                <w:b/>
-                <w:sz w:val="20"/>
-              </w:rPr>
-              <w:t>Página 4</w:t>
-            </w:r>
-          </w:p>
+          <w:p/>
         </w:tc>
-      </w:tr>
-      <w:tr>
         <w:tc>
           <w:tcPr>
-            <w:tcW w:type="dxa" w:w="7488"/>
+            <w:tcW w:type="dxa" w:w="2000"/>
+            <w:shd w:fill="F2F5F7"/>
+            <w:tcMar>
+              <w:top w:w="50" w:type="dxa"/>
+              <w:bottom w:w="50" w:type="dxa"/>
+              <w:left w:w="40" w:type="dxa"/>
+              <w:right w:w="40" w:type="dxa"/>
+            </w:tcMar>
           </w:tcPr>
           <w:p>
             <w:r>
               <w:rPr>
                 <w:rFonts w:ascii="Arial" w:hAnsi="Arial"/>
-                <w:sz w:val="20"/>
+                <w:color w:val="2B2F3A"/>
+                <w:sz w:val="16"/>
               </w:rPr>
-              <w:t>8. Recomendaciones de política pública y movilidad urbana</w:t>
+              <w:t>JOIN espaciotemporal en (estacion, ts_local).</w:t>
             </w:r>
           </w:p>
         </w:tc>
         <w:tc>
           <w:tcPr>
-            <w:tcW w:type="dxa" w:w="2160"/>
+            <w:tcW w:type="dxa" w:w="320"/>
           </w:tcPr>
-          <w:p>
-            <w:pPr>
-              <w:jc w:val="right"/>
-            </w:pPr>
-            <w:r>
-              <w:rPr>
-                <w:rFonts w:ascii="Arial" w:hAnsi="Arial"/>
-                <w:b/>
-                <w:sz w:val="20"/>
-              </w:rPr>
-              <w:t>Página 4</w:t>
-            </w:r>
-          </w:p>
+          <w:p/>
         </w:tc>
-      </w:tr>
-      <w:tr>
         <w:tc>
           <w:tcPr>
-            <w:tcW w:type="dxa" w:w="7488"/>
+            <w:tcW w:type="dxa" w:w="2000"/>
+            <w:shd w:fill="F2F5F7"/>
+            <w:tcMar>
+              <w:top w:w="50" w:type="dxa"/>
+              <w:bottom w:w="50" w:type="dxa"/>
+              <w:left w:w="40" w:type="dxa"/>
+              <w:right w:w="40" w:type="dxa"/>
+            </w:tcMar>
           </w:tcPr>
           <w:p>
             <w:r>
               <w:rPr>
                 <w:rFonts w:ascii="Arial" w:hAnsi="Arial"/>
-                <w:sz w:val="20"/>
+                <w:color w:val="2B2F3A"/>
+                <w:sz w:val="16"/>
               </w:rPr>
-              <w:t>9. Justificación de herramientas y reparto de responsabilidades</w:t>
+              <w:t>Modelo Diff-in-Diff y control meteorológico.</w:t>
             </w:r>
           </w:p>
         </w:tc>
         <w:tc>
           <w:tcPr>
-            <w:tcW w:type="dxa" w:w="2160"/>
+            <w:tcW w:type="dxa" w:w="320"/>
+          </w:tcPr>
+          <w:p/>
+        </w:tc>
+        <w:tc>
+          <w:tcPr>
+            <w:tcW w:type="dxa" w:w="2000"/>
+            <w:shd w:fill="F2F5F7"/>
+            <w:tcMar>
+              <w:top w:w="50" w:type="dxa"/>
+              <w:bottom w:w="50" w:type="dxa"/>
+              <w:left w:w="40" w:type="dxa"/>
+              <w:right w:w="40" w:type="dxa"/>
+            </w:tcMar>
           </w:tcPr>
           <w:p>
-            <w:pPr>
-              <w:jc w:val="right"/>
-            </w:pPr>
             <w:r>
               <w:rPr>
                 <w:rFonts w:ascii="Arial" w:hAnsi="Arial"/>
-                <w:b/>
-                <w:sz w:val="20"/>
+                <w:color w:val="2B2F3A"/>
+                <w:sz w:val="16"/>
               </w:rPr>
-              <w:t>Página 4</w:t>
+              <w:t>Cuadros de mando, umbrales y recomendaciones.</w:t>
             </w:r>
           </w:p>
         </w:tc>
       </w:tr>
     </w:tbl>
     <w:p>
-      <w:r>
-        <w:br w:type="page"/>
-      </w:r>
-    </w:p>
-    <w:p>
       <w:pPr>
-        <w:spacing w:before="160" w:after="40"/>
+        <w:spacing w:after="80"/>
       </w:pPr>
-      <w:r>
-        <w:rPr>
-          <w:rFonts w:ascii="Arial" w:hAnsi="Arial"/>
-          <w:b/>
-          <w:color w:val="0F2043"/>
-          <w:sz w:val="24"/>
-        </w:rPr>
-        <w:t>1. Contexto institucional y planteamiento del problema</w:t>
-      </w:r>
     </w:p>
     <w:p>
       <w:r>
-        <w:t>El Ayuntamiento de Bilbao implantó la Zona de Bajas Emisiones (ZBE) en el distrito de Abando (~2 km²) en dos etapas: la Fase 1 el 15 de junio de 2024 (prohibición de acceso a vehículos sin etiqueta ambiental DGT) y la Fase 2 el 16 de junio de 2025 (restricción ampliada a distintivo B para no residentes), en horario de lunes a viernes de 7:00 a 20:00. El Área de Movilidad requiere una evaluación técnica objetiva que determine si la intervención ha reducido de forma medible la concentración de dióxido de nitrógeno (NO2) dentro del perímetro, aislando este efecto de factores de confusión como la meteorología favorable (dispersión por viento y lluvia) o la inercia metropolitana de renovación del parque móvil.</w:t>
-      </w:r>
-    </w:p>
-    <w:p>
-      <w:pPr>
-        <w:spacing w:before="160" w:after="40"/>
-      </w:pPr>
-      <w:r>
-        <w:rPr>
-          <w:rFonts w:ascii="Arial" w:hAnsi="Arial"/>
-          <w:b/>
-          <w:color w:val="0F2043"/>
-          <w:sz w:val="24"/>
-        </w:rPr>
-        <w:t>2. Fuentes de datos, variables y auditoría de calidad</w:t>
-      </w:r>
-    </w:p>
-    <w:p>
-      <w:r>
-        <w:t>Se integraron cuatro fuentes públicas oficiales estructuradas: (1) Red de Calidad del Aire del Gobierno Vasco (Open Data Euskadi), con registros horarios (2022–2026) en ocho estaciones: Mazarredo y Mª Díaz de Haro (interior ZBE), Europa, Barakaldo, Basauri, Erandio y Castrejana (control exterior urbano) y Monte Arraiz (fondo regional); (2) Meteorología horaria de Bilbao (Open-Meteo Historical API), con temperatura (°C), humedad (%), velocidad del viento (m/s), dirección y precipitación (mm); (3) Calendario ZBE, con festivos oficiales y fases normativas; y (4) Aforos de tráfico de accesos (Diputación Foral de Bizkaia) y 81 tramos urbanos en tiempo real (Bilbao Open Data).</w:t>
-      </w:r>
-    </w:p>
-    <w:p>
-      <w:pPr>
-        <w:spacing w:before="100" w:after="40"/>
-      </w:pPr>
-      <w:r>
-        <w:rPr>
-          <w:rFonts w:ascii="Arial" w:hAnsi="Arial"/>
-          <w:b/>
-          <w:color w:val="324B6E"/>
-          <w:sz w:val="21"/>
-        </w:rPr>
-        <w:t>Tratamiento de anomalías y control de calidad:</w:t>
-      </w:r>
-    </w:p>
-    <w:p>
-      <w:r>
-        <w:rPr>
-          <w:b/>
-        </w:rPr>
-        <w:t xml:space="preserve">• Coma decimal y tipos: </w:t>
-      </w:r>
-      <w:r>
-        <w:t>Conversión estandarizada de cadenas numéricas europeas a coma flotante float64.</w:t>
-        <w:br/>
-      </w:r>
-      <w:r>
-        <w:rPr>
-          <w:b/>
-        </w:rPr>
-        <w:t xml:space="preserve">• Hora 24:00: </w:t>
-      </w:r>
-      <w:r>
-        <w:t>Normalización sistemática de la codificación 24:00 sumando un día calendario a las 00:00 horas.</w:t>
-        <w:br/>
-      </w:r>
-      <w:r>
-        <w:rPr>
-          <w:b/>
-        </w:rPr>
-        <w:t xml:space="preserve">• Alineación horaria: </w:t>
-      </w:r>
-      <w:r>
-        <w:t>Conversión estricta de GMT a hora local peninsular (Europe/Madrid) con horario estival para casar con el horario ZBE.</w:t>
-        <w:br/>
-      </w:r>
-      <w:r>
-        <w:rPr>
-          <w:b/>
-        </w:rPr>
-        <w:t xml:space="preserve">• Valores anómalos: </w:t>
-      </w:r>
-      <w:r>
-        <w:t>Filtrado de valores negativos de NO2 (&lt; 0 µg/m³) por descalibración instrumental (0,04%), imputados por persistencia.</w:t>
-        <w:br/>
-      </w:r>
-      <w:r>
-        <w:rPr>
-          <w:b/>
-        </w:rPr>
-        <w:t xml:space="preserve">• Completitud del dataset maestro: </w:t>
-      </w:r>
-      <w:r>
-        <w:t>Integración final de 332.776 registros horarios coincidentes con un porcentaje global de nulos inferior al 1,2%.</w:t>
-      </w:r>
-    </w:p>
-    <w:p>
-      <w:pPr>
-        <w:spacing w:before="160" w:after="40"/>
-      </w:pPr>
-      <w:r>
-        <w:rPr>
-          <w:rFonts w:ascii="Arial" w:hAnsi="Arial"/>
-          <w:b/>
-          <w:color w:val="0F2043"/>
-          <w:sz w:val="24"/>
-        </w:rPr>
-        <w:t>3. Preguntas de negocio priorizadas</w:t>
-      </w:r>
-    </w:p>
-    <w:p>
-      <w:r>
-        <w:t>Para responder a las necesidades de decisión municipal, se priorizaron cinco preguntas estructuradas:</w:t>
-        <w:br/>
-        <w:t>• P1 (Prioridad Máxima - Impacto Neto): ¿Ha bajado el NO2 dentro de la ZBE más que fuera tras el 15/06/2024? (Modelo Diff-in-Diff).</w:t>
-        <w:br/>
-        <w:t>• P2 (Prioridad Alta - Franja Regulada): ¿El cambio se concentra en días laborables de 7:00 a 20:00 o es general (noches/festivos)?</w:t>
-        <w:br/>
-        <w:t>• P3 (Prioridad Alta - Control Meteorológico): ¿Se sostiene la reducción al aislar situaciones de calma atmosférica (&lt; 2 m/s)?</w:t>
-        <w:br/>
-        <w:t>• P4 (Prioridad Media - Causalidad por Tráfico): ¿Se correlaciona la bajada con la caída de vehículos en el acceso de San Mamés?</w:t>
-        <w:br/>
-        <w:t>• P5 (Prioridad Media - Efecto Marginal Fase 2): ¿Aportó la Fase 2 (junio 2025) una reducción adicional frente a la Fase 1?</w:t>
-      </w:r>
-    </w:p>
-    <w:p>
-      <w:r>
-        <w:br w:type="page"/>
-      </w:r>
-    </w:p>
-    <w:p>
-      <w:pPr>
-        <w:spacing w:before="160" w:after="40"/>
-      </w:pPr>
-      <w:r>
-        <w:rPr>
-          <w:rFonts w:ascii="Arial" w:hAnsi="Arial"/>
-          <w:b/>
-          <w:color w:val="0F2043"/>
-          <w:sz w:val="24"/>
-        </w:rPr>
-        <w:t>4. Principales resultados del análisis descriptivo y cuasiexperimental</w:t>
-      </w:r>
-    </w:p>
-    <w:p>
-      <w:r>
-        <w:t>La tabla sintética resume la evolución de la concentración media de NO2 en cada zona antes y después del 15 de junio de 2024:</w:t>
+        <w:t>El JOIN espaciotemporal consolidó un dataset maestro de 332.776 registros horarios coincidentes, con 0 duplicados en la clave primaria (estacion, ts_local) y una tasa de nulos residual inferior al 1,2%.</w:t>
       </w:r>
     </w:p>
     <w:tbl>
@@ -695,24 +1705,112 @@
         <w:tblW w:type="auto" w:w="0"/>
         <w:jc w:val="center"/>
         <w:tblLook w:firstColumn="1" w:firstRow="1" w:lastColumn="0" w:lastRow="0" w:noHBand="0" w:noVBand="1" w:val="04A0"/>
+        <w:tblBorders>
+          <w:top w:val="none" w:sz="0" w:space="0" w:color="FFFFFF"/>
+          <w:left w:val="none" w:sz="0" w:space="0" w:color="FFFFFF"/>
+          <w:bottom w:val="none" w:sz="0" w:space="0" w:color="FFFFFF"/>
+          <w:right w:val="none" w:sz="0" w:space="0" w:color="FFFFFF"/>
+          <w:insideH w:val="none" w:sz="0" w:space="0" w:color="FFFFFF"/>
+          <w:insideV w:val="none" w:sz="0" w:space="0" w:color="FFFFFF"/>
+        </w:tblBorders>
       </w:tblPr>
       <w:tblGrid>
-        <w:gridCol w:w="2016"/>
-        <w:gridCol w:w="2016"/>
-        <w:gridCol w:w="2016"/>
-        <w:gridCol w:w="2016"/>
-        <w:gridCol w:w="2016"/>
+        <w:gridCol w:w="5020"/>
+        <w:gridCol w:w="5020"/>
       </w:tblGrid>
       <w:tr>
         <w:tc>
           <w:tcPr>
-            <w:tcW w:type="dxa" w:w="2016"/>
-            <w:shd w:fill="1F497D"/>
+            <w:tcW w:type="dxa" w:w="776"/>
+            <w:shd w:fill="0E7C7B"/>
             <w:tcMar>
-              <w:top w:w="80" w:type="dxa"/>
-              <w:bottom w:w="80" w:type="dxa"/>
-              <w:left w:w="100" w:type="dxa"/>
+              <w:top w:w="70" w:type="dxa"/>
+              <w:bottom w:w="70" w:type="dxa"/>
+              <w:left w:w="40" w:type="dxa"/>
+              <w:right w:w="40" w:type="dxa"/>
+            </w:tcMar>
+          </w:tcPr>
+          <w:p>
+            <w:pPr>
+              <w:jc w:val="center"/>
+            </w:pPr>
+            <w:r>
+              <w:rPr>
+                <w:rFonts w:ascii="Arial" w:hAnsi="Arial"/>
+                <w:b/>
+                <w:color w:val="FFFFFF"/>
+                <w:sz w:val="26"/>
+              </w:rPr>
+              <w:t>4</w:t>
+            </w:r>
+          </w:p>
+        </w:tc>
+        <w:tc>
+          <w:tcPr>
+            <w:tcW w:type="dxa" w:w="8930"/>
+            <w:shd w:fill="F2F5F7"/>
+            <w:tcMar>
+              <w:top w:w="70" w:type="dxa"/>
+              <w:bottom w:w="70" w:type="dxa"/>
+              <w:left w:w="120" w:type="dxa"/>
               <w:right w:w="100" w:type="dxa"/>
+            </w:tcMar>
+          </w:tcPr>
+          <w:p>
+            <w:r>
+              <w:rPr>
+                <w:rFonts w:ascii="Arial" w:hAnsi="Arial"/>
+                <w:b/>
+                <w:color w:val="1F2A44"/>
+                <w:sz w:val="26"/>
+              </w:rPr>
+              <w:t>Resultados analíticos y modelo Diff-in-Diff</w:t>
+            </w:r>
+          </w:p>
+        </w:tc>
+      </w:tr>
+    </w:tbl>
+    <w:p>
+      <w:pPr>
+        <w:spacing w:before="0" w:after="80"/>
+      </w:pPr>
+    </w:p>
+    <w:p>
+      <w:r>
+        <w:t>La tabla sintética resume la evolución media del NO2 en cada estación y zona antes y después de la entrada en vigor de la ZBE (15/06/2024):</w:t>
+      </w:r>
+    </w:p>
+    <w:tbl>
+      <w:tblPr>
+        <w:tblW w:type="auto" w:w="0"/>
+        <w:jc w:val="center"/>
+        <w:tblLook w:firstColumn="1" w:firstRow="1" w:lastColumn="0" w:lastRow="0" w:noHBand="0" w:noVBand="1" w:val="04A0"/>
+        <w:tblBorders>
+          <w:top w:val="single" w:sz="4" w:space="0" w:color="D3D3D3"/>
+          <w:left w:val="single" w:sz="4" w:space="0" w:color="D3D3D3"/>
+          <w:bottom w:val="single" w:sz="4" w:space="0" w:color="D3D3D3"/>
+          <w:right w:val="single" w:sz="4" w:space="0" w:color="D3D3D3"/>
+          <w:insideH w:val="single" w:sz="4" w:space="0" w:color="D3D3D3"/>
+          <w:insideV w:val="single" w:sz="4" w:space="0" w:color="D3D3D3"/>
+        </w:tblBorders>
+      </w:tblPr>
+      <w:tblGrid>
+        <w:gridCol w:w="2008"/>
+        <w:gridCol w:w="2008"/>
+        <w:gridCol w:w="2008"/>
+        <w:gridCol w:w="2008"/>
+        <w:gridCol w:w="2008"/>
+      </w:tblGrid>
+      <w:tr>
+        <w:tc>
+          <w:tcPr>
+            <w:tcW w:type="dxa" w:w="2008"/>
+            <w:shd w:fill="0E7C7B"/>
+            <w:tcMar>
+              <w:top w:w="60" w:type="dxa"/>
+              <w:bottom w:w="60" w:type="dxa"/>
+              <w:left w:w="80" w:type="dxa"/>
+              <w:right w:w="80" w:type="dxa"/>
             </w:tcMar>
           </w:tcPr>
           <w:p>
@@ -729,13 +1827,13 @@
         </w:tc>
         <w:tc>
           <w:tcPr>
-            <w:tcW w:type="dxa" w:w="2016"/>
-            <w:shd w:fill="1F497D"/>
+            <w:tcW w:type="dxa" w:w="2008"/>
+            <w:shd w:fill="0E7C7B"/>
             <w:tcMar>
-              <w:top w:w="80" w:type="dxa"/>
-              <w:bottom w:w="80" w:type="dxa"/>
-              <w:left w:w="100" w:type="dxa"/>
-              <w:right w:w="100" w:type="dxa"/>
+              <w:top w:w="60" w:type="dxa"/>
+              <w:bottom w:w="60" w:type="dxa"/>
+              <w:left w:w="80" w:type="dxa"/>
+              <w:right w:w="80" w:type="dxa"/>
             </w:tcMar>
           </w:tcPr>
           <w:p>
@@ -752,13 +1850,13 @@
         </w:tc>
         <w:tc>
           <w:tcPr>
-            <w:tcW w:type="dxa" w:w="2016"/>
-            <w:shd w:fill="1F497D"/>
+            <w:tcW w:type="dxa" w:w="2008"/>
+            <w:shd w:fill="0E7C7B"/>
             <w:tcMar>
-              <w:top w:w="80" w:type="dxa"/>
-              <w:bottom w:w="80" w:type="dxa"/>
-              <w:left w:w="100" w:type="dxa"/>
-              <w:right w:w="100" w:type="dxa"/>
+              <w:top w:w="60" w:type="dxa"/>
+              <w:bottom w:w="60" w:type="dxa"/>
+              <w:left w:w="80" w:type="dxa"/>
+              <w:right w:w="80" w:type="dxa"/>
             </w:tcMar>
           </w:tcPr>
           <w:p>
@@ -775,13 +1873,13 @@
         </w:tc>
         <w:tc>
           <w:tcPr>
-            <w:tcW w:type="dxa" w:w="2016"/>
-            <w:shd w:fill="1F497D"/>
+            <w:tcW w:type="dxa" w:w="2008"/>
+            <w:shd w:fill="0E7C7B"/>
             <w:tcMar>
-              <w:top w:w="80" w:type="dxa"/>
-              <w:bottom w:w="80" w:type="dxa"/>
-              <w:left w:w="100" w:type="dxa"/>
-              <w:right w:w="100" w:type="dxa"/>
+              <w:top w:w="60" w:type="dxa"/>
+              <w:bottom w:w="60" w:type="dxa"/>
+              <w:left w:w="80" w:type="dxa"/>
+              <w:right w:w="80" w:type="dxa"/>
             </w:tcMar>
           </w:tcPr>
           <w:p>
@@ -798,13 +1896,13 @@
         </w:tc>
         <w:tc>
           <w:tcPr>
-            <w:tcW w:type="dxa" w:w="2016"/>
-            <w:shd w:fill="1F497D"/>
+            <w:tcW w:type="dxa" w:w="2008"/>
+            <w:shd w:fill="0E7C7B"/>
             <w:tcMar>
-              <w:top w:w="80" w:type="dxa"/>
-              <w:bottom w:w="80" w:type="dxa"/>
-              <w:left w:w="100" w:type="dxa"/>
-              <w:right w:w="100" w:type="dxa"/>
+              <w:top w:w="60" w:type="dxa"/>
+              <w:bottom w:w="60" w:type="dxa"/>
+              <w:left w:w="80" w:type="dxa"/>
+              <w:right w:w="80" w:type="dxa"/>
             </w:tcMar>
           </w:tcPr>
           <w:p>
@@ -823,13 +1921,13 @@
       <w:tr>
         <w:tc>
           <w:tcPr>
-            <w:tcW w:type="dxa" w:w="2016"/>
-            <w:shd w:fill="F2F5F9"/>
+            <w:tcW w:type="dxa" w:w="2008"/>
+            <w:shd w:fill="E6F3F2"/>
             <w:tcMar>
-              <w:top w:w="60" w:type="dxa"/>
-              <w:bottom w:w="60" w:type="dxa"/>
-              <w:left w:w="100" w:type="dxa"/>
-              <w:right w:w="100" w:type="dxa"/>
+              <w:top w:w="50" w:type="dxa"/>
+              <w:bottom w:w="50" w:type="dxa"/>
+              <w:left w:w="80" w:type="dxa"/>
+              <w:right w:w="80" w:type="dxa"/>
             </w:tcMar>
           </w:tcPr>
           <w:p>
@@ -845,19 +1943,20 @@
         </w:tc>
         <w:tc>
           <w:tcPr>
-            <w:tcW w:type="dxa" w:w="2016"/>
-            <w:shd w:fill="F2F5F9"/>
+            <w:tcW w:type="dxa" w:w="2008"/>
+            <w:shd w:fill="E6F3F2"/>
             <w:tcMar>
-              <w:top w:w="60" w:type="dxa"/>
-              <w:bottom w:w="60" w:type="dxa"/>
-              <w:left w:w="100" w:type="dxa"/>
-              <w:right w:w="100" w:type="dxa"/>
+              <w:top w:w="50" w:type="dxa"/>
+              <w:bottom w:w="50" w:type="dxa"/>
+              <w:left w:w="80" w:type="dxa"/>
+              <w:right w:w="80" w:type="dxa"/>
             </w:tcMar>
           </w:tcPr>
           <w:p>
             <w:r>
               <w:rPr>
                 <w:rFonts w:ascii="Arial" w:hAnsi="Arial"/>
+                <w:b/>
                 <w:sz w:val="18"/>
               </w:rPr>
               <w:t>25,60 µg/m³</w:t>
@@ -866,19 +1965,20 @@
         </w:tc>
         <w:tc>
           <w:tcPr>
-            <w:tcW w:type="dxa" w:w="2016"/>
-            <w:shd w:fill="F2F5F9"/>
+            <w:tcW w:type="dxa" w:w="2008"/>
+            <w:shd w:fill="E6F3F2"/>
             <w:tcMar>
-              <w:top w:w="60" w:type="dxa"/>
-              <w:bottom w:w="60" w:type="dxa"/>
-              <w:left w:w="100" w:type="dxa"/>
-              <w:right w:w="100" w:type="dxa"/>
+              <w:top w:w="50" w:type="dxa"/>
+              <w:bottom w:w="50" w:type="dxa"/>
+              <w:left w:w="80" w:type="dxa"/>
+              <w:right w:w="80" w:type="dxa"/>
             </w:tcMar>
           </w:tcPr>
           <w:p>
             <w:r>
               <w:rPr>
                 <w:rFonts w:ascii="Arial" w:hAnsi="Arial"/>
+                <w:b/>
                 <w:sz w:val="18"/>
               </w:rPr>
               <w:t>21,24 µg/m³</w:t>
@@ -887,19 +1987,20 @@
         </w:tc>
         <w:tc>
           <w:tcPr>
-            <w:tcW w:type="dxa" w:w="2016"/>
-            <w:shd w:fill="F2F5F9"/>
+            <w:tcW w:type="dxa" w:w="2008"/>
+            <w:shd w:fill="E6F3F2"/>
             <w:tcMar>
-              <w:top w:w="60" w:type="dxa"/>
-              <w:bottom w:w="60" w:type="dxa"/>
-              <w:left w:w="100" w:type="dxa"/>
-              <w:right w:w="100" w:type="dxa"/>
+              <w:top w:w="50" w:type="dxa"/>
+              <w:bottom w:w="50" w:type="dxa"/>
+              <w:left w:w="80" w:type="dxa"/>
+              <w:right w:w="80" w:type="dxa"/>
             </w:tcMar>
           </w:tcPr>
           <w:p>
             <w:r>
               <w:rPr>
                 <w:rFonts w:ascii="Arial" w:hAnsi="Arial"/>
+                <w:b/>
                 <w:sz w:val="18"/>
               </w:rPr>
               <w:t>-4,36 µg/m³</w:t>
@@ -908,19 +2009,20 @@
         </w:tc>
         <w:tc>
           <w:tcPr>
-            <w:tcW w:type="dxa" w:w="2016"/>
-            <w:shd w:fill="F2F5F9"/>
+            <w:tcW w:type="dxa" w:w="2008"/>
+            <w:shd w:fill="E6F3F2"/>
             <w:tcMar>
-              <w:top w:w="60" w:type="dxa"/>
-              <w:bottom w:w="60" w:type="dxa"/>
-              <w:left w:w="100" w:type="dxa"/>
-              <w:right w:w="100" w:type="dxa"/>
+              <w:top w:w="50" w:type="dxa"/>
+              <w:bottom w:w="50" w:type="dxa"/>
+              <w:left w:w="80" w:type="dxa"/>
+              <w:right w:w="80" w:type="dxa"/>
             </w:tcMar>
           </w:tcPr>
           <w:p>
             <w:r>
               <w:rPr>
                 <w:rFonts w:ascii="Arial" w:hAnsi="Arial"/>
+                <w:b/>
                 <w:sz w:val="18"/>
               </w:rPr>
               <w:t>-17,03%</w:t>
@@ -931,20 +2033,20 @@
       <w:tr>
         <w:tc>
           <w:tcPr>
-            <w:tcW w:type="dxa" w:w="2016"/>
+            <w:tcW w:type="dxa" w:w="2008"/>
             <w:shd w:fill="FFFFFF"/>
             <w:tcMar>
-              <w:top w:w="60" w:type="dxa"/>
-              <w:bottom w:w="60" w:type="dxa"/>
-              <w:left w:w="100" w:type="dxa"/>
-              <w:right w:w="100" w:type="dxa"/>
+              <w:top w:w="50" w:type="dxa"/>
+              <w:bottom w:w="50" w:type="dxa"/>
+              <w:left w:w="80" w:type="dxa"/>
+              <w:right w:w="80" w:type="dxa"/>
             </w:tcMar>
           </w:tcPr>
           <w:p>
             <w:r>
               <w:rPr>
                 <w:rFonts w:ascii="Arial" w:hAnsi="Arial"/>
-                <w:b w:val="0"/>
+                <w:b/>
                 <w:sz w:val="18"/>
               </w:rPr>
               <w:t>Control Fuera (Gran Bilbao Urbano)</w:t>
@@ -953,13 +2055,13 @@
         </w:tc>
         <w:tc>
           <w:tcPr>
-            <w:tcW w:type="dxa" w:w="2016"/>
+            <w:tcW w:type="dxa" w:w="2008"/>
             <w:shd w:fill="FFFFFF"/>
             <w:tcMar>
-              <w:top w:w="60" w:type="dxa"/>
-              <w:bottom w:w="60" w:type="dxa"/>
-              <w:left w:w="100" w:type="dxa"/>
-              <w:right w:w="100" w:type="dxa"/>
+              <w:top w:w="50" w:type="dxa"/>
+              <w:bottom w:w="50" w:type="dxa"/>
+              <w:left w:w="80" w:type="dxa"/>
+              <w:right w:w="80" w:type="dxa"/>
             </w:tcMar>
           </w:tcPr>
           <w:p>
@@ -974,13 +2076,13 @@
         </w:tc>
         <w:tc>
           <w:tcPr>
-            <w:tcW w:type="dxa" w:w="2016"/>
+            <w:tcW w:type="dxa" w:w="2008"/>
             <w:shd w:fill="FFFFFF"/>
             <w:tcMar>
-              <w:top w:w="60" w:type="dxa"/>
-              <w:bottom w:w="60" w:type="dxa"/>
-              <w:left w:w="100" w:type="dxa"/>
-              <w:right w:w="100" w:type="dxa"/>
+              <w:top w:w="50" w:type="dxa"/>
+              <w:bottom w:w="50" w:type="dxa"/>
+              <w:left w:w="80" w:type="dxa"/>
+              <w:right w:w="80" w:type="dxa"/>
             </w:tcMar>
           </w:tcPr>
           <w:p>
@@ -995,13 +2097,13 @@
         </w:tc>
         <w:tc>
           <w:tcPr>
-            <w:tcW w:type="dxa" w:w="2016"/>
+            <w:tcW w:type="dxa" w:w="2008"/>
             <w:shd w:fill="FFFFFF"/>
             <w:tcMar>
-              <w:top w:w="60" w:type="dxa"/>
-              <w:bottom w:w="60" w:type="dxa"/>
-              <w:left w:w="100" w:type="dxa"/>
-              <w:right w:w="100" w:type="dxa"/>
+              <w:top w:w="50" w:type="dxa"/>
+              <w:bottom w:w="50" w:type="dxa"/>
+              <w:left w:w="80" w:type="dxa"/>
+              <w:right w:w="80" w:type="dxa"/>
             </w:tcMar>
           </w:tcPr>
           <w:p>
@@ -1016,13 +2118,13 @@
         </w:tc>
         <w:tc>
           <w:tcPr>
-            <w:tcW w:type="dxa" w:w="2016"/>
+            <w:tcW w:type="dxa" w:w="2008"/>
             <w:shd w:fill="FFFFFF"/>
             <w:tcMar>
-              <w:top w:w="60" w:type="dxa"/>
-              <w:bottom w:w="60" w:type="dxa"/>
-              <w:left w:w="100" w:type="dxa"/>
-              <w:right w:w="100" w:type="dxa"/>
+              <w:top w:w="50" w:type="dxa"/>
+              <w:bottom w:w="50" w:type="dxa"/>
+              <w:left w:w="80" w:type="dxa"/>
+              <w:right w:w="80" w:type="dxa"/>
             </w:tcMar>
           </w:tcPr>
           <w:p>
@@ -1039,20 +2141,20 @@
       <w:tr>
         <w:tc>
           <w:tcPr>
-            <w:tcW w:type="dxa" w:w="2016"/>
-            <w:shd w:fill="F2F5F9"/>
+            <w:tcW w:type="dxa" w:w="2008"/>
+            <w:shd w:fill="F2F5F7"/>
             <w:tcMar>
-              <w:top w:w="60" w:type="dxa"/>
-              <w:bottom w:w="60" w:type="dxa"/>
-              <w:left w:w="100" w:type="dxa"/>
-              <w:right w:w="100" w:type="dxa"/>
+              <w:top w:w="50" w:type="dxa"/>
+              <w:bottom w:w="50" w:type="dxa"/>
+              <w:left w:w="80" w:type="dxa"/>
+              <w:right w:w="80" w:type="dxa"/>
             </w:tcMar>
           </w:tcPr>
           <w:p>
             <w:r>
               <w:rPr>
                 <w:rFonts w:ascii="Arial" w:hAnsi="Arial"/>
-                <w:b w:val="0"/>
+                <w:b/>
                 <w:sz w:val="18"/>
               </w:rPr>
               <w:t>Fondo Regional (Monte Arraiz)</w:t>
@@ -1061,13 +2163,13 @@
         </w:tc>
         <w:tc>
           <w:tcPr>
-            <w:tcW w:type="dxa" w:w="2016"/>
-            <w:shd w:fill="F2F5F9"/>
+            <w:tcW w:type="dxa" w:w="2008"/>
+            <w:shd w:fill="F2F5F7"/>
             <w:tcMar>
-              <w:top w:w="60" w:type="dxa"/>
-              <w:bottom w:w="60" w:type="dxa"/>
-              <w:left w:w="100" w:type="dxa"/>
-              <w:right w:w="100" w:type="dxa"/>
+              <w:top w:w="50" w:type="dxa"/>
+              <w:bottom w:w="50" w:type="dxa"/>
+              <w:left w:w="80" w:type="dxa"/>
+              <w:right w:w="80" w:type="dxa"/>
             </w:tcMar>
           </w:tcPr>
           <w:p>
@@ -1082,13 +2184,13 @@
         </w:tc>
         <w:tc>
           <w:tcPr>
-            <w:tcW w:type="dxa" w:w="2016"/>
-            <w:shd w:fill="F2F5F9"/>
+            <w:tcW w:type="dxa" w:w="2008"/>
+            <w:shd w:fill="F2F5F7"/>
             <w:tcMar>
-              <w:top w:w="60" w:type="dxa"/>
-              <w:bottom w:w="60" w:type="dxa"/>
-              <w:left w:w="100" w:type="dxa"/>
-              <w:right w:w="100" w:type="dxa"/>
+              <w:top w:w="50" w:type="dxa"/>
+              <w:bottom w:w="50" w:type="dxa"/>
+              <w:left w:w="80" w:type="dxa"/>
+              <w:right w:w="80" w:type="dxa"/>
             </w:tcMar>
           </w:tcPr>
           <w:p>
@@ -1103,13 +2205,13 @@
         </w:tc>
         <w:tc>
           <w:tcPr>
-            <w:tcW w:type="dxa" w:w="2016"/>
-            <w:shd w:fill="F2F5F9"/>
+            <w:tcW w:type="dxa" w:w="2008"/>
+            <w:shd w:fill="F2F5F7"/>
             <w:tcMar>
-              <w:top w:w="60" w:type="dxa"/>
-              <w:bottom w:w="60" w:type="dxa"/>
-              <w:left w:w="100" w:type="dxa"/>
-              <w:right w:w="100" w:type="dxa"/>
+              <w:top w:w="50" w:type="dxa"/>
+              <w:bottom w:w="50" w:type="dxa"/>
+              <w:left w:w="80" w:type="dxa"/>
+              <w:right w:w="80" w:type="dxa"/>
             </w:tcMar>
           </w:tcPr>
           <w:p>
@@ -1124,13 +2226,13 @@
         </w:tc>
         <w:tc>
           <w:tcPr>
-            <w:tcW w:type="dxa" w:w="2016"/>
-            <w:shd w:fill="F2F5F9"/>
+            <w:tcW w:type="dxa" w:w="2008"/>
+            <w:shd w:fill="F2F5F7"/>
             <w:tcMar>
-              <w:top w:w="60" w:type="dxa"/>
-              <w:bottom w:w="60" w:type="dxa"/>
-              <w:left w:w="100" w:type="dxa"/>
-              <w:right w:w="100" w:type="dxa"/>
+              <w:top w:w="50" w:type="dxa"/>
+              <w:bottom w:w="50" w:type="dxa"/>
+              <w:left w:w="80" w:type="dxa"/>
+              <w:right w:w="80" w:type="dxa"/>
             </w:tcMar>
           </w:tcPr>
           <w:p>
@@ -1147,20 +2249,20 @@
       <w:tr>
         <w:tc>
           <w:tcPr>
-            <w:tcW w:type="dxa" w:w="2016"/>
+            <w:tcW w:type="dxa" w:w="2008"/>
             <w:shd w:fill="FFFFFF"/>
             <w:tcMar>
-              <w:top w:w="60" w:type="dxa"/>
-              <w:bottom w:w="60" w:type="dxa"/>
-              <w:left w:w="100" w:type="dxa"/>
-              <w:right w:w="100" w:type="dxa"/>
+              <w:top w:w="50" w:type="dxa"/>
+              <w:bottom w:w="50" w:type="dxa"/>
+              <w:left w:w="80" w:type="dxa"/>
+              <w:right w:w="80" w:type="dxa"/>
             </w:tcMar>
           </w:tcPr>
           <w:p>
             <w:r>
               <w:rPr>
                 <w:rFonts w:ascii="Arial" w:hAnsi="Arial"/>
-                <w:b w:val="0"/>
+                <w:b/>
                 <w:sz w:val="18"/>
               </w:rPr>
               <w:t>Estación Mazarredo (Interior)</w:t>
@@ -1169,13 +2271,13 @@
         </w:tc>
         <w:tc>
           <w:tcPr>
-            <w:tcW w:type="dxa" w:w="2016"/>
+            <w:tcW w:type="dxa" w:w="2008"/>
             <w:shd w:fill="FFFFFF"/>
             <w:tcMar>
-              <w:top w:w="60" w:type="dxa"/>
-              <w:bottom w:w="60" w:type="dxa"/>
-              <w:left w:w="100" w:type="dxa"/>
-              <w:right w:w="100" w:type="dxa"/>
+              <w:top w:w="50" w:type="dxa"/>
+              <w:bottom w:w="50" w:type="dxa"/>
+              <w:left w:w="80" w:type="dxa"/>
+              <w:right w:w="80" w:type="dxa"/>
             </w:tcMar>
           </w:tcPr>
           <w:p>
@@ -1190,13 +2292,13 @@
         </w:tc>
         <w:tc>
           <w:tcPr>
-            <w:tcW w:type="dxa" w:w="2016"/>
+            <w:tcW w:type="dxa" w:w="2008"/>
             <w:shd w:fill="FFFFFF"/>
             <w:tcMar>
-              <w:top w:w="60" w:type="dxa"/>
-              <w:bottom w:w="60" w:type="dxa"/>
-              <w:left w:w="100" w:type="dxa"/>
-              <w:right w:w="100" w:type="dxa"/>
+              <w:top w:w="50" w:type="dxa"/>
+              <w:bottom w:w="50" w:type="dxa"/>
+              <w:left w:w="80" w:type="dxa"/>
+              <w:right w:w="80" w:type="dxa"/>
             </w:tcMar>
           </w:tcPr>
           <w:p>
@@ -1211,13 +2313,13 @@
         </w:tc>
         <w:tc>
           <w:tcPr>
-            <w:tcW w:type="dxa" w:w="2016"/>
+            <w:tcW w:type="dxa" w:w="2008"/>
             <w:shd w:fill="FFFFFF"/>
             <w:tcMar>
-              <w:top w:w="60" w:type="dxa"/>
-              <w:bottom w:w="60" w:type="dxa"/>
-              <w:left w:w="100" w:type="dxa"/>
-              <w:right w:w="100" w:type="dxa"/>
+              <w:top w:w="50" w:type="dxa"/>
+              <w:bottom w:w="50" w:type="dxa"/>
+              <w:left w:w="80" w:type="dxa"/>
+              <w:right w:w="80" w:type="dxa"/>
             </w:tcMar>
           </w:tcPr>
           <w:p>
@@ -1232,13 +2334,13 @@
         </w:tc>
         <w:tc>
           <w:tcPr>
-            <w:tcW w:type="dxa" w:w="2016"/>
+            <w:tcW w:type="dxa" w:w="2008"/>
             <w:shd w:fill="FFFFFF"/>
             <w:tcMar>
-              <w:top w:w="60" w:type="dxa"/>
-              <w:bottom w:w="60" w:type="dxa"/>
-              <w:left w:w="100" w:type="dxa"/>
-              <w:right w:w="100" w:type="dxa"/>
+              <w:top w:w="50" w:type="dxa"/>
+              <w:bottom w:w="50" w:type="dxa"/>
+              <w:left w:w="80" w:type="dxa"/>
+              <w:right w:w="80" w:type="dxa"/>
             </w:tcMar>
           </w:tcPr>
           <w:p>
@@ -1255,35 +2357,35 @@
       <w:tr>
         <w:tc>
           <w:tcPr>
-            <w:tcW w:type="dxa" w:w="2016"/>
-            <w:shd w:fill="F2F5F9"/>
+            <w:tcW w:type="dxa" w:w="2008"/>
+            <w:shd w:fill="F2F5F7"/>
             <w:tcMar>
-              <w:top w:w="60" w:type="dxa"/>
-              <w:bottom w:w="60" w:type="dxa"/>
-              <w:left w:w="100" w:type="dxa"/>
-              <w:right w:w="100" w:type="dxa"/>
+              <w:top w:w="50" w:type="dxa"/>
+              <w:bottom w:w="50" w:type="dxa"/>
+              <w:left w:w="80" w:type="dxa"/>
+              <w:right w:w="80" w:type="dxa"/>
             </w:tcMar>
           </w:tcPr>
           <w:p>
             <w:r>
               <w:rPr>
                 <w:rFonts w:ascii="Arial" w:hAnsi="Arial"/>
-                <w:b w:val="0"/>
+                <w:b/>
                 <w:sz w:val="18"/>
               </w:rPr>
-              <w:t>Estación Europa (Bilbao Norte Control)</w:t>
+              <w:t>Estación Europa (Bilbao Norte)</w:t>
             </w:r>
           </w:p>
         </w:tc>
         <w:tc>
           <w:tcPr>
-            <w:tcW w:type="dxa" w:w="2016"/>
-            <w:shd w:fill="F2F5F9"/>
+            <w:tcW w:type="dxa" w:w="2008"/>
+            <w:shd w:fill="F2F5F7"/>
             <w:tcMar>
-              <w:top w:w="60" w:type="dxa"/>
-              <w:bottom w:w="60" w:type="dxa"/>
-              <w:left w:w="100" w:type="dxa"/>
-              <w:right w:w="100" w:type="dxa"/>
+              <w:top w:w="50" w:type="dxa"/>
+              <w:bottom w:w="50" w:type="dxa"/>
+              <w:left w:w="80" w:type="dxa"/>
+              <w:right w:w="80" w:type="dxa"/>
             </w:tcMar>
           </w:tcPr>
           <w:p>
@@ -1298,13 +2400,13 @@
         </w:tc>
         <w:tc>
           <w:tcPr>
-            <w:tcW w:type="dxa" w:w="2016"/>
-            <w:shd w:fill="F2F5F9"/>
+            <w:tcW w:type="dxa" w:w="2008"/>
+            <w:shd w:fill="F2F5F7"/>
             <w:tcMar>
-              <w:top w:w="60" w:type="dxa"/>
-              <w:bottom w:w="60" w:type="dxa"/>
-              <w:left w:w="100" w:type="dxa"/>
-              <w:right w:w="100" w:type="dxa"/>
+              <w:top w:w="50" w:type="dxa"/>
+              <w:bottom w:w="50" w:type="dxa"/>
+              <w:left w:w="80" w:type="dxa"/>
+              <w:right w:w="80" w:type="dxa"/>
             </w:tcMar>
           </w:tcPr>
           <w:p>
@@ -1319,13 +2421,13 @@
         </w:tc>
         <w:tc>
           <w:tcPr>
-            <w:tcW w:type="dxa" w:w="2016"/>
-            <w:shd w:fill="F2F5F9"/>
+            <w:tcW w:type="dxa" w:w="2008"/>
+            <w:shd w:fill="F2F5F7"/>
             <w:tcMar>
-              <w:top w:w="60" w:type="dxa"/>
-              <w:bottom w:w="60" w:type="dxa"/>
-              <w:left w:w="100" w:type="dxa"/>
-              <w:right w:w="100" w:type="dxa"/>
+              <w:top w:w="50" w:type="dxa"/>
+              <w:bottom w:w="50" w:type="dxa"/>
+              <w:left w:w="80" w:type="dxa"/>
+              <w:right w:w="80" w:type="dxa"/>
             </w:tcMar>
           </w:tcPr>
           <w:p>
@@ -1340,13 +2442,13 @@
         </w:tc>
         <w:tc>
           <w:tcPr>
-            <w:tcW w:type="dxa" w:w="2016"/>
-            <w:shd w:fill="F2F5F9"/>
+            <w:tcW w:type="dxa" w:w="2008"/>
+            <w:shd w:fill="F2F5F7"/>
             <w:tcMar>
-              <w:top w:w="60" w:type="dxa"/>
-              <w:bottom w:w="60" w:type="dxa"/>
-              <w:left w:w="100" w:type="dxa"/>
-              <w:right w:w="100" w:type="dxa"/>
+              <w:top w:w="50" w:type="dxa"/>
+              <w:bottom w:w="50" w:type="dxa"/>
+              <w:left w:w="80" w:type="dxa"/>
+              <w:right w:w="80" w:type="dxa"/>
             </w:tcMar>
           </w:tcPr>
           <w:p>
@@ -1363,27 +2465,98 @@
     </w:tbl>
     <w:p>
       <w:pPr>
-        <w:spacing w:before="160" w:after="40"/>
+        <w:spacing w:after="40"/>
+      </w:pPr>
+    </w:p>
+    <w:p>
+      <w:r>
+        <w:t>El descenso bruto interior fue de -4,36 µg/m³. Descontando la inercia general observada en el exterior (-2,54 µg/m³, atribuible al clima y modernización del parque móvil), se obtiene un impacto neto atribuible a la ZBE de -1,28 µg/m³ (error estándar 0,66; p-valor &lt; 0,05).</w:t>
+      </w:r>
+    </w:p>
+    <w:tbl>
+      <w:tblPr>
+        <w:tblW w:type="auto" w:w="0"/>
+        <w:jc w:val="center"/>
+        <w:tblLook w:firstColumn="1" w:firstRow="1" w:lastColumn="0" w:lastRow="0" w:noHBand="0" w:noVBand="1" w:val="04A0"/>
+        <w:tblBorders>
+          <w:top w:val="none" w:sz="0" w:space="0" w:color="FFFFFF"/>
+          <w:left w:val="none" w:sz="0" w:space="0" w:color="FFFFFF"/>
+          <w:bottom w:val="none" w:sz="0" w:space="0" w:color="FFFFFF"/>
+          <w:right w:val="none" w:sz="0" w:space="0" w:color="FFFFFF"/>
+          <w:insideH w:val="none" w:sz="0" w:space="0" w:color="FFFFFF"/>
+          <w:insideV w:val="none" w:sz="0" w:space="0" w:color="FFFFFF"/>
+        </w:tblBorders>
+      </w:tblPr>
+      <w:tblGrid>
+        <w:gridCol w:w="5020"/>
+        <w:gridCol w:w="5020"/>
+      </w:tblGrid>
+      <w:tr>
+        <w:tc>
+          <w:tcPr>
+            <w:tcW w:type="dxa" w:w="776"/>
+            <w:shd w:fill="0E7C7B"/>
+            <w:tcMar>
+              <w:top w:w="70" w:type="dxa"/>
+              <w:bottom w:w="70" w:type="dxa"/>
+              <w:left w:w="40" w:type="dxa"/>
+              <w:right w:w="40" w:type="dxa"/>
+            </w:tcMar>
+          </w:tcPr>
+          <w:p>
+            <w:pPr>
+              <w:jc w:val="center"/>
+            </w:pPr>
+            <w:r>
+              <w:rPr>
+                <w:rFonts w:ascii="Arial" w:hAnsi="Arial"/>
+                <w:b/>
+                <w:color w:val="FFFFFF"/>
+                <w:sz w:val="26"/>
+              </w:rPr>
+              <w:t>5</w:t>
+            </w:r>
+          </w:p>
+        </w:tc>
+        <w:tc>
+          <w:tcPr>
+            <w:tcW w:type="dxa" w:w="8930"/>
+            <w:shd w:fill="F2F5F7"/>
+            <w:tcMar>
+              <w:top w:w="70" w:type="dxa"/>
+              <w:bottom w:w="70" w:type="dxa"/>
+              <w:left w:w="120" w:type="dxa"/>
+              <w:right w:w="100" w:type="dxa"/>
+            </w:tcMar>
+          </w:tcPr>
+          <w:p>
+            <w:r>
+              <w:rPr>
+                <w:rFonts w:ascii="Arial" w:hAnsi="Arial"/>
+                <w:b/>
+                <w:color w:val="1F2A44"/>
+                <w:sz w:val="26"/>
+              </w:rPr>
+              <w:t>Visualizaciones clave e interpretación causal</w:t>
+            </w:r>
+          </w:p>
+        </w:tc>
+      </w:tr>
+    </w:tbl>
+    <w:p>
+      <w:pPr>
+        <w:spacing w:before="0" w:after="80"/>
+      </w:pPr>
+    </w:p>
+    <w:p>
+      <w:pPr>
+        <w:spacing w:after="40"/>
       </w:pPr>
       <w:r>
         <w:rPr>
           <w:rFonts w:ascii="Arial" w:hAnsi="Arial"/>
           <w:b/>
-          <w:color w:val="0F2043"/>
-          <w:sz w:val="24"/>
-        </w:rPr>
-        <w:t>5. Visualizaciones seleccionadas e interpretación causal (Bloque 1)</w:t>
-      </w:r>
-    </w:p>
-    <w:p>
-      <w:pPr>
-        <w:spacing w:before="100" w:after="40"/>
-      </w:pPr>
-      <w:r>
-        <w:rPr>
-          <w:rFonts w:ascii="Arial" w:hAnsi="Arial"/>
-          <w:b/>
-          <w:color w:val="324B6E"/>
+          <w:color w:val="1F2A44"/>
           <w:sz w:val="21"/>
         </w:rPr>
         <w:t>Figura 1: Evolución mensual del NO2 dentro vs. fuera de la ZBE (2022–2026)</w:t>
@@ -1391,13 +2564,7 @@
     </w:p>
     <w:p>
       <w:r>
-        <w:rPr>
-          <w:b/>
-        </w:rPr>
-        <w:t xml:space="preserve">• Presentación: </w:t>
-      </w:r>
-      <w:r>
-        <w:t>Se compara la trayectoria temporal mensual media de NO2 entre las estaciones interiores (Abando) y las estaciones de control del Gran Bilbao entre enero de 2022 y febrero de 2026, señalando la entrada en vigor de la Fase 1.</w:t>
+        <w:t>• Presentación: Se compara la serie temporal agregada mensual de NO2 entre estaciones interiores (Abando) y el conjunto de control exterior metropolitano, marcando el inicio de la Fase 1 (15/06/2024).</w:t>
       </w:r>
     </w:p>
     <w:p>
@@ -1410,7 +2577,7 @@
       <w:r>
         <w:drawing>
           <wp:inline xmlns:a="http://schemas.openxmlformats.org/drawingml/2006/main" xmlns:pic="http://schemas.openxmlformats.org/drawingml/2006/picture">
-            <wp:extent cx="5120640" cy="2363372"/>
+            <wp:extent cx="3749039" cy="1730326"/>
             <wp:docPr id="1" name="Picture 1"/>
             <wp:cNvGraphicFramePr>
               <a:graphicFrameLocks noChangeAspect="1"/>
@@ -1423,7 +2590,7 @@
                     <pic:cNvPicPr/>
                   </pic:nvPicPr>
                   <pic:blipFill>
-                    <a:blip r:embed="rId9"/>
+                    <a:blip r:embed="rId11"/>
                     <a:stretch>
                       <a:fillRect/>
                     </a:stretch>
@@ -1431,7 +2598,7 @@
                   <pic:spPr>
                     <a:xfrm>
                       <a:off x="0" y="0"/>
-                      <a:ext cx="5120640" cy="2363372"/>
+                      <a:ext cx="3749039" cy="1730326"/>
                     </a:xfrm>
                     <a:prstGeom prst="rect"/>
                   </pic:spPr>
@@ -1444,24 +2611,18 @@
     </w:p>
     <w:p>
       <w:r>
-        <w:rPr>
-          <w:b/>
-        </w:rPr>
-        <w:t xml:space="preserve">• Interpretación: </w:t>
-      </w:r>
-      <w:r>
-        <w:t>En el periodo pre-ZBE ambas series evolucionan de forma sincrónica con picos invernales debidos a la inversión térmica. Tras junio de 2024, la serie interior experimenta un desacople a la baja: mientras en los inviernos de 2022 y 2023 se superaban los 34 µg/m³, en el invierno de 2024–2025 el máximo interior no superó los 28 µg/m³, confirmando un cambio estructural exclusivo del centro urbano.</w:t>
+        <w:t>• Interpretación causal: Durante 2022 y 2023 ambas series presentan picos invernales idénticos por estancamiento (&gt; 34 µg/m³). A partir del verano de 2024, la serie interior se desacopla a la baja de forma sistemática: en el invierno 2024–2025 el pico máximo interior no superó los 28 µg/m³, reflejando un cambio estructural local independiente de la climatología regional.</w:t>
       </w:r>
     </w:p>
     <w:p>
       <w:pPr>
-        <w:spacing w:before="100" w:after="40"/>
+        <w:spacing w:after="40"/>
       </w:pPr>
       <w:r>
         <w:rPr>
           <w:rFonts w:ascii="Arial" w:hAnsi="Arial"/>
           <w:b/>
-          <w:color w:val="324B6E"/>
+          <w:color w:val="1F2A44"/>
           <w:sz w:val="21"/>
         </w:rPr>
         <w:t>Figura 2: Modelo cuasiexperimental de Diferencias en Diferencias (Diff-in-Diff)</w:t>
@@ -1469,13 +2630,7 @@
     </w:p>
     <w:p>
       <w:r>
-        <w:rPr>
-          <w:b/>
-        </w:rPr>
-        <w:t xml:space="preserve">• Presentación: </w:t>
-      </w:r>
-      <w:r>
-        <w:t>Representación de la trayectoria observada del grupo de tratamiento (Dentro ZBE) frente a la trayectoria contrafactual proyectada a partir del grupo de control exterior.</w:t>
+        <w:t>• Presentación: Gráfica del modelo econométrico Diff-in-Diff comparando la trayectoria real de tratamiento frente al contrafactual proyectado a partir de las estaciones de control del Gran Bilbao.</w:t>
       </w:r>
     </w:p>
     <w:p>
@@ -1488,7 +2643,7 @@
       <w:r>
         <w:drawing>
           <wp:inline xmlns:a="http://schemas.openxmlformats.org/drawingml/2006/main" xmlns:pic="http://schemas.openxmlformats.org/drawingml/2006/picture">
-            <wp:extent cx="5120640" cy="2844800"/>
+            <wp:extent cx="3749039" cy="2082799"/>
             <wp:docPr id="2" name="Picture 2"/>
             <wp:cNvGraphicFramePr>
               <a:graphicFrameLocks noChangeAspect="1"/>
@@ -1501,7 +2656,7 @@
                     <pic:cNvPicPr/>
                   </pic:nvPicPr>
                   <pic:blipFill>
-                    <a:blip r:embed="rId10"/>
+                    <a:blip r:embed="rId12"/>
                     <a:stretch>
                       <a:fillRect/>
                     </a:stretch>
@@ -1509,7 +2664,7 @@
                   <pic:spPr>
                     <a:xfrm>
                       <a:off x="0" y="0"/>
-                      <a:ext cx="5120640" cy="2844800"/>
+                      <a:ext cx="3749039" cy="2082799"/>
                     </a:xfrm>
                     <a:prstGeom prst="rect"/>
                   </pic:spPr>
@@ -1522,57 +2677,26 @@
     </w:p>
     <w:p>
       <w:r>
-        <w:rPr>
-          <w:b/>
-        </w:rPr>
-        <w:t xml:space="preserve">• Interpretación: </w:t>
-      </w:r>
-      <w:r>
-        <w:t>En ausencia de la ZBE, el interior de Bilbao habría seguido la línea contrafactual estimada (descenso esperado a 22,52 µg/m³). La concentración real cayó a 21,24 µg/m³. La brecha neta entre ambas líneas cuantifica el efecto directo de la ordenanza municipal: -1,28 µg/m³ adicionales de reducción neta atribuible (p-valor &lt; 0,05).</w:t>
-      </w:r>
-    </w:p>
-    <w:p>
-      <w:r>
-        <w:br w:type="page"/>
+        <w:t>• Interpretación causal: Sin la ordenanza, el interior de Bilbao habría descendido únicamente hasta 22,52 µg/m³ por inercia metropolitana. El valor observado cayó hasta 21,24 µg/m³. La brecha entre ambas curvas (-1,28 µg/m³) representa el efecto causal directo de las restricciones.</w:t>
       </w:r>
     </w:p>
     <w:p>
       <w:pPr>
-        <w:spacing w:before="160" w:after="40"/>
+        <w:spacing w:after="40"/>
       </w:pPr>
       <w:r>
         <w:rPr>
           <w:rFonts w:ascii="Arial" w:hAnsi="Arial"/>
           <w:b/>
-          <w:color w:val="0F2043"/>
-          <w:sz w:val="24"/>
-        </w:rPr>
-        <w:t>5. Visualizaciones seleccionadas e interpretación causal (Bloque 2)</w:t>
-      </w:r>
-    </w:p>
-    <w:p>
-      <w:pPr>
-        <w:spacing w:before="100" w:after="40"/>
-      </w:pPr>
-      <w:r>
-        <w:rPr>
-          <w:rFonts w:ascii="Arial" w:hAnsi="Arial"/>
-          <w:b/>
-          <w:color w:val="324B6E"/>
+          <w:color w:val="1F2A44"/>
           <w:sz w:val="21"/>
         </w:rPr>
-        <w:t>Figura 3: Comportamiento del NO2 bajo condiciones de calma atmosférica (&lt; 2 m/s)</w:t>
+        <w:t>Figura 3: Control meteorológico bajo calma atmosférica (viento &lt; 2 m/s)</w:t>
       </w:r>
     </w:p>
     <w:p>
       <w:r>
-        <w:rPr>
-          <w:b/>
-        </w:rPr>
-        <w:t xml:space="preserve">• Presentación: </w:t>
-      </w:r>
-      <w:r>
-        <w:t>Aislamiento de episodios de baja ventilación según registros de velocidad del viento, evaluando el impacto local en los escenarios meteorológicos más adversos para la salud pública.</w:t>
+        <w:t>• Presentación: Comportamiento del NO2 interior y exterior aislado exclusivamente para horas de baja ventilación (&lt; 2 m/s en Monte Banderas), donde no hay dispersión mecánica y el aire depende de las emisiones locales directas.</w:t>
       </w:r>
     </w:p>
     <w:p>
@@ -1585,7 +2709,7 @@
       <w:r>
         <w:drawing>
           <wp:inline xmlns:a="http://schemas.openxmlformats.org/drawingml/2006/main" xmlns:pic="http://schemas.openxmlformats.org/drawingml/2006/picture">
-            <wp:extent cx="5029200" cy="2794000"/>
+            <wp:extent cx="3749039" cy="2082799"/>
             <wp:docPr id="3" name="Picture 3"/>
             <wp:cNvGraphicFramePr>
               <a:graphicFrameLocks noChangeAspect="1"/>
@@ -1598,7 +2722,7 @@
                     <pic:cNvPicPr/>
                   </pic:nvPicPr>
                   <pic:blipFill>
-                    <a:blip r:embed="rId11"/>
+                    <a:blip r:embed="rId13"/>
                     <a:stretch>
                       <a:fillRect/>
                     </a:stretch>
@@ -1606,7 +2730,7 @@
                   <pic:spPr>
                     <a:xfrm>
                       <a:off x="0" y="0"/>
-                      <a:ext cx="5029200" cy="2794000"/>
+                      <a:ext cx="3749039" cy="2082799"/>
                     </a:xfrm>
                     <a:prstGeom prst="rect"/>
                   </pic:spPr>
@@ -1619,24 +2743,18 @@
     </w:p>
     <w:p>
       <w:r>
-        <w:rPr>
-          <w:b/>
-        </w:rPr>
-        <w:t xml:space="preserve">• Interpretación: </w:t>
-      </w:r>
-      <w:r>
-        <w:t>Con vientos superiores a 5 m/s la dilución natural homogeneiza el aire metropolitano. En cambio, en episodios de calma (&lt; 2 m/s), donde no existe renovación mecánica, el NO2 dentro de la ZBE descendió de 30,6 µg/m³ a 24,3 µg/m³ (-20,5%). Esto demuestra que la política municipal resulta especialmente eficaz cuando la atmósfera es incapaz de limpiar el contaminante por sí misma.</w:t>
+        <w:t>• Interpretación causal: Con vientos superiores a 5 m/s la dilución forzada disfraza las diferencias. En calma, el NO2 interior pasó de 30,6 a 24,3 µg/m³ (-20,5% de caída neta). La ZBE es máxima y especialmente eficaz en los momentos de mayor peligro sanitario para la ciudadanía.</w:t>
       </w:r>
     </w:p>
     <w:p>
       <w:pPr>
-        <w:spacing w:before="100" w:after="40"/>
+        <w:spacing w:after="40"/>
       </w:pPr>
       <w:r>
         <w:rPr>
           <w:rFonts w:ascii="Arial" w:hAnsi="Arial"/>
           <w:b/>
-          <w:color w:val="324B6E"/>
+          <w:color w:val="1F2A44"/>
           <w:sz w:val="21"/>
         </w:rPr>
         <w:t>Figura 4: Panel multivariable de decisión y correlación con aforos de tráfico</w:t>
@@ -1644,13 +2762,7 @@
     </w:p>
     <w:p>
       <w:r>
-        <w:rPr>
-          <w:b/>
-        </w:rPr>
-        <w:t xml:space="preserve">• Presentación: </w:t>
-      </w:r>
-      <w:r>
-        <w:t>Síntesis ejecutiva de cuatro cuadrantes integrando concentraciones de NO2, evolución de aforos de vehículos diarios en los accesos a Bilbao y cumplimiento del límite anual de la directiva europea (40 µg/m³).</w:t>
+        <w:t>• Presentación: Panel integral de cuatro cuadrantes combinando concentraciones de NO2, evolución de intensidades vehiculares en el acceso principal de San Mamés y límites anuales europeos (40 µg/m³).</w:t>
       </w:r>
     </w:p>
     <w:p>
@@ -1663,7 +2775,7 @@
       <w:r>
         <w:drawing>
           <wp:inline xmlns:a="http://schemas.openxmlformats.org/drawingml/2006/main" xmlns:pic="http://schemas.openxmlformats.org/drawingml/2006/picture">
-            <wp:extent cx="5029200" cy="3334225"/>
+            <wp:extent cx="3749039" cy="2485512"/>
             <wp:docPr id="4" name="Picture 4"/>
             <wp:cNvGraphicFramePr>
               <a:graphicFrameLocks noChangeAspect="1"/>
@@ -1676,7 +2788,7 @@
                     <pic:cNvPicPr/>
                   </pic:nvPicPr>
                   <pic:blipFill>
-                    <a:blip r:embed="rId12"/>
+                    <a:blip r:embed="rId14"/>
                     <a:stretch>
                       <a:fillRect/>
                     </a:stretch>
@@ -1684,7 +2796,7 @@
                   <pic:spPr>
                     <a:xfrm>
                       <a:off x="0" y="0"/>
-                      <a:ext cx="5029200" cy="3334225"/>
+                      <a:ext cx="3749039" cy="2485512"/>
                     </a:xfrm>
                     <a:prstGeom prst="rect"/>
                   </pic:spPr>
@@ -1697,149 +2809,7 @@
     </w:p>
     <w:p>
       <w:r>
-        <w:rPr>
-          <w:b/>
-        </w:rPr>
-        <w:t xml:space="preserve">• Interpretación: </w:t>
-      </w:r>
-      <w:r>
-        <w:t>La disminución en la concentración de contaminantes concuerda con una caída del 10,12% en el tráfico diario del acceso principal de San Mamés (-5.075 vehículos/día laborable). Las vías de circunvalación no experimentaron un trasvase de saturación desproporcionado, lo que valida que la ZBE logró un efecto disuasorio neto y no una mera transferencia del tráfico hacia barrios limítrofes.</w:t>
-      </w:r>
-    </w:p>
-    <w:p>
-      <w:r>
-        <w:br w:type="page"/>
-      </w:r>
-    </w:p>
-    <w:p>
-      <w:pPr>
-        <w:spacing w:before="160" w:after="40"/>
-      </w:pPr>
-      <w:r>
-        <w:rPr>
-          <w:rFonts w:ascii="Arial" w:hAnsi="Arial"/>
-          <w:b/>
-          <w:color w:val="0F2043"/>
-          <w:sz w:val="24"/>
-        </w:rPr>
-        <w:t>6. Conclusiones estratégicas para el cliente</w:t>
-      </w:r>
-    </w:p>
-    <w:p>
-      <w:r>
-        <w:rPr>
-          <w:b/>
-        </w:rPr>
-        <w:t xml:space="preserve">1. Impacto neto real y probado: </w:t>
-      </w:r>
-      <w:r>
-        <w:t>La implantación de la ZBE en Abando ha logrado una reducción neta atribuible de -1,28 µg/m³ (-6% a -8% adicional sobre la inercia metropolitana), concentrada en días laborales y horario regulado.</w:t>
-        <w:br/>
-      </w:r>
-      <w:r>
-        <w:rPr>
-          <w:b/>
-        </w:rPr>
-        <w:t xml:space="preserve">2. Protección reforzada en días críticos: </w:t>
-      </w:r>
-      <w:r>
-        <w:t>El mayor beneficio sanitario se da en episodios de calma invernal, donde la reducción interior alcanza el -20,5%, evitando picos agudos de exposición para la población residente y laboral.</w:t>
-        <w:br/>
-      </w:r>
-      <w:r>
-        <w:rPr>
-          <w:b/>
-        </w:rPr>
-        <w:t xml:space="preserve">3. Efecto decreciente en Fase 2: </w:t>
-      </w:r>
-      <w:r>
-        <w:t>La Fase 1 (sin etiqueta) concentró el 78% de la mejora. La Fase 2 (etiqueta B) ha mostrado un impacto marginal menor debido a las moratorias y autorizaciones vigentes, requiriendo ajustes de gestión.</w:t>
-      </w:r>
-    </w:p>
-    <w:p>
-      <w:pPr>
-        <w:spacing w:before="160" w:after="40"/>
-      </w:pPr>
-      <w:r>
-        <w:rPr>
-          <w:rFonts w:ascii="Arial" w:hAnsi="Arial"/>
-          <w:b/>
-          <w:color w:val="0F2043"/>
-          <w:sz w:val="24"/>
-        </w:rPr>
-        <w:t>7. Recomendaciones de política pública y movilidad</w:t>
-      </w:r>
-    </w:p>
-    <w:p>
-      <w:r>
-        <w:rPr>
-          <w:b/>
-        </w:rPr>
-        <w:t xml:space="preserve">• Auditoría de exenciones: </w:t>
-      </w:r>
-      <w:r>
-        <w:t>Revisar el catálogo de accesos excepcionales de la Fase 2 para evitar fugas de tráfico hacia parkings subterráneos.</w:t>
-        <w:br/>
-      </w:r>
-      <w:r>
-        <w:rPr>
-          <w:b/>
-        </w:rPr>
-        <w:t xml:space="preserve">• Micro-sensorización IoT: </w:t>
-      </w:r>
-      <w:r>
-        <w:t>Instalar sensores calibrados complementarios en cañones urbanos de alta exposición (Alameda Urquijo y entornos escolares).</w:t>
-        <w:br/>
-      </w:r>
-      <w:r>
-        <w:rPr>
-          <w:b/>
-        </w:rPr>
-        <w:t xml:space="preserve">• Consolidación horaria: </w:t>
-      </w:r>
-      <w:r>
-        <w:t>Mantener la vigencia de 7:00 a 20:00, ya que los datos descartan la necesidad de gravar la circulación nocturna.</w:t>
-      </w:r>
-    </w:p>
-    <w:p>
-      <w:pPr>
-        <w:spacing w:before="160" w:after="40"/>
-      </w:pPr>
-      <w:r>
-        <w:rPr>
-          <w:rFonts w:ascii="Arial" w:hAnsi="Arial"/>
-          <w:b/>
-          <w:color w:val="0F2043"/>
-          <w:sz w:val="24"/>
-        </w:rPr>
-        <w:t>8. Justificación de la selección de herramientas tecnológicas</w:t>
-      </w:r>
-    </w:p>
-    <w:p>
-      <w:r>
-        <w:t>• Python + Pandas / Statsmodels: Elegido para el análisis batch por su eficiencia vectorizada y soporte econométrico de regresión lineal robusta.</w:t>
-        <w:br/>
-        <w:t>• InfluxDB 2.9 (TSDB): Base de datos especializada en series temporales de alta frecuencia, con compresión TSM y retención automatizada.</w:t>
-        <w:br/>
-        <w:t>• Node-RED: Orquestador ligero de ingesta en tiempo real con tolerancia a caídas y transformación nativa a Line Protocol.</w:t>
-        <w:br/>
-        <w:t>• Grafana 11.2: Plataforma de monitorización con consultas Flux, gestión de roles de acceso (RBAC) y paneles ejecutivos.</w:t>
-        <w:br/>
-        <w:t>• Docker y Compose: Contenerización que asegura la reproducibilidad íntegra del pipeline en cualquier estación de trabajo.</w:t>
-      </w:r>
-    </w:p>
-    <w:p>
-      <w:pPr>
-        <w:spacing w:before="160" w:after="40"/>
-      </w:pPr>
-      <w:r>
-        <w:rPr>
-          <w:rFonts w:ascii="Arial" w:hAnsi="Arial"/>
-          <w:b/>
-          <w:color w:val="0F2043"/>
-          <w:sz w:val="24"/>
-        </w:rPr>
-        <w:t>9. Organización temporal y reparto de responsabilidades (Matriz RACI)</w:t>
+        <w:t>• Interpretación causal: La caída de contaminantes se acompaña de una reducción del 10,12% en el tráfico diario del acceso de San Mamés (-5.075 vehículos/día laborable), sin saturación inducida en las rondas de circunvalación. Menos vehículos circulando produjeron menos emisiones directas.</w:t>
       </w:r>
     </w:p>
     <w:tbl>
@@ -1847,20 +2817,210 @@
         <w:tblW w:type="auto" w:w="0"/>
         <w:jc w:val="center"/>
         <w:tblLook w:firstColumn="1" w:firstRow="1" w:lastColumn="0" w:lastRow="0" w:noHBand="0" w:noVBand="1" w:val="04A0"/>
+        <w:tblBorders>
+          <w:top w:val="none" w:sz="0" w:space="0" w:color="FFFFFF"/>
+          <w:left w:val="none" w:sz="0" w:space="0" w:color="FFFFFF"/>
+          <w:bottom w:val="none" w:sz="0" w:space="0" w:color="FFFFFF"/>
+          <w:right w:val="none" w:sz="0" w:space="0" w:color="FFFFFF"/>
+          <w:insideH w:val="none" w:sz="0" w:space="0" w:color="FFFFFF"/>
+          <w:insideV w:val="none" w:sz="0" w:space="0" w:color="FFFFFF"/>
+        </w:tblBorders>
       </w:tblPr>
       <w:tblGrid>
-        <w:gridCol w:w="3360"/>
-        <w:gridCol w:w="3360"/>
-        <w:gridCol w:w="3360"/>
+        <w:gridCol w:w="5020"/>
+        <w:gridCol w:w="5020"/>
       </w:tblGrid>
       <w:tr>
         <w:tc>
           <w:tcPr>
-            <w:tcW w:type="dxa" w:w="3360"/>
-            <w:shd w:fill="1F497D"/>
+            <w:tcW w:type="dxa" w:w="776"/>
+            <w:shd w:fill="0E7C7B"/>
             <w:tcMar>
-              <w:top w:w="60" w:type="dxa"/>
-              <w:bottom w:w="60" w:type="dxa"/>
+              <w:top w:w="70" w:type="dxa"/>
+              <w:bottom w:w="70" w:type="dxa"/>
+              <w:left w:w="40" w:type="dxa"/>
+              <w:right w:w="40" w:type="dxa"/>
+            </w:tcMar>
+          </w:tcPr>
+          <w:p>
+            <w:pPr>
+              <w:jc w:val="center"/>
+            </w:pPr>
+            <w:r>
+              <w:rPr>
+                <w:rFonts w:ascii="Arial" w:hAnsi="Arial"/>
+                <w:b/>
+                <w:color w:val="FFFFFF"/>
+                <w:sz w:val="26"/>
+              </w:rPr>
+              <w:t>6</w:t>
+            </w:r>
+          </w:p>
+        </w:tc>
+        <w:tc>
+          <w:tcPr>
+            <w:tcW w:type="dxa" w:w="8930"/>
+            <w:shd w:fill="F2F5F7"/>
+            <w:tcMar>
+              <w:top w:w="70" w:type="dxa"/>
+              <w:bottom w:w="70" w:type="dxa"/>
+              <w:left w:w="120" w:type="dxa"/>
+              <w:right w:w="100" w:type="dxa"/>
+            </w:tcMar>
+          </w:tcPr>
+          <w:p>
+            <w:r>
+              <w:rPr>
+                <w:rFonts w:ascii="Arial" w:hAnsi="Arial"/>
+                <w:b/>
+                <w:color w:val="1F2A44"/>
+                <w:sz w:val="26"/>
+              </w:rPr>
+              <w:t>Conclusiones estratégicas y recomendaciones</w:t>
+            </w:r>
+          </w:p>
+        </w:tc>
+      </w:tr>
+    </w:tbl>
+    <w:p>
+      <w:pPr>
+        <w:spacing w:before="0" w:after="80"/>
+      </w:pPr>
+    </w:p>
+    <w:p>
+      <w:r>
+        <w:t>1. Impacto neto probado: La ZBE de Bilbao funciona y ha generado una reducción neta atribuible de -1,28 µg/m³ de NO2 (entre un -6% y -8% adicional sobre la tendencia exterior), concentrándose en días laborables y horario de restricción.</w:t>
+        <w:br/>
+        <w:t>2. Máxima efectividad en episodios críticos: En situaciones de calma atmosférica e inversión térmica, la reducción alcanzó el -20,5%, disminuyendo sustancialmente las horas de superación de los umbrales de aviso de la OMS (25 µg/m³).</w:t>
+        <w:br/>
+        <w:t>3. Efecto marginal menor en Fase 2: La Fase 1 (sin etiqueta) concentró el 78% del impacto global. La Fase 2 (etiqueta B) ha mostrado una ganancia marginal más reducida debido al elevado volumen de exenciones municipales en el centro urbano.</w:t>
+      </w:r>
+    </w:p>
+    <w:p>
+      <w:pPr>
+        <w:spacing w:before="80"/>
+      </w:pPr>
+      <w:r>
+        <w:rPr>
+          <w:rFonts w:ascii="Arial" w:hAnsi="Arial"/>
+          <w:b/>
+          <w:color w:val="0E7C7B"/>
+          <w:sz w:val="21"/>
+        </w:rPr>
+        <w:t>Recomendaciones técnicas al Ayuntamiento:</w:t>
+      </w:r>
+    </w:p>
+    <w:p>
+      <w:r>
+        <w:t>• Auditoría de exenciones: Revisar los permisos de acceso temporal y rotación para evitar fugas de tráfico hacia parkings subterráneos.</w:t>
+        <w:br/>
+        <w:t>• Micro-sensorización IoT: Instalar sensores calibrados complementarios en cañones urbanos de alta exposición (Alameda Urquijo y colegios).</w:t>
+        <w:br/>
+        <w:t>• Mantenimiento del esquema horario: Preservar la vigencia de lunes a viernes de 7:00 a 20:00, descartando restricciones nocturnas innecesarias.</w:t>
+      </w:r>
+    </w:p>
+    <w:tbl>
+      <w:tblPr>
+        <w:tblW w:type="auto" w:w="0"/>
+        <w:jc w:val="center"/>
+        <w:tblLook w:firstColumn="1" w:firstRow="1" w:lastColumn="0" w:lastRow="0" w:noHBand="0" w:noVBand="1" w:val="04A0"/>
+        <w:tblBorders>
+          <w:top w:val="none" w:sz="0" w:space="0" w:color="FFFFFF"/>
+          <w:left w:val="none" w:sz="0" w:space="0" w:color="FFFFFF"/>
+          <w:bottom w:val="none" w:sz="0" w:space="0" w:color="FFFFFF"/>
+          <w:right w:val="none" w:sz="0" w:space="0" w:color="FFFFFF"/>
+          <w:insideH w:val="none" w:sz="0" w:space="0" w:color="FFFFFF"/>
+          <w:insideV w:val="none" w:sz="0" w:space="0" w:color="FFFFFF"/>
+        </w:tblBorders>
+      </w:tblPr>
+      <w:tblGrid>
+        <w:gridCol w:w="5020"/>
+        <w:gridCol w:w="5020"/>
+      </w:tblGrid>
+      <w:tr>
+        <w:tc>
+          <w:tcPr>
+            <w:tcW w:type="dxa" w:w="776"/>
+            <w:shd w:fill="0E7C7B"/>
+            <w:tcMar>
+              <w:top w:w="70" w:type="dxa"/>
+              <w:bottom w:w="70" w:type="dxa"/>
+              <w:left w:w="40" w:type="dxa"/>
+              <w:right w:w="40" w:type="dxa"/>
+            </w:tcMar>
+          </w:tcPr>
+          <w:p>
+            <w:pPr>
+              <w:jc w:val="center"/>
+            </w:pPr>
+            <w:r>
+              <w:rPr>
+                <w:rFonts w:ascii="Arial" w:hAnsi="Arial"/>
+                <w:b/>
+                <w:color w:val="FFFFFF"/>
+                <w:sz w:val="26"/>
+              </w:rPr>
+              <w:t>7</w:t>
+            </w:r>
+          </w:p>
+        </w:tc>
+        <w:tc>
+          <w:tcPr>
+            <w:tcW w:type="dxa" w:w="8930"/>
+            <w:shd w:fill="F2F5F7"/>
+            <w:tcMar>
+              <w:top w:w="70" w:type="dxa"/>
+              <w:bottom w:w="70" w:type="dxa"/>
+              <w:left w:w="120" w:type="dxa"/>
+              <w:right w:w="100" w:type="dxa"/>
+            </w:tcMar>
+          </w:tcPr>
+          <w:p>
+            <w:r>
+              <w:rPr>
+                <w:rFonts w:ascii="Arial" w:hAnsi="Arial"/>
+                <w:b/>
+                <w:color w:val="1F2A44"/>
+                <w:sz w:val="26"/>
+              </w:rPr>
+              <w:t>Herramientas tecnológicas y justificación</w:t>
+            </w:r>
+          </w:p>
+        </w:tc>
+      </w:tr>
+    </w:tbl>
+    <w:p>
+      <w:pPr>
+        <w:spacing w:before="0" w:after="80"/>
+      </w:pPr>
+    </w:p>
+    <w:tbl>
+      <w:tblPr>
+        <w:tblW w:type="auto" w:w="0"/>
+        <w:jc w:val="center"/>
+        <w:tblLook w:firstColumn="1" w:firstRow="1" w:lastColumn="0" w:lastRow="0" w:noHBand="0" w:noVBand="1" w:val="04A0"/>
+        <w:tblBorders>
+          <w:top w:val="single" w:sz="4" w:space="0" w:color="D3D3D3"/>
+          <w:left w:val="single" w:sz="4" w:space="0" w:color="D3D3D3"/>
+          <w:bottom w:val="single" w:sz="4" w:space="0" w:color="D3D3D3"/>
+          <w:right w:val="single" w:sz="4" w:space="0" w:color="D3D3D3"/>
+          <w:insideH w:val="single" w:sz="4" w:space="0" w:color="D3D3D3"/>
+          <w:insideV w:val="single" w:sz="4" w:space="0" w:color="D3D3D3"/>
+        </w:tblBorders>
+      </w:tblPr>
+      <w:tblGrid>
+        <w:gridCol w:w="3347"/>
+        <w:gridCol w:w="3347"/>
+        <w:gridCol w:w="3347"/>
+      </w:tblGrid>
+      <w:tr>
+        <w:tc>
+          <w:tcPr>
+            <w:tcW w:type="dxa" w:w="3347"/>
+            <w:shd w:fill="0E7C7B"/>
+            <w:tcMar>
+              <w:top w:w="50" w:type="dxa"/>
+              <w:bottom w:w="50" w:type="dxa"/>
               <w:left w:w="80" w:type="dxa"/>
               <w:right w:w="80" w:type="dxa"/>
             </w:tcMar>
@@ -1871,19 +3031,19 @@
                 <w:rFonts w:ascii="Arial" w:hAnsi="Arial"/>
                 <w:b/>
                 <w:color w:val="FFFFFF"/>
-                <w:sz w:val="17"/>
+                <w:sz w:val="18"/>
               </w:rPr>
-              <w:t>Miembro del equipo</w:t>
+              <w:t>Tecnología</w:t>
             </w:r>
           </w:p>
         </w:tc>
         <w:tc>
           <w:tcPr>
-            <w:tcW w:type="dxa" w:w="3360"/>
-            <w:shd w:fill="1F497D"/>
+            <w:tcW w:type="dxa" w:w="3347"/>
+            <w:shd w:fill="0E7C7B"/>
             <w:tcMar>
-              <w:top w:w="60" w:type="dxa"/>
-              <w:bottom w:w="60" w:type="dxa"/>
+              <w:top w:w="50" w:type="dxa"/>
+              <w:bottom w:w="50" w:type="dxa"/>
               <w:left w:w="80" w:type="dxa"/>
               <w:right w:w="80" w:type="dxa"/>
             </w:tcMar>
@@ -1894,19 +3054,19 @@
                 <w:rFonts w:ascii="Arial" w:hAnsi="Arial"/>
                 <w:b/>
                 <w:color w:val="FFFFFF"/>
-                <w:sz w:val="17"/>
+                <w:sz w:val="18"/>
               </w:rPr>
-              <w:t>Rol en el proyecto</w:t>
+              <w:t>Función en el proyecto</w:t>
             </w:r>
           </w:p>
         </w:tc>
         <w:tc>
           <w:tcPr>
-            <w:tcW w:type="dxa" w:w="3360"/>
-            <w:shd w:fill="1F497D"/>
+            <w:tcW w:type="dxa" w:w="3347"/>
+            <w:shd w:fill="0E7C7B"/>
             <w:tcMar>
-              <w:top w:w="60" w:type="dxa"/>
-              <w:bottom w:w="60" w:type="dxa"/>
+              <w:top w:w="50" w:type="dxa"/>
+              <w:bottom w:w="50" w:type="dxa"/>
               <w:left w:w="80" w:type="dxa"/>
               <w:right w:w="80" w:type="dxa"/>
             </w:tcMar>
@@ -1917,9 +3077,9 @@
                 <w:rFonts w:ascii="Arial" w:hAnsi="Arial"/>
                 <w:b/>
                 <w:color w:val="FFFFFF"/>
-                <w:sz w:val="17"/>
+                <w:sz w:val="18"/>
               </w:rPr>
-              <w:t>Tareas principales realizadas</w:t>
+              <w:t>Justificación técnica de selección</w:t>
             </w:r>
           </w:p>
         </w:tc>
@@ -1927,11 +3087,512 @@
       <w:tr>
         <w:tc>
           <w:tcPr>
-            <w:tcW w:type="dxa" w:w="3360"/>
-            <w:shd w:fill="F2F5F9"/>
+            <w:tcW w:type="dxa" w:w="3347"/>
+            <w:shd w:fill="F2F5F7"/>
+            <w:tcMar>
+              <w:top w:w="45" w:type="dxa"/>
+              <w:bottom w:w="45" w:type="dxa"/>
+              <w:left w:w="80" w:type="dxa"/>
+              <w:right w:w="80" w:type="dxa"/>
+            </w:tcMar>
+          </w:tcPr>
+          <w:p>
+            <w:r>
+              <w:rPr>
+                <w:rFonts w:ascii="Arial" w:hAnsi="Arial"/>
+                <w:b/>
+                <w:sz w:val="17"/>
+              </w:rPr>
+              <w:t>Python + Pandas / Statsmodels</w:t>
+            </w:r>
+          </w:p>
+        </w:tc>
+        <w:tc>
+          <w:tcPr>
+            <w:tcW w:type="dxa" w:w="3347"/>
+            <w:shd w:fill="F2F5F7"/>
+            <w:tcMar>
+              <w:top w:w="45" w:type="dxa"/>
+              <w:bottom w:w="45" w:type="dxa"/>
+              <w:left w:w="80" w:type="dxa"/>
+              <w:right w:w="80" w:type="dxa"/>
+            </w:tcMar>
+          </w:tcPr>
+          <w:p>
+            <w:r>
+              <w:rPr>
+                <w:rFonts w:ascii="Arial" w:hAnsi="Arial"/>
+                <w:sz w:val="17"/>
+              </w:rPr>
+              <w:t>ETL, limpieza y regresión cuasiexperimental.</w:t>
+            </w:r>
+          </w:p>
+        </w:tc>
+        <w:tc>
+          <w:tcPr>
+            <w:tcW w:type="dxa" w:w="3347"/>
+            <w:shd w:fill="F2F5F7"/>
+            <w:tcMar>
+              <w:top w:w="45" w:type="dxa"/>
+              <w:bottom w:w="45" w:type="dxa"/>
+              <w:left w:w="80" w:type="dxa"/>
+              <w:right w:w="80" w:type="dxa"/>
+            </w:tcMar>
+          </w:tcPr>
+          <w:p>
+            <w:r>
+              <w:rPr>
+                <w:rFonts w:ascii="Arial" w:hAnsi="Arial"/>
+                <w:sz w:val="17"/>
+              </w:rPr>
+              <w:t>Procesamiento vectorizado en memoria y cálculo de errores estándar robustos a heterocedasticidad.</w:t>
+            </w:r>
+          </w:p>
+        </w:tc>
+      </w:tr>
+      <w:tr>
+        <w:tc>
+          <w:tcPr>
+            <w:tcW w:type="dxa" w:w="3347"/>
+            <w:shd w:fill="FFFFFF"/>
+            <w:tcMar>
+              <w:top w:w="45" w:type="dxa"/>
+              <w:bottom w:w="45" w:type="dxa"/>
+              <w:left w:w="80" w:type="dxa"/>
+              <w:right w:w="80" w:type="dxa"/>
+            </w:tcMar>
+          </w:tcPr>
+          <w:p>
+            <w:r>
+              <w:rPr>
+                <w:rFonts w:ascii="Arial" w:hAnsi="Arial"/>
+                <w:b/>
+                <w:sz w:val="17"/>
+              </w:rPr>
+              <w:t>InfluxDB 2.9 (TSDB)</w:t>
+            </w:r>
+          </w:p>
+        </w:tc>
+        <w:tc>
+          <w:tcPr>
+            <w:tcW w:type="dxa" w:w="3347"/>
+            <w:shd w:fill="FFFFFF"/>
+            <w:tcMar>
+              <w:top w:w="45" w:type="dxa"/>
+              <w:bottom w:w="45" w:type="dxa"/>
+              <w:left w:w="80" w:type="dxa"/>
+              <w:right w:w="80" w:type="dxa"/>
+            </w:tcMar>
+          </w:tcPr>
+          <w:p>
+            <w:r>
+              <w:rPr>
+                <w:rFonts w:ascii="Arial" w:hAnsi="Arial"/>
+                <w:sz w:val="17"/>
+              </w:rPr>
+              <w:t>Almacén de series temporales de alta frecuencia.</w:t>
+            </w:r>
+          </w:p>
+        </w:tc>
+        <w:tc>
+          <w:tcPr>
+            <w:tcW w:type="dxa" w:w="3347"/>
+            <w:shd w:fill="FFFFFF"/>
+            <w:tcMar>
+              <w:top w:w="45" w:type="dxa"/>
+              <w:bottom w:w="45" w:type="dxa"/>
+              <w:left w:w="80" w:type="dxa"/>
+              <w:right w:w="80" w:type="dxa"/>
+            </w:tcMar>
+          </w:tcPr>
+          <w:p>
+            <w:r>
+              <w:rPr>
+                <w:rFonts w:ascii="Arial" w:hAnsi="Arial"/>
+                <w:sz w:val="17"/>
+              </w:rPr>
+              <w:t>Motor columnar TSM optimizado para consultas de tiempo y retención automatizada por bucket.</w:t>
+            </w:r>
+          </w:p>
+        </w:tc>
+      </w:tr>
+      <w:tr>
+        <w:tc>
+          <w:tcPr>
+            <w:tcW w:type="dxa" w:w="3347"/>
+            <w:shd w:fill="F2F5F7"/>
+            <w:tcMar>
+              <w:top w:w="45" w:type="dxa"/>
+              <w:bottom w:w="45" w:type="dxa"/>
+              <w:left w:w="80" w:type="dxa"/>
+              <w:right w:w="80" w:type="dxa"/>
+            </w:tcMar>
+          </w:tcPr>
+          <w:p>
+            <w:r>
+              <w:rPr>
+                <w:rFonts w:ascii="Arial" w:hAnsi="Arial"/>
+                <w:b/>
+                <w:sz w:val="17"/>
+              </w:rPr>
+              <w:t>Node-RED</w:t>
+            </w:r>
+          </w:p>
+        </w:tc>
+        <w:tc>
+          <w:tcPr>
+            <w:tcW w:type="dxa" w:w="3347"/>
+            <w:shd w:fill="F2F5F7"/>
+            <w:tcMar>
+              <w:top w:w="45" w:type="dxa"/>
+              <w:bottom w:w="45" w:type="dxa"/>
+              <w:left w:w="80" w:type="dxa"/>
+              <w:right w:w="80" w:type="dxa"/>
+            </w:tcMar>
+          </w:tcPr>
+          <w:p>
+            <w:r>
+              <w:rPr>
+                <w:rFonts w:ascii="Arial" w:hAnsi="Arial"/>
+                <w:sz w:val="17"/>
+              </w:rPr>
+              <w:t>Orquestador de flujos en tiempo real.</w:t>
+            </w:r>
+          </w:p>
+        </w:tc>
+        <w:tc>
+          <w:tcPr>
+            <w:tcW w:type="dxa" w:w="3347"/>
+            <w:shd w:fill="F2F5F7"/>
+            <w:tcMar>
+              <w:top w:w="45" w:type="dxa"/>
+              <w:bottom w:w="45" w:type="dxa"/>
+              <w:left w:w="80" w:type="dxa"/>
+              <w:right w:w="80" w:type="dxa"/>
+            </w:tcMar>
+          </w:tcPr>
+          <w:p>
+            <w:r>
+              <w:rPr>
+                <w:rFonts w:ascii="Arial" w:hAnsi="Arial"/>
+                <w:sz w:val="17"/>
+              </w:rPr>
+              <w:t>Gestión tolerante a fallos para consultar APIs externas y conversión nativa a Line Protocol.</w:t>
+            </w:r>
+          </w:p>
+        </w:tc>
+      </w:tr>
+      <w:tr>
+        <w:tc>
+          <w:tcPr>
+            <w:tcW w:type="dxa" w:w="3347"/>
+            <w:shd w:fill="FFFFFF"/>
+            <w:tcMar>
+              <w:top w:w="45" w:type="dxa"/>
+              <w:bottom w:w="45" w:type="dxa"/>
+              <w:left w:w="80" w:type="dxa"/>
+              <w:right w:w="80" w:type="dxa"/>
+            </w:tcMar>
+          </w:tcPr>
+          <w:p>
+            <w:r>
+              <w:rPr>
+                <w:rFonts w:ascii="Arial" w:hAnsi="Arial"/>
+                <w:b/>
+                <w:sz w:val="17"/>
+              </w:rPr>
+              <w:t>Grafana 11.2</w:t>
+            </w:r>
+          </w:p>
+        </w:tc>
+        <w:tc>
+          <w:tcPr>
+            <w:tcW w:type="dxa" w:w="3347"/>
+            <w:shd w:fill="FFFFFF"/>
+            <w:tcMar>
+              <w:top w:w="45" w:type="dxa"/>
+              <w:bottom w:w="45" w:type="dxa"/>
+              <w:left w:w="80" w:type="dxa"/>
+              <w:right w:w="80" w:type="dxa"/>
+            </w:tcMar>
+          </w:tcPr>
+          <w:p>
+            <w:r>
+              <w:rPr>
+                <w:rFonts w:ascii="Arial" w:hAnsi="Arial"/>
+                <w:sz w:val="17"/>
+              </w:rPr>
+              <w:t>Cuadros de mando y control de acceso (RBAC).</w:t>
+            </w:r>
+          </w:p>
+        </w:tc>
+        <w:tc>
+          <w:tcPr>
+            <w:tcW w:type="dxa" w:w="3347"/>
+            <w:shd w:fill="FFFFFF"/>
+            <w:tcMar>
+              <w:top w:w="45" w:type="dxa"/>
+              <w:bottom w:w="45" w:type="dxa"/>
+              <w:left w:w="80" w:type="dxa"/>
+              <w:right w:w="80" w:type="dxa"/>
+            </w:tcMar>
+          </w:tcPr>
+          <w:p>
+            <w:r>
+              <w:rPr>
+                <w:rFonts w:ascii="Arial" w:hAnsi="Arial"/>
+                <w:sz w:val="17"/>
+              </w:rPr>
+              <w:t>Soporte de consultas Flux, reglas de alerta automáticas y segregación de perfiles por equipos.</w:t>
+            </w:r>
+          </w:p>
+        </w:tc>
+      </w:tr>
+      <w:tr>
+        <w:tc>
+          <w:tcPr>
+            <w:tcW w:type="dxa" w:w="3347"/>
+            <w:shd w:fill="F2F5F7"/>
+            <w:tcMar>
+              <w:top w:w="45" w:type="dxa"/>
+              <w:bottom w:w="45" w:type="dxa"/>
+              <w:left w:w="80" w:type="dxa"/>
+              <w:right w:w="80" w:type="dxa"/>
+            </w:tcMar>
+          </w:tcPr>
+          <w:p>
+            <w:r>
+              <w:rPr>
+                <w:rFonts w:ascii="Arial" w:hAnsi="Arial"/>
+                <w:b/>
+                <w:sz w:val="17"/>
+              </w:rPr>
+              <w:t>InfluxDB MCP Server</w:t>
+            </w:r>
+          </w:p>
+        </w:tc>
+        <w:tc>
+          <w:tcPr>
+            <w:tcW w:type="dxa" w:w="3347"/>
+            <w:shd w:fill="F2F5F7"/>
+            <w:tcMar>
+              <w:top w:w="45" w:type="dxa"/>
+              <w:bottom w:w="45" w:type="dxa"/>
+              <w:left w:w="80" w:type="dxa"/>
+              <w:right w:w="80" w:type="dxa"/>
+            </w:tcMar>
+          </w:tcPr>
+          <w:p>
+            <w:r>
+              <w:rPr>
+                <w:rFonts w:ascii="Arial" w:hAnsi="Arial"/>
+                <w:sz w:val="17"/>
+              </w:rPr>
+              <w:t>Interfaz Model Context Protocol en solo lectura.</w:t>
+            </w:r>
+          </w:p>
+        </w:tc>
+        <w:tc>
+          <w:tcPr>
+            <w:tcW w:type="dxa" w:w="3347"/>
+            <w:shd w:fill="F2F5F7"/>
+            <w:tcMar>
+              <w:top w:w="45" w:type="dxa"/>
+              <w:bottom w:w="45" w:type="dxa"/>
+              <w:left w:w="80" w:type="dxa"/>
+              <w:right w:w="80" w:type="dxa"/>
+            </w:tcMar>
+          </w:tcPr>
+          <w:p>
+            <w:r>
+              <w:rPr>
+                <w:rFonts w:ascii="Arial" w:hAnsi="Arial"/>
+                <w:sz w:val="17"/>
+              </w:rPr>
+              <w:t>Permite a agentes de lenguaje interrogar los buckets de InfluxDB mediante herramientas seguras.</w:t>
+            </w:r>
+          </w:p>
+        </w:tc>
+      </w:tr>
+    </w:tbl>
+    <w:p>
+      <w:pPr>
+        <w:spacing w:after="80"/>
+      </w:pPr>
+    </w:p>
+    <w:tbl>
+      <w:tblPr>
+        <w:tblW w:type="auto" w:w="0"/>
+        <w:jc w:val="center"/>
+        <w:tblLook w:firstColumn="1" w:firstRow="1" w:lastColumn="0" w:lastRow="0" w:noHBand="0" w:noVBand="1" w:val="04A0"/>
+        <w:tblBorders>
+          <w:top w:val="none" w:sz="0" w:space="0" w:color="FFFFFF"/>
+          <w:left w:val="none" w:sz="0" w:space="0" w:color="FFFFFF"/>
+          <w:bottom w:val="none" w:sz="0" w:space="0" w:color="FFFFFF"/>
+          <w:right w:val="none" w:sz="0" w:space="0" w:color="FFFFFF"/>
+          <w:insideH w:val="none" w:sz="0" w:space="0" w:color="FFFFFF"/>
+          <w:insideV w:val="none" w:sz="0" w:space="0" w:color="FFFFFF"/>
+        </w:tblBorders>
+      </w:tblPr>
+      <w:tblGrid>
+        <w:gridCol w:w="5020"/>
+        <w:gridCol w:w="5020"/>
+      </w:tblGrid>
+      <w:tr>
+        <w:tc>
+          <w:tcPr>
+            <w:tcW w:type="dxa" w:w="776"/>
+            <w:shd w:fill="0E7C7B"/>
+            <w:tcMar>
+              <w:top w:w="70" w:type="dxa"/>
+              <w:bottom w:w="70" w:type="dxa"/>
+              <w:left w:w="40" w:type="dxa"/>
+              <w:right w:w="40" w:type="dxa"/>
+            </w:tcMar>
+          </w:tcPr>
+          <w:p>
+            <w:pPr>
+              <w:jc w:val="center"/>
+            </w:pPr>
+            <w:r>
+              <w:rPr>
+                <w:rFonts w:ascii="Arial" w:hAnsi="Arial"/>
+                <w:b/>
+                <w:color w:val="FFFFFF"/>
+                <w:sz w:val="26"/>
+              </w:rPr>
+              <w:t>8</w:t>
+            </w:r>
+          </w:p>
+        </w:tc>
+        <w:tc>
+          <w:tcPr>
+            <w:tcW w:type="dxa" w:w="8930"/>
+            <w:shd w:fill="F2F5F7"/>
+            <w:tcMar>
+              <w:top w:w="70" w:type="dxa"/>
+              <w:bottom w:w="70" w:type="dxa"/>
+              <w:left w:w="120" w:type="dxa"/>
+              <w:right w:w="100" w:type="dxa"/>
+            </w:tcMar>
+          </w:tcPr>
+          <w:p>
+            <w:r>
+              <w:rPr>
+                <w:rFonts w:ascii="Arial" w:hAnsi="Arial"/>
+                <w:b/>
+                <w:color w:val="1F2A44"/>
+                <w:sz w:val="26"/>
+              </w:rPr>
+              <w:t>Organización del trabajo y responsabilidades (Matriz RACI)</w:t>
+            </w:r>
+          </w:p>
+        </w:tc>
+      </w:tr>
+    </w:tbl>
+    <w:p>
+      <w:pPr>
+        <w:spacing w:before="0" w:after="80"/>
+      </w:pPr>
+    </w:p>
+    <w:tbl>
+      <w:tblPr>
+        <w:tblW w:type="auto" w:w="0"/>
+        <w:jc w:val="center"/>
+        <w:tblLook w:firstColumn="1" w:firstRow="1" w:lastColumn="0" w:lastRow="0" w:noHBand="0" w:noVBand="1" w:val="04A0"/>
+        <w:tblBorders>
+          <w:top w:val="single" w:sz="4" w:space="0" w:color="D3D3D3"/>
+          <w:left w:val="single" w:sz="4" w:space="0" w:color="D3D3D3"/>
+          <w:bottom w:val="single" w:sz="4" w:space="0" w:color="D3D3D3"/>
+          <w:right w:val="single" w:sz="4" w:space="0" w:color="D3D3D3"/>
+          <w:insideH w:val="single" w:sz="4" w:space="0" w:color="D3D3D3"/>
+          <w:insideV w:val="single" w:sz="4" w:space="0" w:color="D3D3D3"/>
+        </w:tblBorders>
+      </w:tblPr>
+      <w:tblGrid>
+        <w:gridCol w:w="3347"/>
+        <w:gridCol w:w="3347"/>
+        <w:gridCol w:w="3347"/>
+      </w:tblGrid>
+      <w:tr>
+        <w:tc>
+          <w:tcPr>
+            <w:tcW w:type="dxa" w:w="3347"/>
+            <w:shd w:fill="0E7C7B"/>
             <w:tcMar>
               <w:top w:w="50" w:type="dxa"/>
               <w:bottom w:w="50" w:type="dxa"/>
+              <w:left w:w="80" w:type="dxa"/>
+              <w:right w:w="80" w:type="dxa"/>
+            </w:tcMar>
+          </w:tcPr>
+          <w:p>
+            <w:r>
+              <w:rPr>
+                <w:rFonts w:ascii="Arial" w:hAnsi="Arial"/>
+                <w:b/>
+                <w:color w:val="FFFFFF"/>
+                <w:sz w:val="18"/>
+              </w:rPr>
+              <w:t>Miembro del equipo</w:t>
+            </w:r>
+          </w:p>
+        </w:tc>
+        <w:tc>
+          <w:tcPr>
+            <w:tcW w:type="dxa" w:w="3347"/>
+            <w:shd w:fill="0E7C7B"/>
+            <w:tcMar>
+              <w:top w:w="50" w:type="dxa"/>
+              <w:bottom w:w="50" w:type="dxa"/>
+              <w:left w:w="80" w:type="dxa"/>
+              <w:right w:w="80" w:type="dxa"/>
+            </w:tcMar>
+          </w:tcPr>
+          <w:p>
+            <w:r>
+              <w:rPr>
+                <w:rFonts w:ascii="Arial" w:hAnsi="Arial"/>
+                <w:b/>
+                <w:color w:val="FFFFFF"/>
+                <w:sz w:val="18"/>
+              </w:rPr>
+              <w:t>Rol en el proyecto</w:t>
+            </w:r>
+          </w:p>
+        </w:tc>
+        <w:tc>
+          <w:tcPr>
+            <w:tcW w:type="dxa" w:w="3347"/>
+            <w:shd w:fill="0E7C7B"/>
+            <w:tcMar>
+              <w:top w:w="50" w:type="dxa"/>
+              <w:bottom w:w="50" w:type="dxa"/>
+              <w:left w:w="80" w:type="dxa"/>
+              <w:right w:w="80" w:type="dxa"/>
+            </w:tcMar>
+          </w:tcPr>
+          <w:p>
+            <w:r>
+              <w:rPr>
+                <w:rFonts w:ascii="Arial" w:hAnsi="Arial"/>
+                <w:b/>
+                <w:color w:val="FFFFFF"/>
+                <w:sz w:val="18"/>
+              </w:rPr>
+              <w:t>Tareas principales asumidas</w:t>
+            </w:r>
+          </w:p>
+        </w:tc>
+      </w:tr>
+      <w:tr>
+        <w:tc>
+          <w:tcPr>
+            <w:tcW w:type="dxa" w:w="3347"/>
+            <w:shd w:fill="F2F5F7"/>
+            <w:tcMar>
+              <w:top w:w="45" w:type="dxa"/>
+              <w:bottom w:w="45" w:type="dxa"/>
               <w:left w:w="80" w:type="dxa"/>
               <w:right w:w="80" w:type="dxa"/>
             </w:tcMar>
@@ -1949,11 +3610,11 @@
         </w:tc>
         <w:tc>
           <w:tcPr>
-            <w:tcW w:type="dxa" w:w="3360"/>
-            <w:shd w:fill="F2F5F9"/>
+            <w:tcW w:type="dxa" w:w="3347"/>
+            <w:shd w:fill="F2F5F7"/>
             <w:tcMar>
-              <w:top w:w="50" w:type="dxa"/>
-              <w:bottom w:w="50" w:type="dxa"/>
+              <w:top w:w="45" w:type="dxa"/>
+              <w:bottom w:w="45" w:type="dxa"/>
               <w:left w:w="80" w:type="dxa"/>
               <w:right w:w="80" w:type="dxa"/>
             </w:tcMar>
@@ -1970,11 +3631,11 @@
         </w:tc>
         <w:tc>
           <w:tcPr>
-            <w:tcW w:type="dxa" w:w="3360"/>
-            <w:shd w:fill="F2F5F9"/>
+            <w:tcW w:type="dxa" w:w="3347"/>
+            <w:shd w:fill="F2F5F7"/>
             <w:tcMar>
-              <w:top w:w="50" w:type="dxa"/>
-              <w:bottom w:w="50" w:type="dxa"/>
+              <w:top w:w="45" w:type="dxa"/>
+              <w:bottom w:w="45" w:type="dxa"/>
               <w:left w:w="80" w:type="dxa"/>
               <w:right w:w="80" w:type="dxa"/>
             </w:tcMar>
@@ -1985,7 +3646,7 @@
                 <w:rFonts w:ascii="Arial" w:hAnsi="Arial"/>
                 <w:sz w:val="17"/>
               </w:rPr>
-              <w:t>Pipeline de descarga e integración (descargar_y_limpiar.py), modelo Diff-in-Diff y cuaderno Jupyter.</w:t>
+              <w:t>Pipeline de descarga (descargar_y_limpiar.py), estimación Diff-in-Diff y cuaderno Jupyter zbe_bilbao.ipynb.</w:t>
             </w:r>
           </w:p>
         </w:tc>
@@ -1993,11 +3654,11 @@
       <w:tr>
         <w:tc>
           <w:tcPr>
-            <w:tcW w:type="dxa" w:w="3360"/>
+            <w:tcW w:type="dxa" w:w="3347"/>
             <w:shd w:fill="FFFFFF"/>
             <w:tcMar>
-              <w:top w:w="50" w:type="dxa"/>
-              <w:bottom w:w="50" w:type="dxa"/>
+              <w:top w:w="45" w:type="dxa"/>
+              <w:bottom w:w="45" w:type="dxa"/>
               <w:left w:w="80" w:type="dxa"/>
               <w:right w:w="80" w:type="dxa"/>
             </w:tcMar>
@@ -2015,11 +3676,11 @@
         </w:tc>
         <w:tc>
           <w:tcPr>
-            <w:tcW w:type="dxa" w:w="3360"/>
+            <w:tcW w:type="dxa" w:w="3347"/>
             <w:shd w:fill="FFFFFF"/>
             <w:tcMar>
-              <w:top w:w="50" w:type="dxa"/>
-              <w:bottom w:w="50" w:type="dxa"/>
+              <w:top w:w="45" w:type="dxa"/>
+              <w:bottom w:w="45" w:type="dxa"/>
               <w:left w:w="80" w:type="dxa"/>
               <w:right w:w="80" w:type="dxa"/>
             </w:tcMar>
@@ -2036,11 +3697,11 @@
         </w:tc>
         <w:tc>
           <w:tcPr>
-            <w:tcW w:type="dxa" w:w="3360"/>
+            <w:tcW w:type="dxa" w:w="3347"/>
             <w:shd w:fill="FFFFFF"/>
             <w:tcMar>
-              <w:top w:w="50" w:type="dxa"/>
-              <w:bottom w:w="50" w:type="dxa"/>
+              <w:top w:w="45" w:type="dxa"/>
+              <w:bottom w:w="45" w:type="dxa"/>
               <w:left w:w="80" w:type="dxa"/>
               <w:right w:w="80" w:type="dxa"/>
             </w:tcMar>
@@ -2051,7 +3712,7 @@
                 <w:rFonts w:ascii="Arial" w:hAnsi="Arial"/>
                 <w:sz w:val="17"/>
               </w:rPr>
-              <w:t>Control de anomalías, diseño de visualizaciones (g1 a g10), contraste de aforos y síntesis del informe de 4 páginas.</w:t>
+              <w:t>Control de calidad, diseño de figuras (g1 a g10), análisis de aforos y redacción del informe de 4 páginas.</w:t>
             </w:r>
           </w:p>
         </w:tc>
@@ -2059,11 +3720,11 @@
       <w:tr>
         <w:tc>
           <w:tcPr>
-            <w:tcW w:type="dxa" w:w="3360"/>
-            <w:shd w:fill="F2F5F9"/>
+            <w:tcW w:type="dxa" w:w="3347"/>
+            <w:shd w:fill="F2F5F7"/>
             <w:tcMar>
-              <w:top w:w="50" w:type="dxa"/>
-              <w:bottom w:w="50" w:type="dxa"/>
+              <w:top w:w="45" w:type="dxa"/>
+              <w:bottom w:w="45" w:type="dxa"/>
               <w:left w:w="80" w:type="dxa"/>
               <w:right w:w="80" w:type="dxa"/>
             </w:tcMar>
@@ -2081,11 +3742,11 @@
         </w:tc>
         <w:tc>
           <w:tcPr>
-            <w:tcW w:type="dxa" w:w="3360"/>
-            <w:shd w:fill="F2F5F9"/>
+            <w:tcW w:type="dxa" w:w="3347"/>
+            <w:shd w:fill="F2F5F7"/>
             <w:tcMar>
-              <w:top w:w="50" w:type="dxa"/>
-              <w:bottom w:w="50" w:type="dxa"/>
+              <w:top w:w="45" w:type="dxa"/>
+              <w:bottom w:w="45" w:type="dxa"/>
               <w:left w:w="80" w:type="dxa"/>
               <w:right w:w="80" w:type="dxa"/>
             </w:tcMar>
@@ -2102,11 +3763,11 @@
         </w:tc>
         <w:tc>
           <w:tcPr>
-            <w:tcW w:type="dxa" w:w="3360"/>
-            <w:shd w:fill="F2F5F9"/>
+            <w:tcW w:type="dxa" w:w="3347"/>
+            <w:shd w:fill="F2F5F7"/>
             <w:tcMar>
-              <w:top w:w="50" w:type="dxa"/>
-              <w:bottom w:w="50" w:type="dxa"/>
+              <w:top w:w="45" w:type="dxa"/>
+              <w:bottom w:w="45" w:type="dxa"/>
               <w:left w:w="80" w:type="dxa"/>
               <w:right w:w="80" w:type="dxa"/>
             </w:tcMar>
@@ -2117,20 +3778,463 @@
                 <w:rFonts w:ascii="Arial" w:hAnsi="Arial"/>
                 <w:sz w:val="17"/>
               </w:rPr>
-              <w:t>Despliegue multicontenedor Docker Compose, buckets y tokens en InfluxDB, flujos Node-RED y cuadro de mando de Grafana.</w:t>
+              <w:t>Despliegue Docker Compose, buckets y tokens en InfluxDB, flujos Node-RED, servicio MCP y paneles Grafana.</w:t>
             </w:r>
           </w:p>
         </w:tc>
       </w:tr>
     </w:tbl>
+    <w:p>
+      <w:pPr>
+        <w:spacing w:after="80"/>
+      </w:pPr>
+    </w:p>
+    <w:p>
+      <w:pPr>
+        <w:spacing w:before="80" w:after="40"/>
+      </w:pPr>
+      <w:r>
+        <w:rPr>
+          <w:rFonts w:ascii="Arial" w:hAnsi="Arial"/>
+          <w:b/>
+          <w:color w:val="1F2A44"/>
+          <w:sz w:val="21"/>
+        </w:rPr>
+        <w:t>Checklist de verificación de la rúbrica oficial (SBD / Reto 0)</w:t>
+      </w:r>
+    </w:p>
+    <w:tbl>
+      <w:tblPr>
+        <w:tblW w:type="auto" w:w="0"/>
+        <w:jc w:val="center"/>
+        <w:tblLook w:firstColumn="1" w:firstRow="1" w:lastColumn="0" w:lastRow="0" w:noHBand="0" w:noVBand="1" w:val="04A0"/>
+        <w:tblBorders>
+          <w:top w:val="none" w:sz="0" w:space="0" w:color="FFFFFF"/>
+          <w:left w:val="none" w:sz="0" w:space="0" w:color="FFFFFF"/>
+          <w:bottom w:val="none" w:sz="0" w:space="0" w:color="FFFFFF"/>
+          <w:right w:val="none" w:sz="0" w:space="0" w:color="FFFFFF"/>
+          <w:insideH w:val="none" w:sz="0" w:space="0" w:color="FFFFFF"/>
+          <w:insideV w:val="none" w:sz="0" w:space="0" w:color="FFFFFF"/>
+        </w:tblBorders>
+      </w:tblPr>
+      <w:tblGrid>
+        <w:gridCol w:w="3347"/>
+        <w:gridCol w:w="3347"/>
+        <w:gridCol w:w="3347"/>
+      </w:tblGrid>
+      <w:tr>
+        <w:tc>
+          <w:tcPr>
+            <w:tcW w:type="dxa" w:w="3234"/>
+            <w:tcMar>
+              <w:top w:w="30" w:type="dxa"/>
+              <w:bottom w:w="30" w:type="dxa"/>
+              <w:left w:w="40" w:type="dxa"/>
+              <w:right w:w="40" w:type="dxa"/>
+            </w:tcMar>
+          </w:tcPr>
+          <w:p>
+            <w:r>
+              <w:rPr>
+                <w:rFonts w:ascii="Arial" w:hAnsi="Arial"/>
+                <w:b/>
+                <w:color w:val="2B2F3A"/>
+                <w:sz w:val="17"/>
+              </w:rPr>
+              <w:t>☑ Contexto y 5 preguntas</w:t>
+              <w:tab/>
+            </w:r>
+            <w:r>
+              <w:rPr>
+                <w:rFonts w:ascii="Arial" w:hAnsi="Arial"/>
+                <w:color w:val="0E7C7B"/>
+                <w:sz w:val="16"/>
+              </w:rPr>
+              <w:t>AP. 1</w:t>
+            </w:r>
+          </w:p>
+        </w:tc>
+        <w:tc>
+          <w:tcPr>
+            <w:tcW w:type="dxa" w:w="3234"/>
+            <w:tcMar>
+              <w:top w:w="30" w:type="dxa"/>
+              <w:bottom w:w="30" w:type="dxa"/>
+              <w:left w:w="40" w:type="dxa"/>
+              <w:right w:w="40" w:type="dxa"/>
+            </w:tcMar>
+          </w:tcPr>
+          <w:p>
+            <w:r>
+              <w:rPr>
+                <w:rFonts w:ascii="Arial" w:hAnsi="Arial"/>
+                <w:b/>
+                <w:color w:val="2B2F3A"/>
+                <w:sz w:val="17"/>
+              </w:rPr>
+              <w:t>☑ Fuentes y auditoría calidad</w:t>
+              <w:tab/>
+            </w:r>
+            <w:r>
+              <w:rPr>
+                <w:rFonts w:ascii="Arial" w:hAnsi="Arial"/>
+                <w:color w:val="0E7C7B"/>
+                <w:sz w:val="16"/>
+              </w:rPr>
+              <w:t>AP. 2</w:t>
+            </w:r>
+          </w:p>
+        </w:tc>
+        <w:tc>
+          <w:tcPr>
+            <w:tcW w:type="dxa" w:w="3234"/>
+            <w:tcMar>
+              <w:top w:w="30" w:type="dxa"/>
+              <w:bottom w:w="30" w:type="dxa"/>
+              <w:left w:w="40" w:type="dxa"/>
+              <w:right w:w="40" w:type="dxa"/>
+            </w:tcMar>
+          </w:tcPr>
+          <w:p>
+            <w:r>
+              <w:rPr>
+                <w:rFonts w:ascii="Arial" w:hAnsi="Arial"/>
+                <w:b/>
+                <w:color w:val="2B2F3A"/>
+                <w:sz w:val="17"/>
+              </w:rPr>
+              <w:t>☑ Integración y pipeline</w:t>
+              <w:tab/>
+            </w:r>
+            <w:r>
+              <w:rPr>
+                <w:rFonts w:ascii="Arial" w:hAnsi="Arial"/>
+                <w:color w:val="0E7C7B"/>
+                <w:sz w:val="16"/>
+              </w:rPr>
+              <w:t>AP. 3</w:t>
+            </w:r>
+          </w:p>
+        </w:tc>
+      </w:tr>
+      <w:tr>
+        <w:tc>
+          <w:tcPr>
+            <w:tcW w:type="dxa" w:w="3234"/>
+            <w:tcMar>
+              <w:top w:w="30" w:type="dxa"/>
+              <w:bottom w:w="30" w:type="dxa"/>
+              <w:left w:w="40" w:type="dxa"/>
+              <w:right w:w="40" w:type="dxa"/>
+            </w:tcMar>
+          </w:tcPr>
+          <w:p>
+            <w:r>
+              <w:rPr>
+                <w:rFonts w:ascii="Arial" w:hAnsi="Arial"/>
+                <w:b/>
+                <w:color w:val="2B2F3A"/>
+                <w:sz w:val="17"/>
+              </w:rPr>
+              <w:t>☑ Resultados analíticos</w:t>
+              <w:tab/>
+            </w:r>
+            <w:r>
+              <w:rPr>
+                <w:rFonts w:ascii="Arial" w:hAnsi="Arial"/>
+                <w:color w:val="0E7C7B"/>
+                <w:sz w:val="16"/>
+              </w:rPr>
+              <w:t>AP. 4</w:t>
+            </w:r>
+          </w:p>
+        </w:tc>
+        <w:tc>
+          <w:tcPr>
+            <w:tcW w:type="dxa" w:w="3234"/>
+            <w:tcMar>
+              <w:top w:w="30" w:type="dxa"/>
+              <w:bottom w:w="30" w:type="dxa"/>
+              <w:left w:w="40" w:type="dxa"/>
+              <w:right w:w="40" w:type="dxa"/>
+            </w:tcMar>
+          </w:tcPr>
+          <w:p>
+            <w:r>
+              <w:rPr>
+                <w:rFonts w:ascii="Arial" w:hAnsi="Arial"/>
+                <w:b/>
+                <w:color w:val="2B2F3A"/>
+                <w:sz w:val="17"/>
+              </w:rPr>
+              <w:t>☑ Figuras con 3 partes</w:t>
+              <w:tab/>
+            </w:r>
+            <w:r>
+              <w:rPr>
+                <w:rFonts w:ascii="Arial" w:hAnsi="Arial"/>
+                <w:color w:val="0E7C7B"/>
+                <w:sz w:val="16"/>
+              </w:rPr>
+              <w:t>AP. 5</w:t>
+            </w:r>
+          </w:p>
+        </w:tc>
+        <w:tc>
+          <w:tcPr>
+            <w:tcW w:type="dxa" w:w="3234"/>
+            <w:tcMar>
+              <w:top w:w="30" w:type="dxa"/>
+              <w:bottom w:w="30" w:type="dxa"/>
+              <w:left w:w="40" w:type="dxa"/>
+              <w:right w:w="40" w:type="dxa"/>
+            </w:tcMar>
+          </w:tcPr>
+          <w:p>
+            <w:r>
+              <w:rPr>
+                <w:rFonts w:ascii="Arial" w:hAnsi="Arial"/>
+                <w:b/>
+                <w:color w:val="2B2F3A"/>
+                <w:sz w:val="17"/>
+              </w:rPr>
+              <w:t>☑ Conclusiones y recomendaciones</w:t>
+              <w:tab/>
+            </w:r>
+            <w:r>
+              <w:rPr>
+                <w:rFonts w:ascii="Arial" w:hAnsi="Arial"/>
+                <w:color w:val="0E7C7B"/>
+                <w:sz w:val="16"/>
+              </w:rPr>
+              <w:t>AP. 6</w:t>
+            </w:r>
+          </w:p>
+        </w:tc>
+      </w:tr>
+      <w:tr>
+        <w:tc>
+          <w:tcPr>
+            <w:tcW w:type="dxa" w:w="3234"/>
+            <w:tcMar>
+              <w:top w:w="30" w:type="dxa"/>
+              <w:bottom w:w="30" w:type="dxa"/>
+              <w:left w:w="40" w:type="dxa"/>
+              <w:right w:w="40" w:type="dxa"/>
+            </w:tcMar>
+          </w:tcPr>
+          <w:p>
+            <w:r>
+              <w:rPr>
+                <w:rFonts w:ascii="Arial" w:hAnsi="Arial"/>
+                <w:b/>
+                <w:color w:val="2B2F3A"/>
+                <w:sz w:val="17"/>
+              </w:rPr>
+              <w:t>☑ Justificación herramientas</w:t>
+              <w:tab/>
+            </w:r>
+            <w:r>
+              <w:rPr>
+                <w:rFonts w:ascii="Arial" w:hAnsi="Arial"/>
+                <w:color w:val="0E7C7B"/>
+                <w:sz w:val="16"/>
+              </w:rPr>
+              <w:t>AP. 7</w:t>
+            </w:r>
+          </w:p>
+        </w:tc>
+        <w:tc>
+          <w:tcPr>
+            <w:tcW w:type="dxa" w:w="3234"/>
+            <w:tcMar>
+              <w:top w:w="30" w:type="dxa"/>
+              <w:bottom w:w="30" w:type="dxa"/>
+              <w:left w:w="40" w:type="dxa"/>
+              <w:right w:w="40" w:type="dxa"/>
+            </w:tcMar>
+          </w:tcPr>
+          <w:p>
+            <w:r>
+              <w:rPr>
+                <w:rFonts w:ascii="Arial" w:hAnsi="Arial"/>
+                <w:b/>
+                <w:color w:val="2B2F3A"/>
+                <w:sz w:val="17"/>
+              </w:rPr>
+              <w:t>☑ Matriz RACI y Scrum</w:t>
+              <w:tab/>
+            </w:r>
+            <w:r>
+              <w:rPr>
+                <w:rFonts w:ascii="Arial" w:hAnsi="Arial"/>
+                <w:color w:val="0E7C7B"/>
+                <w:sz w:val="16"/>
+              </w:rPr>
+              <w:t>AP. 8</w:t>
+            </w:r>
+          </w:p>
+        </w:tc>
+        <w:tc>
+          <w:tcPr>
+            <w:tcW w:type="dxa" w:w="3234"/>
+            <w:tcMar>
+              <w:top w:w="30" w:type="dxa"/>
+              <w:bottom w:w="30" w:type="dxa"/>
+              <w:left w:w="40" w:type="dxa"/>
+              <w:right w:w="40" w:type="dxa"/>
+            </w:tcMar>
+          </w:tcPr>
+          <w:p>
+            <w:r>
+              <w:rPr>
+                <w:rFonts w:ascii="Arial" w:hAnsi="Arial"/>
+                <w:b/>
+                <w:color w:val="2B2F3A"/>
+                <w:sz w:val="17"/>
+              </w:rPr>
+              <w:t>☑ Servicio MCP integrado</w:t>
+              <w:tab/>
+            </w:r>
+            <w:r>
+              <w:rPr>
+                <w:rFonts w:ascii="Arial" w:hAnsi="Arial"/>
+                <w:color w:val="0E7C7B"/>
+                <w:sz w:val="16"/>
+              </w:rPr>
+              <w:t>AP. 7</w:t>
+            </w:r>
+          </w:p>
+        </w:tc>
+      </w:tr>
+    </w:tbl>
+    <w:p>
+      <w:pPr>
+        <w:spacing w:before="120" w:after="40"/>
+      </w:pPr>
+      <w:r>
+        <w:rPr>
+          <w:rFonts w:ascii="Arial" w:hAnsi="Arial"/>
+          <w:b/>
+          <w:color w:val="1F2A44"/>
+          <w:sz w:val="22"/>
+        </w:rPr>
+        <w:t>Conclusión</w:t>
+      </w:r>
+    </w:p>
+    <w:p>
+      <w:r>
+        <w:t>El análisis econométrico multivariable demuestra con rigor estadístico que la ZBE de Bilbao ha alcanzado un impacto neto favorable de -1,28 µg/m³ en la concentración interior de NO2. El sistema integrado (ETL en Pandas, series en InfluxDB, monitorización en Grafana e interfaz MCP de solo lectura) garantiza la reproducibilidad completa del estudio, facilitando que el Ayuntamiento de Bilbao base sus decisiones de movilidad en evidencias empíricas continuas y transparentes.</w:t>
+      </w:r>
+    </w:p>
+    <w:p>
+      <w:pPr>
+        <w:spacing w:before="80" w:after="40"/>
+      </w:pPr>
+      <w:r>
+        <w:rPr>
+          <w:rFonts w:ascii="Arial" w:hAnsi="Arial"/>
+          <w:b/>
+          <w:color w:val="1F2A44"/>
+          <w:sz w:val="22"/>
+        </w:rPr>
+        <w:t>Referencias</w:t>
+      </w:r>
+    </w:p>
+    <w:p>
+      <w:r>
+        <w:rPr>
+          <w:rFonts w:ascii="Arial" w:hAnsi="Arial"/>
+          <w:color w:val="44546A"/>
+          <w:sz w:val="17"/>
+        </w:rPr>
+        <w:t>1. Grange, S. K., &amp; Carslaw, D. C. (2019). Using meteorological normalisation to detect interventions in air quality time series. Science of the Total Environment, 653, 578–588.</w:t>
+      </w:r>
+    </w:p>
+    <w:p>
+      <w:r>
+        <w:rPr>
+          <w:rFonts w:ascii="Arial" w:hAnsi="Arial"/>
+          <w:color w:val="44546A"/>
+          <w:sz w:val="17"/>
+        </w:rPr>
+        <w:t>2. Angrist, J. D., &amp; Pischke, J. S. (2009). Mostly Harmless Econometrics: An Empiricist's Companion. Princeton University Press.</w:t>
+      </w:r>
+    </w:p>
     <w:sectPr>
+      <w:headerReference w:type="default" r:id="rId9"/>
+      <w:footerReference w:type="default" r:id="rId10"/>
       <w:pgSz w:w="12240" w:h="15840"/>
-      <w:pgMar w:top="1080" w:right="1080" w:bottom="1080" w:left="1080" w:header="720" w:footer="720" w:gutter="0"/>
+      <w:pgMar w:top="1100" w:right="1100" w:bottom="1100" w:left="1100" w:header="720" w:footer="720" w:gutter="0"/>
       <w:cols w:space="720"/>
       <w:docGrid w:linePitch="360"/>
     </w:sectPr>
   </w:body>
 </w:document>
+</file>
+
+<file path=word/footer1.xml><?xml version="1.0" encoding="utf-8"?>
+<w:ftr xmlns:m="http://schemas.openxmlformats.org/officeDocument/2006/math" xmlns:mc="http://schemas.openxmlformats.org/markup-compatibility/2006" xmlns:mo="http://schemas.microsoft.com/office/mac/office/2008/main" xmlns:mv="urn:schemas-microsoft-com:mac:vml" xmlns:o="urn:schemas-microsoft-com:office:office" xmlns:r="http://schemas.openxmlformats.org/officeDocument/2006/relationships" xmlns:v="urn:schemas-microsoft-com:vml" xmlns:w10="urn:schemas-microsoft-com:office:word" xmlns:w14="http://schemas.microsoft.com/office/word/2010/wordml" xmlns:w="http://schemas.openxmlformats.org/wordprocessingml/2006/main" xmlns:wne="http://schemas.microsoft.com/office/word/2006/wordml" xmlns:wp14="http://schemas.microsoft.com/office/word/2010/wordprocessingDrawing" xmlns:wp="http://schemas.openxmlformats.org/drawingml/2006/wordprocessingDrawing" xmlns:wpc="http://schemas.microsoft.com/office/word/2010/wordprocessingCanvas" xmlns:wpg="http://schemas.microsoft.com/office/word/2010/wordprocessingGroup" xmlns:wpi="http://schemas.microsoft.com/office/word/2010/wordprocessingInk" xmlns:wps="http://schemas.microsoft.com/office/word/2010/wordprocessingShape" mc:Ignorable="w14 wp14">
+  <w:p>
+    <w:pPr>
+      <w:pStyle w:val="Footer"/>
+      <w:jc w:val="center"/>
+    </w:pPr>
+    <w:r/>
+    <w:r>
+      <w:rPr>
+        <w:rFonts w:ascii="Arial" w:hAnsi="Arial"/>
+        <w:color w:val="44546A"/>
+        <w:sz w:val="16"/>
+      </w:rPr>
+      <w:t xml:space="preserve">Página </w:t>
+    </w:r>
+    <w:fldSimple w:instr="PAGE"/>
+    <w:r>
+      <w:rPr>
+        <w:rFonts w:ascii="Arial" w:hAnsi="Arial"/>
+        <w:color w:val="44546A"/>
+        <w:sz w:val="16"/>
+      </w:rPr>
+      <w:t xml:space="preserve"> de </w:t>
+    </w:r>
+    <w:fldSimple w:instr="NUMPAGES"/>
+  </w:p>
+</w:ftr>
+</file>
+
+<file path=word/header1.xml><?xml version="1.0" encoding="utf-8"?>
+<w:hdr xmlns:m="http://schemas.openxmlformats.org/officeDocument/2006/math" xmlns:mc="http://schemas.openxmlformats.org/markup-compatibility/2006" xmlns:mo="http://schemas.microsoft.com/office/mac/office/2008/main" xmlns:mv="urn:schemas-microsoft-com:mac:vml" xmlns:o="urn:schemas-microsoft-com:office:office" xmlns:r="http://schemas.openxmlformats.org/officeDocument/2006/relationships" xmlns:v="urn:schemas-microsoft-com:vml" xmlns:w10="urn:schemas-microsoft-com:office:word" xmlns:w14="http://schemas.microsoft.com/office/word/2010/wordml" xmlns:w="http://schemas.openxmlformats.org/wordprocessingml/2006/main" xmlns:wne="http://schemas.microsoft.com/office/word/2006/wordml" xmlns:wp14="http://schemas.microsoft.com/office/word/2010/wordprocessingDrawing" xmlns:wp="http://schemas.openxmlformats.org/drawingml/2006/wordprocessingDrawing" xmlns:wpc="http://schemas.microsoft.com/office/word/2010/wordprocessingCanvas" xmlns:wpg="http://schemas.microsoft.com/office/word/2010/wordprocessingGroup" xmlns:wpi="http://schemas.microsoft.com/office/word/2010/wordprocessingInk" xmlns:wps="http://schemas.microsoft.com/office/word/2010/wordprocessingShape" mc:Ignorable="w14 wp14">
+  <w:p>
+    <w:pPr>
+      <w:pStyle w:val="Header"/>
+      <w:pBdr>
+        <w:bottom w:val="single" w:color="0E7C7B" w:sz="6" w:space="4"/>
+      </w:pBdr>
+      <w:tabs>
+        <w:tab w:val="right" w:pos="9706"/>
+      </w:tabs>
+    </w:pPr>
+    <w:r/>
+    <w:r>
+      <w:rPr>
+        <w:rFonts w:ascii="Arial" w:hAnsi="Arial"/>
+        <w:color w:val="44546A"/>
+        <w:sz w:val="15"/>
+      </w:rPr>
+      <w:t>Curso de Especialización en Inteligencia Artificial y Big Data</w:t>
+    </w:r>
+    <w:r>
+      <w:rPr>
+        <w:rFonts w:ascii="Arial" w:hAnsi="Arial"/>
+        <w:color w:val="44546A"/>
+        <w:sz w:val="15"/>
+      </w:rPr>
+      <w:tab/>
+      <w:t>Haizen Lab · SBD · Reto 0</w:t>
+    </w:r>
+  </w:p>
+</w:hdr>
 </file>
 
 <file path=word/numbering.xml><?xml version="1.0" encoding="utf-8"?>
@@ -2501,8 +4605,8 @@
     </w:pPr>
     <w:rPr>
       <w:rFonts w:ascii="Arial" w:hAnsi="Arial"/>
-      <w:color w:val="232323"/>
-      <w:sz w:val="20"/>
+      <w:color w:val="2B2F3A"/>
+      <w:sz w:val="21"/>
     </w:rPr>
   </w:style>
   <w:style w:type="paragraph" w:styleId="Header">

</xml_diff>

<commit_message>
fix: cohesion y consistencia global del repositorio (arquitectura, did, grafana rbac, entregables y limpieza)
</commit_message>
<xml_diff>
--- a/docs/Informe_Ejecutivo_ZBE_Bilbao_HaizeLab.docx
+++ b/docs/Informe_Ejecutivo_ZBE_Bilbao_HaizeLab.docx
@@ -164,28 +164,7 @@
           </w:tcPr>
           <w:p>
             <w:r>
-              <w:rPr>
-                <w:sz w:val="19"/>
-              </w:rPr>
-              <w:t xml:space="preserve">Haizen Lab: Alfred Gabriel, Iñigo </w:t>
-            </w:r>
-            <w:r>
-              <w:rPr>
-                <w:sz w:val="19"/>
-              </w:rPr>
-              <w:t>Guzman</w:t>
-            </w:r>
-            <w:r>
-              <w:rPr>
-                <w:sz w:val="19"/>
-              </w:rPr>
-              <w:t xml:space="preserve">, Kerman </w:t>
-            </w:r>
-            <w:r>
-              <w:rPr>
-                <w:sz w:val="19"/>
-              </w:rPr>
-              <w:t>Latorre</w:t>
+              <w:t>HaizeLab: Alfred Gabriel, Iñigo Guzmán, Kerman Latorre</w:t>
             </w:r>
           </w:p>
         </w:tc>
@@ -385,7 +364,7 @@
     </w:p>
     <w:p>
       <w:r>
-        <w:t>La Zona de Bajas Emisiones (ZBE) de Bilbao opera en el distrito de Abando (2 km²) en horario laborable de lunes a viernes de 07:00 a 20:00 bajo dos escalones regulatorios: la Fase 1 (desde 15/06/2024, restricción a vehículos sin etiqueta DGT) y la Fase 2 (desde 16/06/2025, acceso restringido a etiqueta B de no residentes). El Ayuntamiento de Bilbao encomendó a Haizen Lab dictaminar si la evolución observada en el dióxido de nitrógeno (NO2) obedece de forma directa a la ordenanza municipal o si refleja la te</w:t>
+        <w:t>La Zona de Bajas Emisiones (ZBE) de Bilbao opera en el distrito de Abando (2 km²) en horario laborable de lunes a viernes de 07:00 a 20:00 bajo dos escalones regulatorios: la Fase 1 (desde 15/06/2024, restricción a vehículos sin etiqueta DGT) y la Fase 2 (desde 16/06/2025, acceso restringido a etiqueta B de no residentes). El Ayuntamiento de Bilbao encomendó a HaizeLab dictaminar si la evolución observada en el dióxido de nitrógeno (NO2) obedece de forma directa a la ordenanza municipal o si refleja la te</w:t>
       </w:r>
       <w:r>
         <w:t>ndencia meteorológica favorable y la renovación vegetativa del parque vehicular.</w:t>
@@ -472,7 +451,7 @@
     </w:p>
     <w:p>
       <w:r>
-        <w:t>Auditoría de integridad: De 61.368 registros horarios brutos, se excluyeron 1.054 registros con flags técnicos de calibración o valores negativos imposibles (&lt; 0 µg/m³). Se neutralizaron duplicados de cambio horario y se armonizaron las unidades de viento a m/s. La serie resultante presenta un 98,3% de completitud temporal homogénea.</w:t>
+        <w:t>Auditoría de integridad: El dataset integrado maestro consolida 332.776 registros horarios en 8 estaciones oficiales. Los valores negativos anómalos (&lt; 0 µg/m³, 0,04% por descalibración del sensor) se convirtieron a NaN sin distorsionar la serie temporal. Se neutralizaron duplicados de cambio horario y se armonizaron las unidades meteorológicas. La serie resultante presenta una completitud temporal superior al 98,8%.</w:t>
       </w:r>
     </w:p>
     <w:tbl>
@@ -2759,9 +2738,6 @@
           </w:tcPr>
           <w:p>
             <w:r>
-              <w:rPr>
-                <w:sz w:val="16"/>
-              </w:rPr>
               <w:t>Alfred Gabriel</w:t>
             </w:r>
           </w:p>
@@ -2779,10 +2755,7 @@
           </w:tcPr>
           <w:p>
             <w:r>
-              <w:rPr>
-                <w:sz w:val="16"/>
-              </w:rPr>
-              <w:t>Product Owner / PIA</w:t>
+              <w:t>Product Owner / SBD</w:t>
             </w:r>
           </w:p>
         </w:tc>
@@ -2799,10 +2772,7 @@
           </w:tcPr>
           <w:p>
             <w:r>
-              <w:rPr>
-                <w:sz w:val="16"/>
-              </w:rPr>
-              <w:t>Arquitectura Docker Compose, servicio MCP, pipeline y Git Feature Branching.</w:t>
+              <w:t>Pipeline reproducible de datos (332.776 registros), econometría Diff-in-Diff e informe ejecutivo para el cliente.</w:t>
             </w:r>
           </w:p>
         </w:tc>
@@ -2824,16 +2794,7 @@
           </w:tcPr>
           <w:p>
             <w:r>
-              <w:rPr>
-                <w:sz w:val="16"/>
-              </w:rPr>
-              <w:t xml:space="preserve">Kerman </w:t>
-            </w:r>
-            <w:r>
-              <w:rPr>
-                <w:sz w:val="16"/>
-              </w:rPr>
-              <w:t>Latorre</w:t>
+              <w:t>Kerman Latorre</w:t>
             </w:r>
           </w:p>
         </w:tc>
@@ -2850,10 +2811,7 @@
           </w:tcPr>
           <w:p>
             <w:r>
-              <w:rPr>
-                <w:sz w:val="16"/>
-              </w:rPr>
-              <w:t>Scrum Master / MIA</w:t>
+              <w:t>Scrum Master / MIA &amp; PIA</w:t>
             </w:r>
           </w:p>
         </w:tc>
@@ -2870,10 +2828,7 @@
           </w:tcPr>
           <w:p>
             <w:r>
-              <w:rPr>
-                <w:sz w:val="16"/>
-              </w:rPr>
-              <w:t>Diseño del modelo predictivo contrafactual (GBM), validación y memoria MIA.</w:t>
+              <w:t>Servidor MCP (:5001) para consultas de IA, integración de herramientas IA, metodología ágil Scrum y memoria técnica MIA.</w:t>
             </w:r>
           </w:p>
         </w:tc>
@@ -2895,16 +2850,7 @@
           </w:tcPr>
           <w:p>
             <w:r>
-              <w:rPr>
-                <w:sz w:val="16"/>
-              </w:rPr>
-              <w:t xml:space="preserve">Iñigo </w:t>
-            </w:r>
-            <w:r>
-              <w:rPr>
-                <w:sz w:val="16"/>
-              </w:rPr>
-              <w:t>Guzman</w:t>
+              <w:t>Iñigo Guzmán</w:t>
             </w:r>
           </w:p>
         </w:tc>
@@ -2921,9 +2867,6 @@
           </w:tcPr>
           <w:p>
             <w:r>
-              <w:rPr>
-                <w:sz w:val="16"/>
-              </w:rPr>
               <w:t>Lead Data Eng. / BDA</w:t>
             </w:r>
           </w:p>
@@ -2941,10 +2884,7 @@
           </w:tcPr>
           <w:p>
             <w:r>
-              <w:rPr>
-                <w:sz w:val="16"/>
-              </w:rPr>
-              <w:t>Flujos Node-RED, series InfluxDB, tokens de seguridad y paneles en Grafana.</w:t>
+              <w:t>Infraestructura Docker Compose, InfluxDB (4 buckets y tokens), streaming Node-RED 5.0 y Grafana RBAC.</w:t>
             </w:r>
           </w:p>
         </w:tc>

</xml_diff>

<commit_message>
Informe: responsables con su rol, NO2 y SO2 con subíndice en Arial
- Sección 8: cada tarea con su responsable y su rol, y la frase de que todo el
  equipo puede explicar el trabajo completo.
- El 2 de NO2 y SO2 va como subíndice de Word en vez del carácter ₂, y las
  viñetas son un carácter de Arial: todo el texto del PDF es Arial.
</commit_message>
<xml_diff>
--- a/docs/Informe_Ejecutivo_ZBE_Bilbao_HaizeLab.docx
+++ b/docs/Informe_Ejecutivo_ZBE_Bilbao_HaizeLab.docx
@@ -27,14 +27,14 @@
       </w:r>
       <w:r>
         <w:rPr>
-          <w:rFonts w:ascii="Cambria Math" w:hAnsi="Cambria Math" w:cs="Cambria Math"/>
           <w:b/>
           <w:bCs/>
           <w:color w:val="1F4E79"/>
           <w:sz w:val="48"/>
           <w:szCs w:val="48"/>
-        </w:rPr>
-        <w:t>₂</w:t>
+          <w:vertAlign w:val="subscript"/>
+        </w:rPr>
+        <w:t>2</w:t>
       </w:r>
       <w:r>
         <w:rPr>
@@ -382,11 +382,11 @@
       </w:r>
       <w:r>
         <w:rPr>
-          <w:rFonts w:ascii="Cambria Math" w:hAnsi="Cambria Math" w:cs="Cambria Math"/>
           <w:b/>
           <w:bCs/>
-        </w:rPr>
-        <w:t>₂</w:t>
+          <w:vertAlign w:val="subscript"/>
+        </w:rPr>
+        <w:t>2</w:t>
       </w:r>
       <w:r>
         <w:t xml:space="preserve"> (dióxido de nitrógeno, un gas que sale sobre todo de los tubos de escape) por la ZBE y cuánto habría bajado igualmente por el tiempo atmosférico o por la sustitución normal de coches viejos por otros más limpios, que ocurre con o sin ZBE.</w:t>
@@ -676,35 +676,20 @@
             </w:r>
             <w:r>
               <w:rPr>
-                <w:rFonts w:ascii="Cambria Math" w:eastAsia="Times New Roman" w:hAnsi="Cambria Math" w:cs="Cambria Math"/>
-                <w:sz w:val="22"/>
-                <w:szCs w:val="22"/>
-              </w:rPr>
-              <w:t>₂</w:t>
-            </w:r>
-            <w:r>
-              <w:rPr>
-                <w:rFonts w:ascii="Arial" w:eastAsia="Times New Roman" w:hAnsi="Arial" w:cs="Arial"/>
-                <w:sz w:val="22"/>
-                <w:szCs w:val="22"/>
-              </w:rPr>
-              <w:t xml:space="preserve"> dentro de la ZBE m</w:t>
-            </w:r>
-            <w:r>
-              <w:rPr>
-                <w:rFonts w:ascii="Arial" w:eastAsia="Times New Roman" w:hAnsi="Arial" w:cs="Arial"/>
-                <w:sz w:val="22"/>
-                <w:szCs w:val="22"/>
-              </w:rPr>
-              <w:t>á</w:t>
-            </w:r>
-            <w:r>
-              <w:rPr>
-                <w:rFonts w:ascii="Arial" w:eastAsia="Times New Roman" w:hAnsi="Arial" w:cs="Arial"/>
-                <w:sz w:val="22"/>
-                <w:szCs w:val="22"/>
-              </w:rPr>
-              <w:t>s que fuera?</w:t>
+                <w:rFonts w:ascii="Arial" w:eastAsia="Times New Roman" w:hAnsi="Arial" w:cs="Arial"/>
+                <w:sz w:val="22"/>
+                <w:szCs w:val="22"/>
+                <w:vertAlign w:val="subscript"/>
+              </w:rPr>
+              <w:t>2</w:t>
+            </w:r>
+            <w:r>
+              <w:rPr>
+                <w:rFonts w:ascii="Arial" w:eastAsia="Times New Roman" w:hAnsi="Arial" w:cs="Arial"/>
+                <w:sz w:val="22"/>
+                <w:szCs w:val="22"/>
+              </w:rPr>
+              <w:t xml:space="preserve"> dentro de la ZBE más que fuera?</w:t>
             </w:r>
           </w:p>
         </w:tc>
@@ -1146,35 +1131,20 @@
             </w:r>
             <w:r>
               <w:rPr>
-                <w:rFonts w:ascii="Cambria Math" w:eastAsia="Times New Roman" w:hAnsi="Cambria Math" w:cs="Cambria Math"/>
-                <w:sz w:val="22"/>
-                <w:szCs w:val="22"/>
-              </w:rPr>
-              <w:t>₂</w:t>
-            </w:r>
-            <w:r>
-              <w:rPr>
-                <w:rFonts w:ascii="Arial" w:eastAsia="Times New Roman" w:hAnsi="Arial" w:cs="Arial"/>
-                <w:sz w:val="22"/>
-                <w:szCs w:val="22"/>
-              </w:rPr>
-              <w:t>, que no viene del tr</w:t>
-            </w:r>
-            <w:r>
-              <w:rPr>
-                <w:rFonts w:ascii="Arial" w:eastAsia="Times New Roman" w:hAnsi="Arial" w:cs="Arial"/>
-                <w:sz w:val="22"/>
-                <w:szCs w:val="22"/>
-              </w:rPr>
-              <w:t>á</w:t>
-            </w:r>
-            <w:r>
-              <w:rPr>
-                <w:rFonts w:ascii="Arial" w:eastAsia="Times New Roman" w:hAnsi="Arial" w:cs="Arial"/>
-                <w:sz w:val="22"/>
-                <w:szCs w:val="22"/>
-              </w:rPr>
-              <w:t>fico?</w:t>
+                <w:rFonts w:ascii="Arial" w:eastAsia="Times New Roman" w:hAnsi="Arial" w:cs="Arial"/>
+                <w:sz w:val="22"/>
+                <w:szCs w:val="22"/>
+                <w:vertAlign w:val="subscript"/>
+              </w:rPr>
+              <w:t>2</w:t>
+            </w:r>
+            <w:r>
+              <w:rPr>
+                <w:rFonts w:ascii="Arial" w:eastAsia="Times New Roman" w:hAnsi="Arial" w:cs="Arial"/>
+                <w:sz w:val="22"/>
+                <w:szCs w:val="22"/>
+              </w:rPr>
+              <w:t>, que no viene del tráfico?</w:t>
             </w:r>
           </w:p>
         </w:tc>
@@ -1424,10 +1394,10 @@
         <w:tblLook w:val="04A0" w:firstRow="1" w:lastRow="0" w:firstColumn="1" w:lastColumn="0" w:noHBand="0" w:noVBand="1"/>
       </w:tblPr>
       <w:tblGrid>
-        <w:gridCol w:w="1469"/>
-        <w:gridCol w:w="3753"/>
-        <w:gridCol w:w="1597"/>
-        <w:gridCol w:w="1730"/>
+        <w:gridCol w:w="1468"/>
+        <w:gridCol w:w="3758"/>
+        <w:gridCol w:w="1598"/>
+        <w:gridCol w:w="1725"/>
         <w:gridCol w:w="1074"/>
       </w:tblGrid>
       <w:tr>
@@ -1782,11 +1752,12 @@
             </w:r>
             <w:r>
               <w:rPr>
-                <w:rFonts w:ascii="Cambria Math" w:eastAsia="Times New Roman" w:hAnsi="Cambria Math" w:cs="Cambria Math"/>
-                <w:sz w:val="22"/>
-                <w:szCs w:val="22"/>
-              </w:rPr>
-              <w:t>₂</w:t>
+                <w:rFonts w:ascii="Arial" w:eastAsia="Times New Roman" w:hAnsi="Arial" w:cs="Arial"/>
+                <w:sz w:val="22"/>
+                <w:szCs w:val="22"/>
+                <w:vertAlign w:val="subscript"/>
+              </w:rPr>
+              <w:t>2</w:t>
             </w:r>
             <w:r>
               <w:rPr>
@@ -1798,51 +1769,20 @@
             </w:r>
             <w:r>
               <w:rPr>
-                <w:rFonts w:ascii="Cambria Math" w:eastAsia="Times New Roman" w:hAnsi="Cambria Math" w:cs="Cambria Math"/>
-                <w:sz w:val="22"/>
-                <w:szCs w:val="22"/>
-              </w:rPr>
-              <w:t>₂</w:t>
-            </w:r>
-            <w:r>
-              <w:rPr>
-                <w:rFonts w:ascii="Arial" w:eastAsia="Times New Roman" w:hAnsi="Arial" w:cs="Arial"/>
-                <w:sz w:val="22"/>
-                <w:szCs w:val="22"/>
-              </w:rPr>
-              <w:t xml:space="preserve"> (</w:t>
-            </w:r>
-            <w:r>
-              <w:rPr>
-                <w:rFonts w:ascii="Arial" w:eastAsia="Times New Roman" w:hAnsi="Arial" w:cs="Arial"/>
-                <w:sz w:val="22"/>
-                <w:szCs w:val="22"/>
-              </w:rPr>
-              <w:t>µ</w:t>
-            </w:r>
-            <w:r>
-              <w:rPr>
-                <w:rFonts w:ascii="Arial" w:eastAsia="Times New Roman" w:hAnsi="Arial" w:cs="Arial"/>
-                <w:sz w:val="22"/>
-                <w:szCs w:val="22"/>
-              </w:rPr>
-              <w:t>g/m</w:t>
-            </w:r>
-            <w:r>
-              <w:rPr>
-                <w:rFonts w:ascii="Arial" w:eastAsia="Times New Roman" w:hAnsi="Arial" w:cs="Arial"/>
-                <w:sz w:val="22"/>
-                <w:szCs w:val="22"/>
-              </w:rPr>
-              <w:t>³</w:t>
-            </w:r>
-            <w:r>
-              <w:rPr>
-                <w:rFonts w:ascii="Arial" w:eastAsia="Times New Roman" w:hAnsi="Arial" w:cs="Arial"/>
-                <w:sz w:val="22"/>
-                <w:szCs w:val="22"/>
-              </w:rPr>
-              <w:t>), 8 estaciones</w:t>
+                <w:rFonts w:ascii="Arial" w:eastAsia="Times New Roman" w:hAnsi="Arial" w:cs="Arial"/>
+                <w:sz w:val="22"/>
+                <w:szCs w:val="22"/>
+                <w:vertAlign w:val="subscript"/>
+              </w:rPr>
+              <w:t>2</w:t>
+            </w:r>
+            <w:r>
+              <w:rPr>
+                <w:rFonts w:ascii="Arial" w:eastAsia="Times New Roman" w:hAnsi="Arial" w:cs="Arial"/>
+                <w:sz w:val="22"/>
+                <w:szCs w:val="22"/>
+              </w:rPr>
+              <w:t xml:space="preserve"> (µg/m³), 8 estaciones</w:t>
             </w:r>
           </w:p>
         </w:tc>
@@ -2264,377 +2204,163 @@
       </w:r>
       <w:r>
         <w:rPr>
-          <w:rFonts w:ascii="Cambria Math" w:hAnsi="Cambria Math" w:cs="Cambria Math"/>
-        </w:rPr>
-        <w:t>₂</w:t>
+          <w:vertAlign w:val="subscript"/>
+        </w:rPr>
+        <w:t>2</w:t>
       </w:r>
       <w:r>
         <w:t>, SO</w:t>
       </w:r>
       <w:r>
         <w:rPr>
-          <w:rFonts w:ascii="Cambria Math" w:hAnsi="Cambria Math" w:cs="Cambria Math"/>
-        </w:rPr>
-        <w:t>₂</w:t>
-      </w:r>
-      <w:r>
-        <w:t>, viento), categ</w:t>
-      </w:r>
-      <w:r>
-        <w:t>ó</w:t>
-      </w:r>
-      <w:r>
-        <w:t>ricos (estaci</w:t>
-      </w:r>
-      <w:r>
-        <w:t>ó</w:t>
-      </w:r>
-      <w:r>
-        <w:t>n, grupo, fase), l</w:t>
-      </w:r>
-      <w:r>
-        <w:t>ó</w:t>
-      </w:r>
-      <w:r>
-        <w:t>gicos (laborable, en horario ZBE) y de fecha y hora.</w:t>
+          <w:vertAlign w:val="subscript"/>
+        </w:rPr>
+        <w:t>2</w:t>
+      </w:r>
+      <w:r>
+        <w:t>, viento), categóricos (estación, grupo, fase), lógicos (laborable, en horario ZBE) y de fecha y hora.</w:t>
       </w:r>
     </w:p>
     <w:p>
       <w:pPr>
-        <w:numPr>
-          <w:ilvl w:val="0"/>
-          <w:numId w:val="1"/>
-        </w:numPr>
-        <w:spacing w:before="100" w:beforeAutospacing="1" w:after="20"/>
-        <w:rPr>
-          <w:rFonts w:ascii="Arial" w:eastAsia="Times New Roman" w:hAnsi="Arial" w:cs="Arial"/>
-          <w:sz w:val="22"/>
-          <w:szCs w:val="22"/>
-        </w:rPr>
+        <w:pStyle w:val="vineta"/>
       </w:pPr>
       <w:r>
-        <w:rPr>
-          <w:rFonts w:ascii="Arial" w:eastAsia="Times New Roman" w:hAnsi="Arial" w:cs="Arial"/>
+        <w:t>•  </w:t>
+      </w:r>
+      <w:r>
+        <w:rPr>
           <w:b/>
           <w:bCs/>
-          <w:sz w:val="22"/>
-          <w:szCs w:val="22"/>
         </w:rPr>
         <w:t>Filas:</w:t>
       </w:r>
       <w:r>
-        <w:rPr>
-          <w:rFonts w:ascii="Arial" w:eastAsia="Times New Roman" w:hAnsi="Arial" w:cs="Arial"/>
-          <w:sz w:val="22"/>
-          <w:szCs w:val="22"/>
-        </w:rPr>
         <w:t xml:space="preserve"> </w:t>
       </w:r>
       <w:r>
-        <w:rPr>
-          <w:rFonts w:ascii="Arial" w:eastAsia="Times New Roman" w:hAnsi="Arial" w:cs="Arial"/>
-          <w:sz w:val="22"/>
-          <w:szCs w:val="22"/>
-        </w:rPr>
         <w:t>336.480 crudas, sin fechas no válidas ni repetidas. Se estudian 332.619, hasta el 30/09/2026, para que las cifras no cambien cuando se publican datos nuevos (Grafana puede mostrar datos posteriores).</w:t>
       </w:r>
     </w:p>
     <w:p>
       <w:pPr>
-        <w:numPr>
-          <w:ilvl w:val="0"/>
-          <w:numId w:val="1"/>
-        </w:numPr>
-        <w:spacing w:before="100" w:beforeAutospacing="1" w:after="20"/>
-        <w:rPr>
-          <w:rFonts w:ascii="Arial" w:eastAsia="Times New Roman" w:hAnsi="Arial" w:cs="Arial"/>
-          <w:sz w:val="22"/>
-          <w:szCs w:val="22"/>
-        </w:rPr>
+        <w:pStyle w:val="vineta"/>
       </w:pPr>
       <w:r>
-        <w:rPr>
-          <w:rFonts w:ascii="Arial" w:eastAsia="Times New Roman" w:hAnsi="Arial" w:cs="Arial"/>
+        <w:t>•  </w:t>
+      </w:r>
+      <w:r>
+        <w:rPr>
           <w:b/>
           <w:bCs/>
-          <w:sz w:val="22"/>
-          <w:szCs w:val="22"/>
         </w:rPr>
         <w:t>Formato:</w:t>
       </w:r>
       <w:r>
-        <w:rPr>
-          <w:rFonts w:ascii="Arial" w:eastAsia="Times New Roman" w:hAnsi="Arial" w:cs="Arial"/>
-          <w:sz w:val="22"/>
-          <w:szCs w:val="22"/>
-        </w:rPr>
         <w:t xml:space="preserve"> 199.004 celdas con coma decimal y 14.020 filas con hora 24:00 (pasa a las 00:00 del día siguiente).</w:t>
       </w:r>
     </w:p>
     <w:p>
       <w:pPr>
-        <w:numPr>
-          <w:ilvl w:val="0"/>
-          <w:numId w:val="1"/>
-        </w:numPr>
-        <w:spacing w:before="100" w:beforeAutospacing="1" w:after="20"/>
-        <w:rPr>
-          <w:rFonts w:ascii="Arial" w:eastAsia="Times New Roman" w:hAnsi="Arial" w:cs="Arial"/>
-          <w:sz w:val="22"/>
-          <w:szCs w:val="22"/>
-        </w:rPr>
+        <w:pStyle w:val="vineta"/>
       </w:pPr>
       <w:r>
-        <w:rPr>
-          <w:rFonts w:ascii="Arial" w:eastAsia="Times New Roman" w:hAnsi="Arial" w:cs="Arial"/>
+        <w:lastRenderedPageBreak/>
+        <w:t>•  </w:t>
+      </w:r>
+      <w:r>
+        <w:rPr>
           <w:b/>
           <w:bCs/>
-          <w:sz w:val="22"/>
-          <w:szCs w:val="22"/>
-        </w:rPr>
-        <w:lastRenderedPageBreak/>
+        </w:rPr>
         <w:t>Negativos:</w:t>
       </w:r>
       <w:r>
-        <w:rPr>
-          <w:rFonts w:ascii="Arial" w:eastAsia="Times New Roman" w:hAnsi="Arial" w:cs="Arial"/>
-          <w:sz w:val="22"/>
-          <w:szCs w:val="22"/>
-        </w:rPr>
         <w:t xml:space="preserve"> 71 valores de NO</w:t>
       </w:r>
       <w:r>
         <w:rPr>
-          <w:rFonts w:ascii="Cambria Math" w:eastAsia="Times New Roman" w:hAnsi="Cambria Math" w:cs="Cambria Math"/>
-          <w:sz w:val="22"/>
-          <w:szCs w:val="22"/>
-        </w:rPr>
-        <w:t>₂</w:t>
-      </w:r>
-      <w:r>
-        <w:rPr>
-          <w:rFonts w:ascii="Arial" w:eastAsia="Times New Roman" w:hAnsi="Arial" w:cs="Arial"/>
-          <w:sz w:val="22"/>
-          <w:szCs w:val="22"/>
-        </w:rPr>
+          <w:vertAlign w:val="subscript"/>
+        </w:rPr>
+        <w:t>2</w:t>
+      </w:r>
+      <w:r>
         <w:t xml:space="preserve"> (0,021 %) pasan a </w:t>
       </w:r>
       <w:r>
         <w:rPr>
-          <w:rFonts w:ascii="Arial" w:eastAsia="Times New Roman" w:hAnsi="Arial" w:cs="Arial"/>
           <w:b/>
           <w:bCs/>
-          <w:sz w:val="22"/>
-          <w:szCs w:val="22"/>
         </w:rPr>
         <w:t>NaN</w:t>
       </w:r>
       <w:r>
-        <w:rPr>
-          <w:rFonts w:ascii="Arial" w:eastAsia="Times New Roman" w:hAnsi="Arial" w:cs="Arial"/>
-          <w:sz w:val="22"/>
-          <w:szCs w:val="22"/>
-        </w:rPr>
         <w:t xml:space="preserve"> (celda vacía). Un 0 bajaría la media sin motivo y borrar la fila perdería los demás datos de esa hora.</w:t>
       </w:r>
     </w:p>
     <w:p>
       <w:pPr>
-        <w:numPr>
-          <w:ilvl w:val="0"/>
-          <w:numId w:val="1"/>
-        </w:numPr>
-        <w:spacing w:before="100" w:beforeAutospacing="1" w:after="20"/>
-        <w:rPr>
-          <w:rFonts w:ascii="Arial" w:eastAsia="Times New Roman" w:hAnsi="Arial" w:cs="Arial"/>
-          <w:sz w:val="22"/>
-          <w:szCs w:val="22"/>
-        </w:rPr>
+        <w:pStyle w:val="vineta"/>
       </w:pPr>
       <w:r>
-        <w:rPr>
-          <w:rFonts w:ascii="Arial" w:eastAsia="Times New Roman" w:hAnsi="Arial" w:cs="Arial"/>
+        <w:t>•  </w:t>
+      </w:r>
+      <w:r>
+        <w:rPr>
           <w:b/>
           <w:bCs/>
-          <w:sz w:val="22"/>
-          <w:szCs w:val="22"/>
         </w:rPr>
         <w:t>Unidades y hora:</w:t>
       </w:r>
       <w:r>
-        <w:rPr>
-          <w:rFonts w:ascii="Arial" w:eastAsia="Times New Roman" w:hAnsi="Arial" w:cs="Arial"/>
-          <w:sz w:val="22"/>
-          <w:szCs w:val="22"/>
-        </w:rPr>
         <w:t xml:space="preserve"> </w:t>
       </w:r>
       <w:r>
-        <w:rPr>
-          <w:rFonts w:ascii="Arial" w:eastAsia="Times New Roman" w:hAnsi="Arial" w:cs="Arial"/>
-          <w:sz w:val="22"/>
-          <w:szCs w:val="22"/>
-        </w:rPr>
         <w:t>el viento llega en km/h (media 8,85) y se pasa a m/s dividiendo entre 3,6 (media 2,46). La hora llega en GMT y se pasa a la de Madrid, que es la del horario de la ZBE.</w:t>
       </w:r>
     </w:p>
     <w:p>
       <w:pPr>
-        <w:numPr>
-          <w:ilvl w:val="0"/>
-          <w:numId w:val="1"/>
-        </w:numPr>
-        <w:spacing w:before="100" w:beforeAutospacing="1" w:after="20"/>
-        <w:rPr>
-          <w:rFonts w:ascii="Arial" w:eastAsia="Times New Roman" w:hAnsi="Arial" w:cs="Arial"/>
-          <w:sz w:val="22"/>
-          <w:szCs w:val="22"/>
-        </w:rPr>
+        <w:pStyle w:val="vineta"/>
       </w:pPr>
       <w:r>
-        <w:rPr>
-          <w:rFonts w:ascii="Arial" w:eastAsia="Times New Roman" w:hAnsi="Arial" w:cs="Arial"/>
+        <w:t>•  </w:t>
+      </w:r>
+      <w:r>
+        <w:rPr>
           <w:b/>
           <w:bCs/>
-          <w:sz w:val="22"/>
-          <w:szCs w:val="22"/>
         </w:rPr>
         <w:t>Completitud</w:t>
       </w:r>
       <w:r>
-        <w:rPr>
-          <w:rFonts w:ascii="Arial" w:eastAsia="Times New Roman" w:hAnsi="Arial" w:cs="Arial"/>
-          <w:sz w:val="22"/>
-          <w:szCs w:val="22"/>
-        </w:rPr>
         <w:t xml:space="preserve"> = horas con dato válido de NO</w:t>
       </w:r>
       <w:r>
         <w:rPr>
-          <w:rFonts w:ascii="Cambria Math" w:eastAsia="Times New Roman" w:hAnsi="Cambria Math" w:cs="Cambria Math"/>
-          <w:sz w:val="22"/>
-          <w:szCs w:val="22"/>
-        </w:rPr>
-        <w:t>₂</w:t>
-      </w:r>
-      <w:r>
-        <w:rPr>
-          <w:rFonts w:ascii="Arial" w:eastAsia="Times New Roman" w:hAnsi="Arial" w:cs="Arial"/>
-          <w:sz w:val="22"/>
-          <w:szCs w:val="22"/>
-        </w:rPr>
-        <w:t xml:space="preserve"> </w:t>
-      </w:r>
-      <w:r>
-        <w:rPr>
-          <w:rFonts w:ascii="Arial" w:eastAsia="Times New Roman" w:hAnsi="Arial" w:cs="Arial"/>
-          <w:sz w:val="22"/>
-          <w:szCs w:val="22"/>
-        </w:rPr>
-        <w:t>÷</w:t>
-      </w:r>
-      <w:r>
-        <w:rPr>
-          <w:rFonts w:ascii="Arial" w:eastAsia="Times New Roman" w:hAnsi="Arial" w:cs="Arial"/>
-          <w:sz w:val="22"/>
-          <w:szCs w:val="22"/>
-        </w:rPr>
-        <w:t xml:space="preserve"> horas que deber</w:t>
-      </w:r>
-      <w:r>
-        <w:rPr>
-          <w:rFonts w:ascii="Arial" w:eastAsia="Times New Roman" w:hAnsi="Arial" w:cs="Arial"/>
-          <w:sz w:val="22"/>
-          <w:szCs w:val="22"/>
-        </w:rPr>
-        <w:t>í</w:t>
-      </w:r>
-      <w:r>
-        <w:rPr>
-          <w:rFonts w:ascii="Arial" w:eastAsia="Times New Roman" w:hAnsi="Arial" w:cs="Arial"/>
-          <w:sz w:val="22"/>
-          <w:szCs w:val="22"/>
-        </w:rPr>
-        <w:t>a haber: 96,66 % en total, de 91,98 % (M</w:t>
-      </w:r>
-      <w:r>
-        <w:rPr>
-          <w:rFonts w:ascii="Arial" w:eastAsia="Times New Roman" w:hAnsi="Arial" w:cs="Arial"/>
-          <w:sz w:val="22"/>
-          <w:szCs w:val="22"/>
-        </w:rPr>
-        <w:t>ª</w:t>
-      </w:r>
-      <w:r>
-        <w:rPr>
-          <w:rFonts w:ascii="Arial" w:eastAsia="Times New Roman" w:hAnsi="Arial" w:cs="Arial"/>
-          <w:sz w:val="22"/>
-          <w:szCs w:val="22"/>
-        </w:rPr>
-        <w:t xml:space="preserve"> D</w:t>
-      </w:r>
-      <w:r>
-        <w:rPr>
-          <w:rFonts w:ascii="Arial" w:eastAsia="Times New Roman" w:hAnsi="Arial" w:cs="Arial"/>
-          <w:sz w:val="22"/>
-          <w:szCs w:val="22"/>
-        </w:rPr>
-        <w:t>í</w:t>
-      </w:r>
-      <w:r>
-        <w:rPr>
-          <w:rFonts w:ascii="Arial" w:eastAsia="Times New Roman" w:hAnsi="Arial" w:cs="Arial"/>
-          <w:sz w:val="22"/>
-          <w:szCs w:val="22"/>
-        </w:rPr>
-        <w:t>az de Haro) a 99,07 % (Erandio). Meteorolog</w:t>
-      </w:r>
-      <w:r>
-        <w:rPr>
-          <w:rFonts w:ascii="Arial" w:eastAsia="Times New Roman" w:hAnsi="Arial" w:cs="Arial"/>
-          <w:sz w:val="22"/>
-          <w:szCs w:val="22"/>
-        </w:rPr>
-        <w:t>í</w:t>
-      </w:r>
-      <w:r>
-        <w:rPr>
-          <w:rFonts w:ascii="Arial" w:eastAsia="Times New Roman" w:hAnsi="Arial" w:cs="Arial"/>
-          <w:sz w:val="22"/>
-          <w:szCs w:val="22"/>
-        </w:rPr>
-        <w:t>a: 100 %.</w:t>
+          <w:vertAlign w:val="subscript"/>
+        </w:rPr>
+        <w:t>2</w:t>
+      </w:r>
+      <w:r>
+        <w:t xml:space="preserve"> ÷ horas que debería haber: 96,66 % en total, de 91,98 % (Mª Díaz de Haro) a 99,07 % (Erandio). Meteorología: 100 %.</w:t>
       </w:r>
     </w:p>
     <w:p>
       <w:pPr>
-        <w:numPr>
-          <w:ilvl w:val="0"/>
-          <w:numId w:val="1"/>
-        </w:numPr>
-        <w:spacing w:before="100" w:beforeAutospacing="1" w:after="20"/>
-        <w:rPr>
-          <w:rFonts w:ascii="Arial" w:eastAsia="Times New Roman" w:hAnsi="Arial" w:cs="Arial"/>
-          <w:sz w:val="22"/>
-          <w:szCs w:val="22"/>
-        </w:rPr>
+        <w:pStyle w:val="vineta"/>
       </w:pPr>
       <w:r>
-        <w:rPr>
-          <w:rFonts w:ascii="Arial" w:eastAsia="Times New Roman" w:hAnsi="Arial" w:cs="Arial"/>
+        <w:t>•  </w:t>
+      </w:r>
+      <w:r>
+        <w:rPr>
           <w:b/>
           <w:bCs/>
-          <w:sz w:val="22"/>
-          <w:szCs w:val="22"/>
         </w:rPr>
         <w:t>Integración:</w:t>
       </w:r>
       <w:r>
-        <w:rPr>
-          <w:rFonts w:ascii="Arial" w:eastAsia="Times New Roman" w:hAnsi="Arial" w:cs="Arial"/>
-          <w:sz w:val="22"/>
-          <w:szCs w:val="22"/>
-        </w:rPr>
         <w:t xml:space="preserve"> a cada medición se le une el calendario (por fecha) y el viento (por hora): 332.619 filas antes y 332.619 después, 0 repetidas.</w:t>
       </w:r>
     </w:p>
@@ -2654,121 +2380,67 @@
     </w:p>
     <w:p>
       <w:pPr>
-        <w:numPr>
-          <w:ilvl w:val="0"/>
-          <w:numId w:val="2"/>
-        </w:numPr>
-        <w:spacing w:before="100" w:beforeAutospacing="1" w:after="20"/>
-        <w:rPr>
-          <w:rFonts w:ascii="Arial" w:eastAsia="Times New Roman" w:hAnsi="Arial" w:cs="Arial"/>
-          <w:sz w:val="22"/>
-          <w:szCs w:val="22"/>
-        </w:rPr>
+        <w:pStyle w:val="vineta"/>
       </w:pPr>
       <w:r>
-        <w:rPr>
-          <w:rFonts w:ascii="Arial" w:eastAsia="Times New Roman" w:hAnsi="Arial" w:cs="Arial"/>
+        <w:t>•  </w:t>
+      </w:r>
+      <w:r>
+        <w:rPr>
           <w:b/>
           <w:bCs/>
-          <w:sz w:val="22"/>
-          <w:szCs w:val="22"/>
         </w:rPr>
         <w:t>Dentro (tratamiento):</w:t>
       </w:r>
       <w:r>
-        <w:rPr>
-          <w:rFonts w:ascii="Arial" w:eastAsia="Times New Roman" w:hAnsi="Arial" w:cs="Arial"/>
-          <w:sz w:val="22"/>
-          <w:szCs w:val="22"/>
-        </w:rPr>
         <w:t xml:space="preserve"> </w:t>
       </w:r>
       <w:r>
-        <w:rPr>
-          <w:rFonts w:ascii="Arial" w:eastAsia="Times New Roman" w:hAnsi="Arial" w:cs="Arial"/>
-          <w:sz w:val="22"/>
-          <w:szCs w:val="22"/>
-        </w:rPr>
         <w:t>Mazarredo y Mª Díaz de Haro, dentro de la ZBE.</w:t>
       </w:r>
     </w:p>
     <w:p>
       <w:pPr>
-        <w:numPr>
-          <w:ilvl w:val="0"/>
-          <w:numId w:val="2"/>
-        </w:numPr>
-        <w:spacing w:before="100" w:beforeAutospacing="1" w:after="20"/>
-        <w:rPr>
-          <w:rFonts w:ascii="Arial" w:eastAsia="Times New Roman" w:hAnsi="Arial" w:cs="Arial"/>
-          <w:sz w:val="22"/>
-          <w:szCs w:val="22"/>
-        </w:rPr>
+        <w:pStyle w:val="vineta"/>
       </w:pPr>
       <w:r>
-        <w:rPr>
-          <w:rFonts w:ascii="Arial" w:eastAsia="Times New Roman" w:hAnsi="Arial" w:cs="Arial"/>
+        <w:t>•  </w:t>
+      </w:r>
+      <w:r>
+        <w:rPr>
           <w:b/>
           <w:bCs/>
-          <w:sz w:val="22"/>
-          <w:szCs w:val="22"/>
         </w:rPr>
         <w:t>Fuera (control):</w:t>
       </w:r>
       <w:r>
-        <w:rPr>
-          <w:rFonts w:ascii="Arial" w:eastAsia="Times New Roman" w:hAnsi="Arial" w:cs="Arial"/>
-          <w:sz w:val="22"/>
-          <w:szCs w:val="22"/>
-        </w:rPr>
         <w:t xml:space="preserve"> Europa, Barakaldo, Basauri, Erandio y Castrejana. Mismo tiempo atmosférico y mismo tipo de coches que el centro, pero sin ZBE: muestran lo que habría bajado el NO</w:t>
       </w:r>
       <w:r>
         <w:rPr>
-          <w:rFonts w:ascii="Cambria Math" w:eastAsia="Times New Roman" w:hAnsi="Cambria Math" w:cs="Cambria Math"/>
-          <w:sz w:val="22"/>
-          <w:szCs w:val="22"/>
-        </w:rPr>
-        <w:t>₂</w:t>
-      </w:r>
-      <w:r>
-        <w:rPr>
-          <w:rFonts w:ascii="Arial" w:eastAsia="Times New Roman" w:hAnsi="Arial" w:cs="Arial"/>
-          <w:sz w:val="22"/>
-          <w:szCs w:val="22"/>
-        </w:rPr>
+          <w:vertAlign w:val="subscript"/>
+        </w:rPr>
+        <w:t>2</w:t>
+      </w:r>
+      <w:r>
         <w:t xml:space="preserve"> sin ella.</w:t>
       </w:r>
     </w:p>
     <w:p>
       <w:pPr>
-        <w:numPr>
-          <w:ilvl w:val="0"/>
-          <w:numId w:val="2"/>
-        </w:numPr>
-        <w:spacing w:before="100" w:beforeAutospacing="1" w:after="20"/>
-        <w:rPr>
-          <w:rFonts w:ascii="Arial" w:eastAsia="Times New Roman" w:hAnsi="Arial" w:cs="Arial"/>
-          <w:sz w:val="22"/>
-          <w:szCs w:val="22"/>
-        </w:rPr>
+        <w:pStyle w:val="vineta"/>
       </w:pPr>
       <w:r>
-        <w:rPr>
-          <w:rFonts w:ascii="Arial" w:eastAsia="Times New Roman" w:hAnsi="Arial" w:cs="Arial"/>
+        <w:t>•  </w:t>
+      </w:r>
+      <w:r>
+        <w:rPr>
           <w:b/>
           <w:bCs/>
-          <w:sz w:val="22"/>
-          <w:szCs w:val="22"/>
         </w:rPr>
         <w:t>Fondo:</w:t>
       </w:r>
       <w:r>
-        <w:rPr>
-          <w:rFonts w:ascii="Arial" w:eastAsia="Times New Roman" w:hAnsi="Arial" w:cs="Arial"/>
-          <w:sz w:val="22"/>
-          <w:szCs w:val="22"/>
-        </w:rPr>
         <w:t xml:space="preserve"> Arraiz, en un monte lejos del tráfico (8,73 µg/m³ antes de la ZBE, frente a 18,25 en el control). No se parece a una estación urbana, así que no entra en el control.</w:t>
       </w:r>
     </w:p>
@@ -4549,31 +4221,19 @@
         <w:t>Después:</w:t>
       </w:r>
       <w:r>
+        <w:t xml:space="preserve"> NO</w:t>
+      </w:r>
+      <w:r>
+        <w:rPr>
+          <w:vertAlign w:val="subscript"/>
+        </w:rPr>
+        <w:t>2</w:t>
+      </w:r>
+      <w:r>
         <w:t xml:space="preserve"> </w:t>
       </w:r>
       <w:r>
-        <w:t>NO</w:t>
-      </w:r>
-      <w:r>
-        <w:rPr>
-          <w:rFonts w:ascii="Cambria Math" w:hAnsi="Cambria Math" w:cs="Cambria Math"/>
-        </w:rPr>
-        <w:t>₂</w:t>
-      </w:r>
-      <w:r>
-        <w:t xml:space="preserve"> medio (</w:t>
-      </w:r>
-      <w:r>
-        <w:t>µ</w:t>
-      </w:r>
-      <w:r>
-        <w:t>g/m</w:t>
-      </w:r>
-      <w:r>
-        <w:t>³</w:t>
-      </w:r>
-      <w:r>
-        <w:t xml:space="preserve">) en cada periodo. </w:t>
+        <w:t xml:space="preserve">medio (µg/m³) en cada periodo. </w:t>
       </w:r>
       <w:r>
         <w:rPr>
@@ -4613,48 +4273,34 @@
       </w:r>
       <w:r>
         <w:rPr>
-          <w:rFonts w:ascii="Cambria Math" w:hAnsi="Cambria Math" w:cs="Cambria Math"/>
           <w:b/>
           <w:bCs/>
-        </w:rPr>
-        <w:t>₂</w:t>
+          <w:vertAlign w:val="subscript"/>
+        </w:rPr>
+        <w:t>2</w:t>
       </w:r>
       <w:r>
         <w:rPr>
           <w:b/>
           <w:bCs/>
         </w:rPr>
-        <w:t xml:space="preserve"> dentro m</w:t>
+        <w:t xml:space="preserve"> dentro más que fuera?</w:t>
+      </w:r>
+      <w:r>
+        <w:t xml:space="preserve"> Dentro: 25,50 → 21,91 µg/m³ (−3,59). Fuera: 18,25 → 16,29 (−1,96). Efecto neto: −3,59 − (−1,96) = </w:t>
       </w:r>
       <w:r>
         <w:rPr>
           <w:b/>
           <w:bCs/>
         </w:rPr>
-        <w:t>á</w:t>
+        <w:t>−</w:t>
       </w:r>
       <w:r>
         <w:rPr>
           <w:b/>
           <w:bCs/>
         </w:rPr>
-        <w:t>s que fuera?</w:t>
-      </w:r>
-      <w:r>
-        <w:t xml:space="preserve"> Dentro: 25,50 → 21,91 µg/m³ (−3,59). Fuera: 18,25 → 16,29 (−1,96). Efecto neto: −3,59 − (−1,96) = </w:t>
-      </w:r>
-      <w:r>
-        <w:rPr>
-          <w:b/>
-          <w:bCs/>
-        </w:rPr>
-        <w:t>−</w:t>
-      </w:r>
-      <w:r>
-        <w:rPr>
-          <w:b/>
-          <w:bCs/>
-        </w:rPr>
         <w:t>1,63 µg/m³</w:t>
       </w:r>
       <w:r>
@@ -4668,37 +4314,19 @@
         <w:t>Qué significa:</w:t>
       </w:r>
       <w:r>
+        <w:t xml:space="preserve"> de la bajada de 3,59 dentro, 1,96 se vio también fuera; la parte propia de dentro, 1,63, es la que se asocia a la ZBE. Es una estimación aproximada: de 2022 a 2023 el NO</w:t>
+      </w:r>
+      <w:r>
+        <w:rPr>
+          <w:vertAlign w:val="subscript"/>
+        </w:rPr>
+        <w:t>2</w:t>
+      </w:r>
+      <w:r>
         <w:t xml:space="preserve"> </w:t>
       </w:r>
       <w:r>
-        <w:t>de la bajada de 3,59 dentro, 1,96 se vio también fuera; la parte propia de dentro, 1,63, es la que se asocia a la ZBE. Es una estimación aproximada: de 2022 a 2023 el NO</w:t>
-      </w:r>
-      <w:r>
-        <w:rPr>
-          <w:rFonts w:ascii="Cambria Math" w:hAnsi="Cambria Math" w:cs="Cambria Math"/>
-        </w:rPr>
-        <w:t>₂</w:t>
-      </w:r>
-      <w:r>
-        <w:t xml:space="preserve"> cambi</w:t>
-      </w:r>
-      <w:r>
-        <w:t>ó</w:t>
-      </w:r>
-      <w:r>
-        <w:t xml:space="preserve"> +0,10 dentro y </w:t>
-      </w:r>
-      <w:r>
-        <w:t>−</w:t>
-      </w:r>
-      <w:r>
-        <w:t>1,14 fuera, as</w:t>
-      </w:r>
-      <w:r>
-        <w:t>í</w:t>
-      </w:r>
-      <w:r>
-        <w:t xml:space="preserve"> que antes de la ZBE no iban del todo en paralelo.</w:t>
+        <w:t>cambió +0,10 dentro y −1,14 fuera, así que antes de la ZBE no iban del todo en paralelo.</w:t>
       </w:r>
     </w:p>
     <w:p>
@@ -4710,7 +4338,7 @@
           <w:noProof/>
         </w:rPr>
         <w:drawing>
-          <wp:inline distT="0" distB="0" distL="0" distR="0" wp14:anchorId="64FC6E0F" wp14:editId="0CDFBFD6">
+          <wp:inline distT="0" distB="0" distL="0" distR="0" wp14:anchorId="6941075E" wp14:editId="080B751E">
             <wp:extent cx="4046220" cy="2103120"/>
             <wp:effectExtent l="0" t="0" r="0" b="0"/>
             <wp:docPr id="1" name="Imagen 1"/>
@@ -4727,7 +4355,7 @@
                     </pic:cNvPicPr>
                   </pic:nvPicPr>
                   <pic:blipFill>
-                    <a:blip r:embed="rId7" cstate="print">
+                    <a:blip r:embed="rId6" cstate="print">
                       <a:extLst>
                         <a:ext uri="{28A0092B-C50C-407E-A947-70E740481C1C}">
                           <a14:useLocalDpi xmlns:a14="http://schemas.microsoft.com/office/drawing/2010/main" val="0"/>
@@ -4783,18 +4411,12 @@
       </w:r>
       <w:r>
         <w:rPr>
-          <w:rFonts w:ascii="Cambria Math" w:hAnsi="Cambria Math" w:cs="Cambria Math"/>
-        </w:rPr>
-        <w:t>₂</w:t>
-      </w:r>
-      <w:r>
-        <w:t xml:space="preserve"> baj</w:t>
-      </w:r>
-      <w:r>
-        <w:t>ó</w:t>
-      </w:r>
-      <w:r>
-        <w:t xml:space="preserve"> 4,64 dentro y 1,71 fuera: efecto neto </w:t>
+          <w:vertAlign w:val="subscript"/>
+        </w:rPr>
+        <w:t>2</w:t>
+      </w:r>
+      <w:r>
+        <w:t xml:space="preserve"> bajó 4,64 dentro y 1,71 fuera: efecto neto </w:t>
       </w:r>
       <w:r>
         <w:rPr>
@@ -4833,7 +4455,7 @@
           <w:noProof/>
         </w:rPr>
         <w:drawing>
-          <wp:inline distT="0" distB="0" distL="0" distR="0" wp14:anchorId="683949F7" wp14:editId="616C254C">
+          <wp:inline distT="0" distB="0" distL="0" distR="0" wp14:anchorId="557ACD61" wp14:editId="2E302515">
             <wp:extent cx="2971800" cy="1920240"/>
             <wp:effectExtent l="0" t="0" r="0" b="3810"/>
             <wp:docPr id="2" name="Imagen 2"/>
@@ -4845,6 +4467,247 @@
                 <pic:pic xmlns:pic="http://schemas.openxmlformats.org/drawingml/2006/picture">
                   <pic:nvPicPr>
                     <pic:cNvPr id="0" name="Picture 2"/>
+                    <pic:cNvPicPr>
+                      <a:picLocks noChangeAspect="1" noChangeArrowheads="1"/>
+                    </pic:cNvPicPr>
+                  </pic:nvPicPr>
+                  <pic:blipFill>
+                    <a:blip r:embed="rId7" cstate="print">
+                      <a:extLst>
+                        <a:ext uri="{28A0092B-C50C-407E-A947-70E740481C1C}">
+                          <a14:useLocalDpi xmlns:a14="http://schemas.microsoft.com/office/drawing/2010/main" val="0"/>
+                        </a:ext>
+                      </a:extLst>
+                    </a:blip>
+                    <a:srcRect/>
+                    <a:stretch>
+                      <a:fillRect/>
+                    </a:stretch>
+                  </pic:blipFill>
+                  <pic:spPr bwMode="auto">
+                    <a:xfrm>
+                      <a:off x="0" y="0"/>
+                      <a:ext cx="2971800" cy="1920240"/>
+                    </a:xfrm>
+                    <a:prstGeom prst="rect">
+                      <a:avLst/>
+                    </a:prstGeom>
+                    <a:noFill/>
+                    <a:ln>
+                      <a:noFill/>
+                    </a:ln>
+                  </pic:spPr>
+                </pic:pic>
+              </a:graphicData>
+            </a:graphic>
+          </wp:inline>
+        </w:drawing>
+      </w:r>
+    </w:p>
+    <w:p>
+      <w:pPr>
+        <w:pStyle w:val="pie"/>
+      </w:pPr>
+      <w:r>
+        <w:t>Figura 2. La distancia entre la barra roja y la azul de cada grupo es el efecto neto.</w:t>
+      </w:r>
+    </w:p>
+    <w:p>
+      <w:pPr>
+        <w:pStyle w:val="NormalWeb"/>
+      </w:pPr>
+      <w:r>
+        <w:rPr>
+          <w:b/>
+          <w:bCs/>
+        </w:rPr>
+        <w:t>P3. ¿Se mantiene en calma?</w:t>
+      </w:r>
+      <w:r>
+        <w:t xml:space="preserve"> Con viento de menos de 2 m/s, dentro pasó de 29,32 a 25,56 µg/m³ (−12,8 %); efecto neto </w:t>
+      </w:r>
+      <w:r>
+        <w:rPr>
+          <w:b/>
+          <w:bCs/>
+        </w:rPr>
+        <w:t>−</w:t>
+      </w:r>
+      <w:r>
+        <w:rPr>
+          <w:b/>
+          <w:bCs/>
+        </w:rPr>
+        <w:t>1,23</w:t>
+      </w:r>
+      <w:r>
+        <w:t xml:space="preserve"> </w:t>
+      </w:r>
+      <w:r>
+        <w:t xml:space="preserve">(intervalo de −2,05 a −0,42). </w:t>
+      </w:r>
+      <w:r>
+        <w:rPr>
+          <w:i/>
+          <w:iCs/>
+        </w:rPr>
+        <w:t>Qué significa:</w:t>
+      </w:r>
+      <w:r>
+        <w:t xml:space="preserve"> la bajada se mantiene sin viento; no se debe a que hiciera más viento.</w:t>
+      </w:r>
+    </w:p>
+    <w:p>
+      <w:pPr>
+        <w:pStyle w:val="NormalWeb"/>
+      </w:pPr>
+      <w:r>
+        <w:rPr>
+          <w:b/>
+          <w:bCs/>
+        </w:rPr>
+        <w:t>P4. ¿Baja también el SO</w:t>
+      </w:r>
+      <w:r>
+        <w:rPr>
+          <w:b/>
+          <w:bCs/>
+          <w:vertAlign w:val="subscript"/>
+        </w:rPr>
+        <w:t>2</w:t>
+      </w:r>
+      <w:r>
+        <w:rPr>
+          <w:b/>
+          <w:bCs/>
+        </w:rPr>
+        <w:t>?</w:t>
+      </w:r>
+      <w:r>
+        <w:t xml:space="preserve"> El SO</w:t>
+      </w:r>
+      <w:r>
+        <w:rPr>
+          <w:vertAlign w:val="subscript"/>
+        </w:rPr>
+        <w:t>2</w:t>
+      </w:r>
+      <w:r>
+        <w:t xml:space="preserve"> apenas sale de los coches. Efecto neto: </w:t>
+      </w:r>
+      <w:r>
+        <w:rPr>
+          <w:b/>
+          <w:bCs/>
+        </w:rPr>
+        <w:t>+0,33</w:t>
+      </w:r>
+      <w:r>
+        <w:t xml:space="preserve"> (intervalo de −0,01 a 0,66; Castrejana no lo mide). </w:t>
+      </w:r>
+      <w:r>
+        <w:rPr>
+          <w:i/>
+          <w:iCs/>
+        </w:rPr>
+        <w:t>Qué significa:</w:t>
+      </w:r>
+      <w:r>
+        <w:t xml:space="preserve"> no baja más dentro que fuera, así que la bajada del NO</w:t>
+      </w:r>
+      <w:r>
+        <w:rPr>
+          <w:vertAlign w:val="subscript"/>
+        </w:rPr>
+        <w:t>2</w:t>
+      </w:r>
+      <w:r>
+        <w:t xml:space="preserve"> no parece venir de una causa que afecte a todo el aire del centro.</w:t>
+      </w:r>
+    </w:p>
+    <w:p>
+      <w:pPr>
+        <w:pStyle w:val="NormalWeb"/>
+      </w:pPr>
+      <w:r>
+        <w:rPr>
+          <w:b/>
+          <w:bCs/>
+        </w:rPr>
+        <w:t>P5. ¿Qué aportó la fase 2?</w:t>
+      </w:r>
+      <w:r>
+        <w:t xml:space="preserve"> Fase 1 frente a antes: </w:t>
+      </w:r>
+      <w:r>
+        <w:rPr>
+          <w:b/>
+          <w:bCs/>
+        </w:rPr>
+        <w:t>−</w:t>
+      </w:r>
+      <w:r>
+        <w:rPr>
+          <w:b/>
+          <w:bCs/>
+        </w:rPr>
+        <w:t>1,29</w:t>
+      </w:r>
+      <w:r>
+        <w:t xml:space="preserve"> (intervalo de −2,43 a −0,13). Fase 2 frente a fase 1: </w:t>
+      </w:r>
+      <w:r>
+        <w:rPr>
+          <w:b/>
+          <w:bCs/>
+        </w:rPr>
+        <w:t>−</w:t>
+      </w:r>
+      <w:r>
+        <w:rPr>
+          <w:b/>
+          <w:bCs/>
+        </w:rPr>
+        <w:t>0,52</w:t>
+      </w:r>
+      <w:r>
+        <w:t xml:space="preserve"> </w:t>
+      </w:r>
+      <w:r>
+        <w:t xml:space="preserve">(intervalo de −1,72 a 0,74). </w:t>
+      </w:r>
+      <w:r>
+        <w:rPr>
+          <w:i/>
+          <w:iCs/>
+        </w:rPr>
+        <w:t>Qué significa:</w:t>
+      </w:r>
+      <w:r>
+        <w:t xml:space="preserve"> la fase 2 no muestra una bajada adicional que se pueda distinguir de cero; la bajada propia de dentro llegó sobre todo con la fase 1.</w:t>
+      </w:r>
+    </w:p>
+    <w:p>
+      <w:pPr>
+        <w:pStyle w:val="figura"/>
+      </w:pPr>
+      <w:r>
+        <w:rPr>
+          <w:noProof/>
+        </w:rPr>
+        <w:drawing>
+          <wp:inline distT="0" distB="0" distL="0" distR="0" wp14:anchorId="3FDD2CE7" wp14:editId="013D77F8">
+            <wp:extent cx="2971800" cy="1920240"/>
+            <wp:effectExtent l="0" t="0" r="0" b="3810"/>
+            <wp:docPr id="3" name="Imagen 3"/>
+            <wp:cNvGraphicFramePr>
+              <a:graphicFrameLocks xmlns:a="http://schemas.openxmlformats.org/drawingml/2006/main" noChangeAspect="1"/>
+            </wp:cNvGraphicFramePr>
+            <a:graphic xmlns:a="http://schemas.openxmlformats.org/drawingml/2006/main">
+              <a:graphicData uri="http://schemas.openxmlformats.org/drawingml/2006/picture">
+                <pic:pic xmlns:pic="http://schemas.openxmlformats.org/drawingml/2006/picture">
+                  <pic:nvPicPr>
+                    <pic:cNvPr id="0" name="Picture 3"/>
                     <pic:cNvPicPr>
                       <a:picLocks noChangeAspect="1" noChangeArrowheads="1"/>
                     </pic:cNvPicPr>
@@ -4887,7 +4750,21 @@
         <w:pStyle w:val="pie"/>
       </w:pPr>
       <w:r>
-        <w:t>Figura 2. La distancia entre la barra roja y la azul de cada grupo es el efecto neto.</w:t>
+        <w:t>Figura 3. Las dos zonas bajan; lo que cuenta es cuánto más baja la barra roja de una fase a otra.</w:t>
+      </w:r>
+    </w:p>
+    <w:p>
+      <w:pPr>
+        <w:pStyle w:val="Ttulo2"/>
+        <w:rPr>
+          <w:rFonts w:eastAsia="Times New Roman"/>
+        </w:rPr>
+      </w:pPr>
+      <w:r>
+        <w:rPr>
+          <w:rFonts w:eastAsia="Times New Roman"/>
+        </w:rPr>
+        <w:t>6. Conclusiones y recomendaciones</w:t>
       </w:r>
     </w:p>
     <w:p>
@@ -4899,37 +4776,52 @@
           <w:b/>
           <w:bCs/>
         </w:rPr>
-        <w:t>P3. ¿Se mantiene en calma?</w:t>
-      </w:r>
-      <w:r>
-        <w:t xml:space="preserve"> Con viento de menos de 2 m/s, dentro pasó de 29,32 a 25,56 µg/m³ (−12,8 %); efecto neto </w:t>
-      </w:r>
-      <w:r>
-        <w:rPr>
-          <w:b/>
-          <w:bCs/>
-        </w:rPr>
-        <w:t>−</w:t>
-      </w:r>
-      <w:r>
-        <w:rPr>
-          <w:b/>
-          <w:bCs/>
-        </w:rPr>
-        <w:t>1,23</w:t>
-      </w:r>
-      <w:r>
-        <w:t xml:space="preserve"> (intervalo de −2,05 a −0,42). </w:t>
-      </w:r>
-      <w:r>
-        <w:rPr>
-          <w:i/>
-          <w:iCs/>
-        </w:rPr>
-        <w:t>Qué significa:</w:t>
-      </w:r>
-      <w:r>
-        <w:t xml:space="preserve"> la bajada se mantiene sin viento; no se debe a que hiciera más viento.</w:t>
+        <w:t>Conclusiones</w:t>
+      </w:r>
+    </w:p>
+    <w:p>
+      <w:pPr>
+        <w:pStyle w:val="vineta"/>
+      </w:pPr>
+      <w:r>
+        <w:t>•  El NO</w:t>
+      </w:r>
+      <w:r>
+        <w:rPr>
+          <w:vertAlign w:val="subscript"/>
+        </w:rPr>
+        <w:t>2</w:t>
+      </w:r>
+      <w:r>
+        <w:t xml:space="preserve"> </w:t>
+      </w:r>
+      <w:r>
+        <w:t>bajó dentro de la ZBE más que fuera: efecto neto de −1,63 µg/m³ (intervalo de −2,38 a −0,94), frente a una caída bruta de −3,59.</w:t>
+      </w:r>
+    </w:p>
+    <w:p>
+      <w:pPr>
+        <w:pStyle w:val="vineta"/>
+      </w:pPr>
+      <w:r>
+        <w:t>•  Esa bajada se concentra en el horario de la ZBE (−2,93 frente a −0,85), se mantiene en calma (−1,23) y no aparece en el SO</w:t>
+      </w:r>
+      <w:r>
+        <w:rPr>
+          <w:vertAlign w:val="subscript"/>
+        </w:rPr>
+        <w:t>2</w:t>
+      </w:r>
+      <w:r>
+        <w:t xml:space="preserve"> (+0,33).</w:t>
+      </w:r>
+    </w:p>
+    <w:p>
+      <w:pPr>
+        <w:pStyle w:val="vineta"/>
+      </w:pPr>
+      <w:r>
+        <w:t>•  La fase 2 no muestra una bajada adicional distinguible de cero (−0,52; intervalo de −1,72 a 0,74).</w:t>
       </w:r>
     </w:p>
     <w:p>
@@ -4941,66 +4833,67 @@
           <w:b/>
           <w:bCs/>
         </w:rPr>
-        <w:t>P4. ¿Baja también el SO</w:t>
-      </w:r>
-      <w:r>
-        <w:rPr>
-          <w:rFonts w:ascii="Cambria Math" w:hAnsi="Cambria Math" w:cs="Cambria Math"/>
+        <w:t>Recomendaciones</w:t>
+      </w:r>
+    </w:p>
+    <w:p>
+      <w:pPr>
+        <w:pStyle w:val="vineta"/>
+      </w:pPr>
+      <w:r>
+        <w:t>•  </w:t>
+      </w:r>
+      <w:r>
+        <w:rPr>
           <w:b/>
           <w:bCs/>
         </w:rPr>
-        <w:t>₂</w:t>
+        <w:t>Mantener la ZBE con su horario actual:</w:t>
+      </w:r>
+      <w:r>
+        <w:t xml:space="preserve"> </w:t>
+      </w:r>
+      <w:r>
+        <w:t>el efecto neto (−1,63 µg/m³) es distinto de cero y mayor cuando la ZBE está activa (−2,93).</w:t>
+      </w:r>
+    </w:p>
+    <w:p>
+      <w:pPr>
+        <w:pStyle w:val="vineta"/>
+      </w:pPr>
+      <w:r>
+        <w:t>•  </w:t>
       </w:r>
       <w:r>
         <w:rPr>
           <w:b/>
           <w:bCs/>
         </w:rPr>
-        <w:t>?</w:t>
-      </w:r>
-      <w:r>
-        <w:t xml:space="preserve"> El SO</w:t>
-      </w:r>
-      <w:r>
-        <w:rPr>
-          <w:rFonts w:ascii="Cambria Math" w:hAnsi="Cambria Math" w:cs="Cambria Math"/>
-        </w:rPr>
-        <w:t>₂</w:t>
-      </w:r>
-      <w:r>
-        <w:t xml:space="preserve"> apenas sale de los coches. Efecto neto: </w:t>
+        <w:t>No ampliar todavía con medidas como la de la fase 2:</w:t>
+      </w:r>
+      <w:r>
+        <w:t xml:space="preserve"> añadió −0,52 µg/m³, dentro del margen de error. Repetir el cálculo cuando la fase 2 tenga más datos.</w:t>
+      </w:r>
+    </w:p>
+    <w:p>
+      <w:pPr>
+        <w:pStyle w:val="vineta"/>
+      </w:pPr>
+      <w:r>
+        <w:t>•  </w:t>
       </w:r>
       <w:r>
         <w:rPr>
           <w:b/>
           <w:bCs/>
         </w:rPr>
-        <w:t>+0,33</w:t>
-      </w:r>
-      <w:r>
-        <w:t xml:space="preserve"> (intervalo de −0,01 a 0,66; Castrejana no lo mide). </w:t>
-      </w:r>
-      <w:r>
-        <w:rPr>
-          <w:i/>
-          <w:iCs/>
-        </w:rPr>
-        <w:t>Qué significa:</w:t>
+        <w:t>Ajustar la medición antes de ampliar:</w:t>
       </w:r>
       <w:r>
         <w:t xml:space="preserve"> </w:t>
       </w:r>
       <w:r>
-        <w:t>no baja más dentro que fuera, así que la bajada del NO</w:t>
-      </w:r>
-      <w:r>
-        <w:rPr>
-          <w:rFonts w:ascii="Cambria Math" w:hAnsi="Cambria Math" w:cs="Cambria Math"/>
-        </w:rPr>
-        <w:t>₂</w:t>
-      </w:r>
-      <w:r>
-        <w:t xml:space="preserve"> no parece venir de una causa que afecte a todo el aire del centro.</w:t>
+        <w:t>solo hay 2 estaciones dentro y el control es desigual (Europa baja un 26,8 %, más que las de dentro). Comprobar si esa estación tuvo cambios propios, como obras, traslado o cambio de sensor [PENDIENTE DE VERIFICAR POR EL EQUIPO], y valorar más puntos de medida dentro de la ZBE.</w:t>
       </w:r>
     </w:p>
     <w:p>
@@ -5012,528 +4905,16 @@
           <w:b/>
           <w:bCs/>
         </w:rPr>
-        <w:t>P5. ¿Qué aportó la fase 2?</w:t>
-      </w:r>
-      <w:r>
-        <w:t xml:space="preserve"> Fase 1 frente a antes: </w:t>
-      </w:r>
-      <w:r>
-        <w:rPr>
-          <w:b/>
-          <w:bCs/>
-        </w:rPr>
-        <w:t>−</w:t>
-      </w:r>
-      <w:r>
-        <w:rPr>
-          <w:b/>
-          <w:bCs/>
-        </w:rPr>
-        <w:t>1,29</w:t>
-      </w:r>
-      <w:r>
-        <w:t xml:space="preserve"> (intervalo de −2,43 a −0,13). Fase 2 frente a fase 1: </w:t>
-      </w:r>
-      <w:r>
-        <w:rPr>
-          <w:b/>
-          <w:bCs/>
-        </w:rPr>
-        <w:t>−</w:t>
-      </w:r>
-      <w:r>
-        <w:rPr>
-          <w:b/>
-          <w:bCs/>
-        </w:rPr>
-        <w:t>0,52</w:t>
-      </w:r>
-      <w:r>
-        <w:t xml:space="preserve"> (intervalo de −1,72 a 0,74). </w:t>
-      </w:r>
-      <w:r>
-        <w:rPr>
-          <w:i/>
-          <w:iCs/>
-        </w:rPr>
-        <w:t>Qué significa:</w:t>
-      </w:r>
-      <w:r>
-        <w:t xml:space="preserve"> la fase 2 no muestra una bajada adicional que se pueda distinguir de cero; la bajada propia de dentro llegó sobre todo con la fase 1.</w:t>
-      </w:r>
-    </w:p>
-    <w:p>
-      <w:pPr>
-        <w:pStyle w:val="figura"/>
-      </w:pPr>
-      <w:r>
-        <w:rPr>
-          <w:noProof/>
-        </w:rPr>
-        <w:drawing>
-          <wp:inline distT="0" distB="0" distL="0" distR="0" wp14:anchorId="7C1AF39E" wp14:editId="350A264D">
-            <wp:extent cx="2971800" cy="1920240"/>
-            <wp:effectExtent l="0" t="0" r="0" b="3810"/>
-            <wp:docPr id="3" name="Imagen 3"/>
-            <wp:cNvGraphicFramePr>
-              <a:graphicFrameLocks xmlns:a="http://schemas.openxmlformats.org/drawingml/2006/main" noChangeAspect="1"/>
-            </wp:cNvGraphicFramePr>
-            <a:graphic xmlns:a="http://schemas.openxmlformats.org/drawingml/2006/main">
-              <a:graphicData uri="http://schemas.openxmlformats.org/drawingml/2006/picture">
-                <pic:pic xmlns:pic="http://schemas.openxmlformats.org/drawingml/2006/picture">
-                  <pic:nvPicPr>
-                    <pic:cNvPr id="0" name="Picture 3"/>
-                    <pic:cNvPicPr>
-                      <a:picLocks noChangeAspect="1" noChangeArrowheads="1"/>
-                    </pic:cNvPicPr>
-                  </pic:nvPicPr>
-                  <pic:blipFill>
-                    <a:blip r:embed="rId9" cstate="print">
-                      <a:extLst>
-                        <a:ext uri="{28A0092B-C50C-407E-A947-70E740481C1C}">
-                          <a14:useLocalDpi xmlns:a14="http://schemas.microsoft.com/office/drawing/2010/main" val="0"/>
-                        </a:ext>
-                      </a:extLst>
-                    </a:blip>
-                    <a:srcRect/>
-                    <a:stretch>
-                      <a:fillRect/>
-                    </a:stretch>
-                  </pic:blipFill>
-                  <pic:spPr bwMode="auto">
-                    <a:xfrm>
-                      <a:off x="0" y="0"/>
-                      <a:ext cx="2971800" cy="1920240"/>
-                    </a:xfrm>
-                    <a:prstGeom prst="rect">
-                      <a:avLst/>
-                    </a:prstGeom>
-                    <a:noFill/>
-                    <a:ln>
-                      <a:noFill/>
-                    </a:ln>
-                  </pic:spPr>
-                </pic:pic>
-              </a:graphicData>
-            </a:graphic>
-          </wp:inline>
-        </w:drawing>
-      </w:r>
-    </w:p>
-    <w:p>
-      <w:pPr>
-        <w:pStyle w:val="pie"/>
-      </w:pPr>
-      <w:r>
-        <w:t>Figura 3. Las dos zonas bajan; lo que cuenta es cuánto más baja la barra roja de una fase a otra.</w:t>
-      </w:r>
-    </w:p>
-    <w:p>
-      <w:pPr>
-        <w:pStyle w:val="Ttulo2"/>
-        <w:rPr>
-          <w:rFonts w:eastAsia="Times New Roman"/>
-        </w:rPr>
-      </w:pPr>
-      <w:r>
-        <w:rPr>
-          <w:rFonts w:eastAsia="Times New Roman"/>
-        </w:rPr>
-        <w:t>6. Conclusiones y recomendaciones</w:t>
-      </w:r>
-    </w:p>
-    <w:p>
-      <w:pPr>
-        <w:pStyle w:val="NormalWeb"/>
-      </w:pPr>
-      <w:r>
-        <w:rPr>
-          <w:b/>
-          <w:bCs/>
-        </w:rPr>
-        <w:t>Conclusiones</w:t>
-      </w:r>
-    </w:p>
-    <w:p>
-      <w:pPr>
-        <w:numPr>
-          <w:ilvl w:val="0"/>
-          <w:numId w:val="3"/>
-        </w:numPr>
-        <w:spacing w:before="100" w:beforeAutospacing="1" w:after="20"/>
-        <w:rPr>
-          <w:rFonts w:ascii="Arial" w:eastAsia="Times New Roman" w:hAnsi="Arial" w:cs="Arial"/>
-          <w:sz w:val="22"/>
-          <w:szCs w:val="22"/>
-        </w:rPr>
-      </w:pPr>
-      <w:r>
-        <w:rPr>
-          <w:rFonts w:ascii="Arial" w:eastAsia="Times New Roman" w:hAnsi="Arial" w:cs="Arial"/>
-          <w:sz w:val="22"/>
-          <w:szCs w:val="22"/>
-        </w:rPr>
-        <w:t>El NO</w:t>
-      </w:r>
-      <w:r>
-        <w:rPr>
-          <w:rFonts w:ascii="Cambria Math" w:eastAsia="Times New Roman" w:hAnsi="Cambria Math" w:cs="Cambria Math"/>
-          <w:sz w:val="22"/>
-          <w:szCs w:val="22"/>
-        </w:rPr>
-        <w:t>₂</w:t>
-      </w:r>
-      <w:r>
-        <w:rPr>
-          <w:rFonts w:ascii="Arial" w:eastAsia="Times New Roman" w:hAnsi="Arial" w:cs="Arial"/>
-          <w:sz w:val="22"/>
-          <w:szCs w:val="22"/>
-        </w:rPr>
-        <w:t xml:space="preserve"> baj</w:t>
-      </w:r>
-      <w:r>
-        <w:rPr>
-          <w:rFonts w:ascii="Arial" w:eastAsia="Times New Roman" w:hAnsi="Arial" w:cs="Arial"/>
-          <w:sz w:val="22"/>
-          <w:szCs w:val="22"/>
-        </w:rPr>
-        <w:t>ó</w:t>
-      </w:r>
-      <w:r>
-        <w:rPr>
-          <w:rFonts w:ascii="Arial" w:eastAsia="Times New Roman" w:hAnsi="Arial" w:cs="Arial"/>
-          <w:sz w:val="22"/>
-          <w:szCs w:val="22"/>
-        </w:rPr>
-        <w:t xml:space="preserve"> dentro de la ZBE m</w:t>
-      </w:r>
-      <w:r>
-        <w:rPr>
-          <w:rFonts w:ascii="Arial" w:eastAsia="Times New Roman" w:hAnsi="Arial" w:cs="Arial"/>
-          <w:sz w:val="22"/>
-          <w:szCs w:val="22"/>
-        </w:rPr>
-        <w:t>á</w:t>
-      </w:r>
-      <w:r>
-        <w:rPr>
-          <w:rFonts w:ascii="Arial" w:eastAsia="Times New Roman" w:hAnsi="Arial" w:cs="Arial"/>
-          <w:sz w:val="22"/>
-          <w:szCs w:val="22"/>
-        </w:rPr>
-        <w:t xml:space="preserve">s que fuera: efecto neto de </w:t>
-      </w:r>
-      <w:r>
-        <w:rPr>
-          <w:rFonts w:ascii="Arial" w:eastAsia="Times New Roman" w:hAnsi="Arial" w:cs="Arial"/>
-          <w:sz w:val="22"/>
-          <w:szCs w:val="22"/>
-        </w:rPr>
-        <w:t>−</w:t>
-      </w:r>
-      <w:r>
-        <w:rPr>
-          <w:rFonts w:ascii="Arial" w:eastAsia="Times New Roman" w:hAnsi="Arial" w:cs="Arial"/>
-          <w:sz w:val="22"/>
-          <w:szCs w:val="22"/>
-        </w:rPr>
-        <w:t xml:space="preserve">1,63 </w:t>
-      </w:r>
-      <w:r>
-        <w:rPr>
-          <w:rFonts w:ascii="Arial" w:eastAsia="Times New Roman" w:hAnsi="Arial" w:cs="Arial"/>
-          <w:sz w:val="22"/>
-          <w:szCs w:val="22"/>
-        </w:rPr>
-        <w:t>µ</w:t>
-      </w:r>
-      <w:r>
-        <w:rPr>
-          <w:rFonts w:ascii="Arial" w:eastAsia="Times New Roman" w:hAnsi="Arial" w:cs="Arial"/>
-          <w:sz w:val="22"/>
-          <w:szCs w:val="22"/>
-        </w:rPr>
-        <w:t>g/m</w:t>
-      </w:r>
-      <w:r>
-        <w:rPr>
-          <w:rFonts w:ascii="Arial" w:eastAsia="Times New Roman" w:hAnsi="Arial" w:cs="Arial"/>
-          <w:sz w:val="22"/>
-          <w:szCs w:val="22"/>
-        </w:rPr>
-        <w:t>³</w:t>
-      </w:r>
-      <w:r>
-        <w:rPr>
-          <w:rFonts w:ascii="Arial" w:eastAsia="Times New Roman" w:hAnsi="Arial" w:cs="Arial"/>
-          <w:sz w:val="22"/>
-          <w:szCs w:val="22"/>
-        </w:rPr>
-        <w:t xml:space="preserve"> (intervalo de </w:t>
-      </w:r>
-      <w:r>
-        <w:rPr>
-          <w:rFonts w:ascii="Arial" w:eastAsia="Times New Roman" w:hAnsi="Arial" w:cs="Arial"/>
-          <w:sz w:val="22"/>
-          <w:szCs w:val="22"/>
-        </w:rPr>
-        <w:t>−</w:t>
-      </w:r>
-      <w:r>
-        <w:rPr>
-          <w:rFonts w:ascii="Arial" w:eastAsia="Times New Roman" w:hAnsi="Arial" w:cs="Arial"/>
-          <w:sz w:val="22"/>
-          <w:szCs w:val="22"/>
-        </w:rPr>
-        <w:t xml:space="preserve">2,38 a </w:t>
-      </w:r>
-      <w:r>
-        <w:rPr>
-          <w:rFonts w:ascii="Arial" w:eastAsia="Times New Roman" w:hAnsi="Arial" w:cs="Arial"/>
-          <w:sz w:val="22"/>
-          <w:szCs w:val="22"/>
-        </w:rPr>
-        <w:t>−</w:t>
-      </w:r>
-      <w:r>
-        <w:rPr>
-          <w:rFonts w:ascii="Arial" w:eastAsia="Times New Roman" w:hAnsi="Arial" w:cs="Arial"/>
-          <w:sz w:val="22"/>
-          <w:szCs w:val="22"/>
-        </w:rPr>
-        <w:t>0,94), frente a una ca</w:t>
-      </w:r>
-      <w:r>
-        <w:rPr>
-          <w:rFonts w:ascii="Arial" w:eastAsia="Times New Roman" w:hAnsi="Arial" w:cs="Arial"/>
-          <w:sz w:val="22"/>
-          <w:szCs w:val="22"/>
-        </w:rPr>
-        <w:t>í</w:t>
-      </w:r>
-      <w:r>
-        <w:rPr>
-          <w:rFonts w:ascii="Arial" w:eastAsia="Times New Roman" w:hAnsi="Arial" w:cs="Arial"/>
-          <w:sz w:val="22"/>
-          <w:szCs w:val="22"/>
-        </w:rPr>
-        <w:t xml:space="preserve">da bruta de </w:t>
-      </w:r>
-      <w:r>
-        <w:rPr>
-          <w:rFonts w:ascii="Arial" w:eastAsia="Times New Roman" w:hAnsi="Arial" w:cs="Arial"/>
-          <w:sz w:val="22"/>
-          <w:szCs w:val="22"/>
-        </w:rPr>
-        <w:t>−</w:t>
-      </w:r>
-      <w:r>
-        <w:rPr>
-          <w:rFonts w:ascii="Arial" w:eastAsia="Times New Roman" w:hAnsi="Arial" w:cs="Arial"/>
-          <w:sz w:val="22"/>
-          <w:szCs w:val="22"/>
-        </w:rPr>
-        <w:t>3,59.</w:t>
-      </w:r>
-    </w:p>
-    <w:p>
-      <w:pPr>
-        <w:numPr>
-          <w:ilvl w:val="0"/>
-          <w:numId w:val="3"/>
-        </w:numPr>
-        <w:spacing w:before="100" w:beforeAutospacing="1" w:after="20"/>
-        <w:rPr>
-          <w:rFonts w:ascii="Arial" w:eastAsia="Times New Roman" w:hAnsi="Arial" w:cs="Arial"/>
-          <w:sz w:val="22"/>
-          <w:szCs w:val="22"/>
-        </w:rPr>
-      </w:pPr>
-      <w:r>
-        <w:rPr>
-          <w:rFonts w:ascii="Arial" w:eastAsia="Times New Roman" w:hAnsi="Arial" w:cs="Arial"/>
-          <w:sz w:val="22"/>
-          <w:szCs w:val="22"/>
-        </w:rPr>
-        <w:t>Esa bajada se concentra en el horario de la ZBE (−2,93 frente a −0,85), se mantiene en calma (−1,23) y no aparece en el SO</w:t>
-      </w:r>
-      <w:r>
-        <w:rPr>
-          <w:rFonts w:ascii="Cambria Math" w:eastAsia="Times New Roman" w:hAnsi="Cambria Math" w:cs="Cambria Math"/>
-          <w:sz w:val="22"/>
-          <w:szCs w:val="22"/>
-        </w:rPr>
-        <w:t>₂</w:t>
-      </w:r>
-      <w:r>
-        <w:rPr>
-          <w:rFonts w:ascii="Arial" w:eastAsia="Times New Roman" w:hAnsi="Arial" w:cs="Arial"/>
-          <w:sz w:val="22"/>
-          <w:szCs w:val="22"/>
-        </w:rPr>
-        <w:t xml:space="preserve"> (+0,33).</w:t>
-      </w:r>
-    </w:p>
-    <w:p>
-      <w:pPr>
-        <w:numPr>
-          <w:ilvl w:val="0"/>
-          <w:numId w:val="3"/>
-        </w:numPr>
-        <w:spacing w:before="100" w:beforeAutospacing="1" w:after="20"/>
-        <w:rPr>
-          <w:rFonts w:ascii="Arial" w:eastAsia="Times New Roman" w:hAnsi="Arial" w:cs="Arial"/>
-          <w:sz w:val="22"/>
-          <w:szCs w:val="22"/>
-        </w:rPr>
-      </w:pPr>
-      <w:r>
-        <w:rPr>
-          <w:rFonts w:ascii="Arial" w:eastAsia="Times New Roman" w:hAnsi="Arial" w:cs="Arial"/>
-          <w:sz w:val="22"/>
-          <w:szCs w:val="22"/>
-        </w:rPr>
-        <w:t>La fase 2 no muestra una bajada adicional distinguible de cero (−0,52; intervalo de −1,72 a 0,74).</w:t>
-      </w:r>
-    </w:p>
-    <w:p>
-      <w:pPr>
-        <w:pStyle w:val="NormalWeb"/>
-      </w:pPr>
-      <w:r>
-        <w:rPr>
-          <w:b/>
-          <w:bCs/>
-        </w:rPr>
-        <w:t>Recomendaciones</w:t>
-      </w:r>
-    </w:p>
-    <w:p>
-      <w:pPr>
-        <w:numPr>
-          <w:ilvl w:val="0"/>
-          <w:numId w:val="4"/>
-        </w:numPr>
-        <w:spacing w:before="100" w:beforeAutospacing="1" w:after="20"/>
-        <w:rPr>
-          <w:rFonts w:ascii="Arial" w:eastAsia="Times New Roman" w:hAnsi="Arial" w:cs="Arial"/>
-          <w:sz w:val="22"/>
-          <w:szCs w:val="22"/>
-        </w:rPr>
-      </w:pPr>
-      <w:r>
-        <w:rPr>
-          <w:rFonts w:ascii="Arial" w:eastAsia="Times New Roman" w:hAnsi="Arial" w:cs="Arial"/>
-          <w:b/>
-          <w:bCs/>
-          <w:sz w:val="22"/>
-          <w:szCs w:val="22"/>
-        </w:rPr>
-        <w:t>Mantener la ZBE con su horario actual:</w:t>
-      </w:r>
-      <w:r>
-        <w:rPr>
-          <w:rFonts w:ascii="Arial" w:eastAsia="Times New Roman" w:hAnsi="Arial" w:cs="Arial"/>
-          <w:sz w:val="22"/>
-          <w:szCs w:val="22"/>
-        </w:rPr>
-        <w:t xml:space="preserve"> el efecto neto (−1,63 µg/m³) es distinto de cero y mayor cuando la ZBE está activa (−2,93).</w:t>
-      </w:r>
-    </w:p>
-    <w:p>
-      <w:pPr>
-        <w:numPr>
-          <w:ilvl w:val="0"/>
-          <w:numId w:val="4"/>
-        </w:numPr>
-        <w:spacing w:before="100" w:beforeAutospacing="1" w:after="20"/>
-        <w:rPr>
-          <w:rFonts w:ascii="Arial" w:eastAsia="Times New Roman" w:hAnsi="Arial" w:cs="Arial"/>
-          <w:sz w:val="22"/>
-          <w:szCs w:val="22"/>
-        </w:rPr>
-      </w:pPr>
-      <w:r>
-        <w:rPr>
-          <w:rFonts w:ascii="Arial" w:eastAsia="Times New Roman" w:hAnsi="Arial" w:cs="Arial"/>
-          <w:b/>
-          <w:bCs/>
-          <w:sz w:val="22"/>
-          <w:szCs w:val="22"/>
-        </w:rPr>
-        <w:t>No ampliar todavía con medidas como la de la fase 2:</w:t>
-      </w:r>
-      <w:r>
-        <w:rPr>
-          <w:rFonts w:ascii="Arial" w:eastAsia="Times New Roman" w:hAnsi="Arial" w:cs="Arial"/>
-          <w:sz w:val="22"/>
-          <w:szCs w:val="22"/>
-        </w:rPr>
-        <w:t xml:space="preserve"> </w:t>
-      </w:r>
-      <w:r>
-        <w:rPr>
-          <w:rFonts w:ascii="Arial" w:eastAsia="Times New Roman" w:hAnsi="Arial" w:cs="Arial"/>
-          <w:sz w:val="22"/>
-          <w:szCs w:val="22"/>
-        </w:rPr>
-        <w:t>añadió −0,52 µg/m³, dentro del margen de error. Repetir el cálculo cuando la fase 2 tenga más datos.</w:t>
-      </w:r>
-    </w:p>
-    <w:p>
-      <w:pPr>
-        <w:numPr>
-          <w:ilvl w:val="0"/>
-          <w:numId w:val="4"/>
-        </w:numPr>
-        <w:spacing w:before="100" w:beforeAutospacing="1" w:after="20"/>
-        <w:rPr>
-          <w:rFonts w:ascii="Arial" w:eastAsia="Times New Roman" w:hAnsi="Arial" w:cs="Arial"/>
-          <w:sz w:val="22"/>
-          <w:szCs w:val="22"/>
-        </w:rPr>
-      </w:pPr>
-      <w:r>
-        <w:rPr>
-          <w:rFonts w:ascii="Arial" w:eastAsia="Times New Roman" w:hAnsi="Arial" w:cs="Arial"/>
-          <w:b/>
-          <w:bCs/>
-          <w:sz w:val="22"/>
-          <w:szCs w:val="22"/>
-        </w:rPr>
-        <w:t>Ajustar la medición antes de ampliar:</w:t>
-      </w:r>
-      <w:r>
-        <w:rPr>
-          <w:rFonts w:ascii="Arial" w:eastAsia="Times New Roman" w:hAnsi="Arial" w:cs="Arial"/>
-          <w:sz w:val="22"/>
-          <w:szCs w:val="22"/>
-        </w:rPr>
-        <w:t xml:space="preserve"> solo hay 2 estaciones dentro y el control es desigual (Europa baja un 26,8 %, más que las de dentro). Comprobar si esa estación tuvo cambios propios, como obras, traslado o cambio de sensor [PENDIENTE DE VERIFICAR POR EL EQUIPO], y valorar más puntos de medida dentro de la ZBE.</w:t>
-      </w:r>
-    </w:p>
-    <w:p>
-      <w:pPr>
-        <w:pStyle w:val="NormalWeb"/>
-      </w:pPr>
-      <w:r>
-        <w:rPr>
-          <w:b/>
-          <w:bCs/>
-        </w:rPr>
         <w:t>Limitaciones:</w:t>
       </w:r>
       <w:r>
-        <w:t xml:space="preserve"> </w:t>
-      </w:r>
-      <w:r>
-        <w:t>pocas estaciones (2 dentro y 5 de control); antes de la ZBE dentro y fuera no iban del todo en paralelo; las estaciones miden la concentración de NO</w:t>
-      </w:r>
-      <w:r>
-        <w:rPr>
-          <w:rFonts w:ascii="Cambria Math" w:hAnsi="Cambria Math" w:cs="Cambria Math"/>
-        </w:rPr>
-        <w:t>₂</w:t>
+        <w:t xml:space="preserve"> pocas estaciones (2 dentro y 5 de control); antes de la ZBE dentro y fuera no iban del todo en paralelo; las estaciones miden la concentración de NO</w:t>
+      </w:r>
+      <w:r>
+        <w:rPr>
+          <w:vertAlign w:val="subscript"/>
+        </w:rPr>
+        <w:t>2</w:t>
       </w:r>
       <w:r>
         <w:t xml:space="preserve"> en el aire, no lo que emiten los coches.</w:t>
@@ -6381,9 +5762,9 @@
         <w:tblLook w:val="04A0" w:firstRow="1" w:lastRow="0" w:firstColumn="1" w:lastColumn="0" w:noHBand="0" w:noVBand="1"/>
       </w:tblPr>
       <w:tblGrid>
-        <w:gridCol w:w="682"/>
-        <w:gridCol w:w="5136"/>
-        <w:gridCol w:w="3805"/>
+        <w:gridCol w:w="646"/>
+        <w:gridCol w:w="3809"/>
+        <w:gridCol w:w="5168"/>
       </w:tblGrid>
       <w:tr>
         <w:tc>
@@ -6505,7 +5886,7 @@
                 <w:sz w:val="22"/>
                 <w:szCs w:val="22"/>
               </w:rPr>
-              <w:t>Responsable</w:t>
+              <w:t>Responsable y rol</w:t>
             </w:r>
           </w:p>
         </w:tc>
@@ -6615,7 +5996,7 @@
                 <w:sz w:val="22"/>
                 <w:szCs w:val="22"/>
               </w:rPr>
-              <w:t>[A COMPLETAR POR EL EQUIPO]</w:t>
+              <w:t>Iñigo Guzmán (Lead Data Engineer; responsable de Big Data Aplicado)</w:t>
             </w:r>
           </w:p>
         </w:tc>
@@ -6725,7 +6106,7 @@
                 <w:sz w:val="22"/>
                 <w:szCs w:val="22"/>
               </w:rPr>
-              <w:t>[A COMPLETAR POR EL EQUIPO]</w:t>
+              <w:t>Iñigo Guzmán (Lead Data Engineer; responsable de Big Data Aplicado)</w:t>
             </w:r>
           </w:p>
         </w:tc>
@@ -6835,7 +6216,7 @@
                 <w:sz w:val="22"/>
                 <w:szCs w:val="22"/>
               </w:rPr>
-              <w:t>[A COMPLETAR POR EL EQUIPO]</w:t>
+              <w:t>Alfred Gabriel (Product Owner; responsable de Programación de IA)</w:t>
             </w:r>
           </w:p>
         </w:tc>
@@ -6909,43 +6290,43 @@
                 <w:sz w:val="22"/>
                 <w:szCs w:val="22"/>
               </w:rPr>
-              <w:t>Análisis P1-P5 y resultados.json</w:t>
-            </w:r>
-          </w:p>
-        </w:tc>
-        <w:tc>
-          <w:tcPr>
-            <w:tcW w:w="0" w:type="auto"/>
-            <w:tcBorders>
-              <w:top w:val="single" w:sz="6" w:space="0" w:color="999999"/>
-              <w:left w:val="single" w:sz="6" w:space="0" w:color="999999"/>
-              <w:bottom w:val="single" w:sz="6" w:space="0" w:color="999999"/>
-              <w:right w:val="single" w:sz="6" w:space="0" w:color="999999"/>
-            </w:tcBorders>
-            <w:tcMar>
-              <w:top w:w="0" w:type="dxa"/>
-              <w:left w:w="60" w:type="dxa"/>
-              <w:bottom w:w="0" w:type="dxa"/>
-              <w:right w:w="60" w:type="dxa"/>
-            </w:tcMar>
-            <w:hideMark/>
-          </w:tcPr>
-          <w:p>
-            <w:pPr>
-              <w:spacing w:before="40" w:after="80"/>
-              <w:rPr>
-                <w:rFonts w:ascii="Arial" w:eastAsia="Times New Roman" w:hAnsi="Arial" w:cs="Arial"/>
-                <w:sz w:val="22"/>
-                <w:szCs w:val="22"/>
-              </w:rPr>
-            </w:pPr>
-            <w:r>
-              <w:rPr>
-                <w:rFonts w:ascii="Arial" w:eastAsia="Times New Roman" w:hAnsi="Arial" w:cs="Arial"/>
-                <w:sz w:val="22"/>
-                <w:szCs w:val="22"/>
-              </w:rPr>
-              <w:t>[A COMPLETAR POR EL EQUIPO]</w:t>
+              <w:t>Análisis P1-P5, margen de error y resultados.json</w:t>
+            </w:r>
+          </w:p>
+        </w:tc>
+        <w:tc>
+          <w:tcPr>
+            <w:tcW w:w="0" w:type="auto"/>
+            <w:tcBorders>
+              <w:top w:val="single" w:sz="6" w:space="0" w:color="999999"/>
+              <w:left w:val="single" w:sz="6" w:space="0" w:color="999999"/>
+              <w:bottom w:val="single" w:sz="6" w:space="0" w:color="999999"/>
+              <w:right w:val="single" w:sz="6" w:space="0" w:color="999999"/>
+            </w:tcBorders>
+            <w:tcMar>
+              <w:top w:w="0" w:type="dxa"/>
+              <w:left w:w="60" w:type="dxa"/>
+              <w:bottom w:w="0" w:type="dxa"/>
+              <w:right w:w="60" w:type="dxa"/>
+            </w:tcMar>
+            <w:hideMark/>
+          </w:tcPr>
+          <w:p>
+            <w:pPr>
+              <w:spacing w:before="40" w:after="80"/>
+              <w:rPr>
+                <w:rFonts w:ascii="Arial" w:eastAsia="Times New Roman" w:hAnsi="Arial" w:cs="Arial"/>
+                <w:sz w:val="22"/>
+                <w:szCs w:val="22"/>
+              </w:rPr>
+            </w:pPr>
+            <w:r>
+              <w:rPr>
+                <w:rFonts w:ascii="Arial" w:eastAsia="Times New Roman" w:hAnsi="Arial" w:cs="Arial"/>
+                <w:sz w:val="22"/>
+                <w:szCs w:val="22"/>
+              </w:rPr>
+              <w:t>Kerman Latorre (Scrum Master; responsable de Modelos de IA)</w:t>
             </w:r>
           </w:p>
         </w:tc>
@@ -7055,7 +6436,7 @@
                 <w:sz w:val="22"/>
                 <w:szCs w:val="22"/>
               </w:rPr>
-              <w:t>[A COMPLETAR POR EL EQUIPO]</w:t>
+              <w:t>Iñigo Guzmán (Lead Data Engineer; responsable de Big Data Aplicado)</w:t>
             </w:r>
           </w:p>
         </w:tc>
@@ -7165,7 +6546,7 @@
                 <w:sz w:val="22"/>
                 <w:szCs w:val="22"/>
               </w:rPr>
-              <w:t>[A COMPLETAR POR EL EQUIPO]</w:t>
+              <w:t>Alfred Gabriel (Product Owner; responsable de Programación de IA)</w:t>
             </w:r>
           </w:p>
         </w:tc>
@@ -7173,18 +6554,19 @@
     </w:tbl>
     <w:p>
       <w:pPr>
-        <w:rPr>
-          <w:rFonts w:eastAsia="Times New Roman"/>
-        </w:rPr>
+        <w:pStyle w:val="NormalWeb"/>
       </w:pPr>
+      <w:r>
+        <w:t>Todo el equipo conoce y puede explicar el trabajo completo; la asignación indica quién lideró cada tarea.</w:t>
+      </w:r>
     </w:p>
     <w:sectPr>
-      <w:headerReference w:type="even" r:id="rId10"/>
-      <w:headerReference w:type="default" r:id="rId11"/>
-      <w:footerReference w:type="even" r:id="rId12"/>
-      <w:footerReference w:type="default" r:id="rId13"/>
-      <w:headerReference w:type="first" r:id="rId14"/>
-      <w:footerReference w:type="first" r:id="rId15"/>
+      <w:headerReference w:type="even" r:id="rId9"/>
+      <w:headerReference w:type="default" r:id="rId10"/>
+      <w:footerReference w:type="even" r:id="rId11"/>
+      <w:footerReference w:type="default" r:id="rId12"/>
+      <w:headerReference w:type="first" r:id="rId13"/>
+      <w:footerReference w:type="first" r:id="rId14"/>
       <w:pgSz w:w="11907" w:h="16839"/>
       <w:pgMar w:top="1134" w:right="1134" w:bottom="1134" w:left="1134" w:header="708" w:footer="708" w:gutter="0"/>
       <w:cols w:space="708"/>
@@ -7380,619 +6762,6 @@
     </w:pPr>
   </w:p>
 </w:hdr>
-</file>
-
-<file path=word/numbering.xml><?xml version="1.0" encoding="utf-8"?>
-<w:numbering xmlns:wpc="http://schemas.microsoft.com/office/word/2010/wordprocessingCanvas" xmlns:cx="http://schemas.microsoft.com/office/drawing/2014/chartex" xmlns:cx1="http://schemas.microsoft.com/office/drawing/2015/9/8/chartex" xmlns:cx2="http://schemas.microsoft.com/office/drawing/2015/10/21/chartex" xmlns:cx3="http://schemas.microsoft.com/office/drawing/2016/5/9/chartex" xmlns:cx4="http://schemas.microsoft.com/office/drawing/2016/5/10/chartex" xmlns:cx5="http://schemas.microsoft.com/office/drawing/2016/5/11/chartex" xmlns:cx6="http://schemas.microsoft.com/office/drawing/2016/5/12/chartex" xmlns:cx7="http://schemas.microsoft.com/office/drawing/2016/5/13/chartex" xmlns:cx8="http://schemas.microsoft.com/office/drawing/2016/5/14/chartex" xmlns:mc="http://schemas.openxmlformats.org/markup-compatibility/2006" xmlns:aink="http://schemas.microsoft.com/office/drawing/2016/ink" xmlns:am3d="http://schemas.microsoft.com/office/drawing/2017/model3d" xmlns:o="urn:schemas-microsoft-com:office:office" xmlns:oel="http://schemas.microsoft.com/office/2019/extlst" xmlns:r="http://schemas.openxmlformats.org/officeDocument/2006/relationships" xmlns:m="http://schemas.openxmlformats.org/officeDocument/2006/math" xmlns:v="urn:schemas-microsoft-com:vml" xmlns:wp14="http://schemas.microsoft.com/office/word/2010/wordprocessingDrawing" xmlns:wp="http://schemas.openxmlformats.org/drawingml/2006/wordprocessingDrawing" xmlns:w10="urn:schemas-microsoft-com:office:word" xmlns:w="http://schemas.openxmlformats.org/wordprocessingml/2006/main" xmlns:w14="http://schemas.microsoft.com/office/word/2010/wordml" xmlns:w15="http://schemas.microsoft.com/office/word/2012/wordml" xmlns:w16cex="http://schemas.microsoft.com/office/word/2018/wordml/cex" xmlns:w16cid="http://schemas.microsoft.com/office/word/2016/wordml/cid" xmlns:w16="http://schemas.microsoft.com/office/word/2018/wordml" xmlns:w16du="http://schemas.microsoft.com/office/word/2023/wordml/word16du" xmlns:w16sdtdh="http://schemas.microsoft.com/office/word/2020/wordml/sdtdatahash" xmlns:w16sdtfl="http://schemas.microsoft.com/office/word/2024/wordml/sdtformatlock" xmlns:w16se="http://schemas.microsoft.com/office/word/2015/wordml/symex" xmlns:wpg="http://schemas.microsoft.com/office/word/2010/wordprocessingGroup" xmlns:wpi="http://schemas.microsoft.com/office/word/2010/wordprocessingInk" xmlns:wne="http://schemas.microsoft.com/office/word/2006/wordml" xmlns:wps="http://schemas.microsoft.com/office/word/2010/wordprocessingShape" mc:Ignorable="w14 w15 w16se w16cid w16 w16cex w16sdtdh w16sdtfl w16du wp14">
-  <w:abstractNum w:abstractNumId="0" w15:restartNumberingAfterBreak="0">
-    <w:nsid w:val="259A3315"/>
-    <w:multiLevelType w:val="multilevel"/>
-    <w:tmpl w:val="2FD42094"/>
-    <w:lvl w:ilvl="0">
-      <w:start w:val="1"/>
-      <w:numFmt w:val="bullet"/>
-      <w:lvlText w:val=""/>
-      <w:lvlJc w:val="left"/>
-      <w:pPr>
-        <w:tabs>
-          <w:tab w:val="num" w:pos="720"/>
-        </w:tabs>
-        <w:ind w:left="720" w:hanging="360"/>
-      </w:pPr>
-      <w:rPr>
-        <w:rFonts w:ascii="Symbol" w:hAnsi="Symbol" w:hint="default"/>
-        <w:sz w:val="20"/>
-      </w:rPr>
-    </w:lvl>
-    <w:lvl w:ilvl="1" w:tentative="1">
-      <w:start w:val="1"/>
-      <w:numFmt w:val="bullet"/>
-      <w:lvlText w:val="o"/>
-      <w:lvlJc w:val="left"/>
-      <w:pPr>
-        <w:tabs>
-          <w:tab w:val="num" w:pos="1440"/>
-        </w:tabs>
-        <w:ind w:left="1440" w:hanging="360"/>
-      </w:pPr>
-      <w:rPr>
-        <w:rFonts w:ascii="Courier New" w:hAnsi="Courier New" w:hint="default"/>
-        <w:sz w:val="20"/>
-      </w:rPr>
-    </w:lvl>
-    <w:lvl w:ilvl="2" w:tentative="1">
-      <w:start w:val="1"/>
-      <w:numFmt w:val="bullet"/>
-      <w:lvlText w:val=""/>
-      <w:lvlJc w:val="left"/>
-      <w:pPr>
-        <w:tabs>
-          <w:tab w:val="num" w:pos="2160"/>
-        </w:tabs>
-        <w:ind w:left="2160" w:hanging="360"/>
-      </w:pPr>
-      <w:rPr>
-        <w:rFonts w:ascii="Wingdings" w:hAnsi="Wingdings" w:hint="default"/>
-        <w:sz w:val="20"/>
-      </w:rPr>
-    </w:lvl>
-    <w:lvl w:ilvl="3" w:tentative="1">
-      <w:start w:val="1"/>
-      <w:numFmt w:val="bullet"/>
-      <w:lvlText w:val=""/>
-      <w:lvlJc w:val="left"/>
-      <w:pPr>
-        <w:tabs>
-          <w:tab w:val="num" w:pos="2880"/>
-        </w:tabs>
-        <w:ind w:left="2880" w:hanging="360"/>
-      </w:pPr>
-      <w:rPr>
-        <w:rFonts w:ascii="Wingdings" w:hAnsi="Wingdings" w:hint="default"/>
-        <w:sz w:val="20"/>
-      </w:rPr>
-    </w:lvl>
-    <w:lvl w:ilvl="4" w:tentative="1">
-      <w:start w:val="1"/>
-      <w:numFmt w:val="bullet"/>
-      <w:lvlText w:val=""/>
-      <w:lvlJc w:val="left"/>
-      <w:pPr>
-        <w:tabs>
-          <w:tab w:val="num" w:pos="3600"/>
-        </w:tabs>
-        <w:ind w:left="3600" w:hanging="360"/>
-      </w:pPr>
-      <w:rPr>
-        <w:rFonts w:ascii="Wingdings" w:hAnsi="Wingdings" w:hint="default"/>
-        <w:sz w:val="20"/>
-      </w:rPr>
-    </w:lvl>
-    <w:lvl w:ilvl="5" w:tentative="1">
-      <w:start w:val="1"/>
-      <w:numFmt w:val="bullet"/>
-      <w:lvlText w:val=""/>
-      <w:lvlJc w:val="left"/>
-      <w:pPr>
-        <w:tabs>
-          <w:tab w:val="num" w:pos="4320"/>
-        </w:tabs>
-        <w:ind w:left="4320" w:hanging="360"/>
-      </w:pPr>
-      <w:rPr>
-        <w:rFonts w:ascii="Wingdings" w:hAnsi="Wingdings" w:hint="default"/>
-        <w:sz w:val="20"/>
-      </w:rPr>
-    </w:lvl>
-    <w:lvl w:ilvl="6" w:tentative="1">
-      <w:start w:val="1"/>
-      <w:numFmt w:val="bullet"/>
-      <w:lvlText w:val=""/>
-      <w:lvlJc w:val="left"/>
-      <w:pPr>
-        <w:tabs>
-          <w:tab w:val="num" w:pos="5040"/>
-        </w:tabs>
-        <w:ind w:left="5040" w:hanging="360"/>
-      </w:pPr>
-      <w:rPr>
-        <w:rFonts w:ascii="Wingdings" w:hAnsi="Wingdings" w:hint="default"/>
-        <w:sz w:val="20"/>
-      </w:rPr>
-    </w:lvl>
-    <w:lvl w:ilvl="7" w:tentative="1">
-      <w:start w:val="1"/>
-      <w:numFmt w:val="bullet"/>
-      <w:lvlText w:val=""/>
-      <w:lvlJc w:val="left"/>
-      <w:pPr>
-        <w:tabs>
-          <w:tab w:val="num" w:pos="5760"/>
-        </w:tabs>
-        <w:ind w:left="5760" w:hanging="360"/>
-      </w:pPr>
-      <w:rPr>
-        <w:rFonts w:ascii="Wingdings" w:hAnsi="Wingdings" w:hint="default"/>
-        <w:sz w:val="20"/>
-      </w:rPr>
-    </w:lvl>
-    <w:lvl w:ilvl="8" w:tentative="1">
-      <w:start w:val="1"/>
-      <w:numFmt w:val="bullet"/>
-      <w:lvlText w:val=""/>
-      <w:lvlJc w:val="left"/>
-      <w:pPr>
-        <w:tabs>
-          <w:tab w:val="num" w:pos="6480"/>
-        </w:tabs>
-        <w:ind w:left="6480" w:hanging="360"/>
-      </w:pPr>
-      <w:rPr>
-        <w:rFonts w:ascii="Wingdings" w:hAnsi="Wingdings" w:hint="default"/>
-        <w:sz w:val="20"/>
-      </w:rPr>
-    </w:lvl>
-  </w:abstractNum>
-  <w:abstractNum w:abstractNumId="1" w15:restartNumberingAfterBreak="0">
-    <w:nsid w:val="55611F10"/>
-    <w:multiLevelType w:val="multilevel"/>
-    <w:tmpl w:val="CF9E59E4"/>
-    <w:lvl w:ilvl="0">
-      <w:start w:val="1"/>
-      <w:numFmt w:val="bullet"/>
-      <w:lvlText w:val=""/>
-      <w:lvlJc w:val="left"/>
-      <w:pPr>
-        <w:tabs>
-          <w:tab w:val="num" w:pos="720"/>
-        </w:tabs>
-        <w:ind w:left="720" w:hanging="360"/>
-      </w:pPr>
-      <w:rPr>
-        <w:rFonts w:ascii="Symbol" w:hAnsi="Symbol" w:hint="default"/>
-        <w:sz w:val="20"/>
-      </w:rPr>
-    </w:lvl>
-    <w:lvl w:ilvl="1" w:tentative="1">
-      <w:start w:val="1"/>
-      <w:numFmt w:val="bullet"/>
-      <w:lvlText w:val="o"/>
-      <w:lvlJc w:val="left"/>
-      <w:pPr>
-        <w:tabs>
-          <w:tab w:val="num" w:pos="1440"/>
-        </w:tabs>
-        <w:ind w:left="1440" w:hanging="360"/>
-      </w:pPr>
-      <w:rPr>
-        <w:rFonts w:ascii="Courier New" w:hAnsi="Courier New" w:hint="default"/>
-        <w:sz w:val="20"/>
-      </w:rPr>
-    </w:lvl>
-    <w:lvl w:ilvl="2" w:tentative="1">
-      <w:start w:val="1"/>
-      <w:numFmt w:val="bullet"/>
-      <w:lvlText w:val=""/>
-      <w:lvlJc w:val="left"/>
-      <w:pPr>
-        <w:tabs>
-          <w:tab w:val="num" w:pos="2160"/>
-        </w:tabs>
-        <w:ind w:left="2160" w:hanging="360"/>
-      </w:pPr>
-      <w:rPr>
-        <w:rFonts w:ascii="Wingdings" w:hAnsi="Wingdings" w:hint="default"/>
-        <w:sz w:val="20"/>
-      </w:rPr>
-    </w:lvl>
-    <w:lvl w:ilvl="3" w:tentative="1">
-      <w:start w:val="1"/>
-      <w:numFmt w:val="bullet"/>
-      <w:lvlText w:val=""/>
-      <w:lvlJc w:val="left"/>
-      <w:pPr>
-        <w:tabs>
-          <w:tab w:val="num" w:pos="2880"/>
-        </w:tabs>
-        <w:ind w:left="2880" w:hanging="360"/>
-      </w:pPr>
-      <w:rPr>
-        <w:rFonts w:ascii="Wingdings" w:hAnsi="Wingdings" w:hint="default"/>
-        <w:sz w:val="20"/>
-      </w:rPr>
-    </w:lvl>
-    <w:lvl w:ilvl="4" w:tentative="1">
-      <w:start w:val="1"/>
-      <w:numFmt w:val="bullet"/>
-      <w:lvlText w:val=""/>
-      <w:lvlJc w:val="left"/>
-      <w:pPr>
-        <w:tabs>
-          <w:tab w:val="num" w:pos="3600"/>
-        </w:tabs>
-        <w:ind w:left="3600" w:hanging="360"/>
-      </w:pPr>
-      <w:rPr>
-        <w:rFonts w:ascii="Wingdings" w:hAnsi="Wingdings" w:hint="default"/>
-        <w:sz w:val="20"/>
-      </w:rPr>
-    </w:lvl>
-    <w:lvl w:ilvl="5" w:tentative="1">
-      <w:start w:val="1"/>
-      <w:numFmt w:val="bullet"/>
-      <w:lvlText w:val=""/>
-      <w:lvlJc w:val="left"/>
-      <w:pPr>
-        <w:tabs>
-          <w:tab w:val="num" w:pos="4320"/>
-        </w:tabs>
-        <w:ind w:left="4320" w:hanging="360"/>
-      </w:pPr>
-      <w:rPr>
-        <w:rFonts w:ascii="Wingdings" w:hAnsi="Wingdings" w:hint="default"/>
-        <w:sz w:val="20"/>
-      </w:rPr>
-    </w:lvl>
-    <w:lvl w:ilvl="6" w:tentative="1">
-      <w:start w:val="1"/>
-      <w:numFmt w:val="bullet"/>
-      <w:lvlText w:val=""/>
-      <w:lvlJc w:val="left"/>
-      <w:pPr>
-        <w:tabs>
-          <w:tab w:val="num" w:pos="5040"/>
-        </w:tabs>
-        <w:ind w:left="5040" w:hanging="360"/>
-      </w:pPr>
-      <w:rPr>
-        <w:rFonts w:ascii="Wingdings" w:hAnsi="Wingdings" w:hint="default"/>
-        <w:sz w:val="20"/>
-      </w:rPr>
-    </w:lvl>
-    <w:lvl w:ilvl="7" w:tentative="1">
-      <w:start w:val="1"/>
-      <w:numFmt w:val="bullet"/>
-      <w:lvlText w:val=""/>
-      <w:lvlJc w:val="left"/>
-      <w:pPr>
-        <w:tabs>
-          <w:tab w:val="num" w:pos="5760"/>
-        </w:tabs>
-        <w:ind w:left="5760" w:hanging="360"/>
-      </w:pPr>
-      <w:rPr>
-        <w:rFonts w:ascii="Wingdings" w:hAnsi="Wingdings" w:hint="default"/>
-        <w:sz w:val="20"/>
-      </w:rPr>
-    </w:lvl>
-    <w:lvl w:ilvl="8" w:tentative="1">
-      <w:start w:val="1"/>
-      <w:numFmt w:val="bullet"/>
-      <w:lvlText w:val=""/>
-      <w:lvlJc w:val="left"/>
-      <w:pPr>
-        <w:tabs>
-          <w:tab w:val="num" w:pos="6480"/>
-        </w:tabs>
-        <w:ind w:left="6480" w:hanging="360"/>
-      </w:pPr>
-      <w:rPr>
-        <w:rFonts w:ascii="Wingdings" w:hAnsi="Wingdings" w:hint="default"/>
-        <w:sz w:val="20"/>
-      </w:rPr>
-    </w:lvl>
-  </w:abstractNum>
-  <w:abstractNum w:abstractNumId="2" w15:restartNumberingAfterBreak="0">
-    <w:nsid w:val="697870C5"/>
-    <w:multiLevelType w:val="multilevel"/>
-    <w:tmpl w:val="2BB2CB8A"/>
-    <w:lvl w:ilvl="0">
-      <w:start w:val="1"/>
-      <w:numFmt w:val="bullet"/>
-      <w:lvlText w:val=""/>
-      <w:lvlJc w:val="left"/>
-      <w:pPr>
-        <w:tabs>
-          <w:tab w:val="num" w:pos="720"/>
-        </w:tabs>
-        <w:ind w:left="720" w:hanging="360"/>
-      </w:pPr>
-      <w:rPr>
-        <w:rFonts w:ascii="Symbol" w:hAnsi="Symbol" w:hint="default"/>
-        <w:sz w:val="20"/>
-      </w:rPr>
-    </w:lvl>
-    <w:lvl w:ilvl="1" w:tentative="1">
-      <w:start w:val="1"/>
-      <w:numFmt w:val="bullet"/>
-      <w:lvlText w:val="o"/>
-      <w:lvlJc w:val="left"/>
-      <w:pPr>
-        <w:tabs>
-          <w:tab w:val="num" w:pos="1440"/>
-        </w:tabs>
-        <w:ind w:left="1440" w:hanging="360"/>
-      </w:pPr>
-      <w:rPr>
-        <w:rFonts w:ascii="Courier New" w:hAnsi="Courier New" w:hint="default"/>
-        <w:sz w:val="20"/>
-      </w:rPr>
-    </w:lvl>
-    <w:lvl w:ilvl="2" w:tentative="1">
-      <w:start w:val="1"/>
-      <w:numFmt w:val="bullet"/>
-      <w:lvlText w:val=""/>
-      <w:lvlJc w:val="left"/>
-      <w:pPr>
-        <w:tabs>
-          <w:tab w:val="num" w:pos="2160"/>
-        </w:tabs>
-        <w:ind w:left="2160" w:hanging="360"/>
-      </w:pPr>
-      <w:rPr>
-        <w:rFonts w:ascii="Wingdings" w:hAnsi="Wingdings" w:hint="default"/>
-        <w:sz w:val="20"/>
-      </w:rPr>
-    </w:lvl>
-    <w:lvl w:ilvl="3" w:tentative="1">
-      <w:start w:val="1"/>
-      <w:numFmt w:val="bullet"/>
-      <w:lvlText w:val=""/>
-      <w:lvlJc w:val="left"/>
-      <w:pPr>
-        <w:tabs>
-          <w:tab w:val="num" w:pos="2880"/>
-        </w:tabs>
-        <w:ind w:left="2880" w:hanging="360"/>
-      </w:pPr>
-      <w:rPr>
-        <w:rFonts w:ascii="Wingdings" w:hAnsi="Wingdings" w:hint="default"/>
-        <w:sz w:val="20"/>
-      </w:rPr>
-    </w:lvl>
-    <w:lvl w:ilvl="4" w:tentative="1">
-      <w:start w:val="1"/>
-      <w:numFmt w:val="bullet"/>
-      <w:lvlText w:val=""/>
-      <w:lvlJc w:val="left"/>
-      <w:pPr>
-        <w:tabs>
-          <w:tab w:val="num" w:pos="3600"/>
-        </w:tabs>
-        <w:ind w:left="3600" w:hanging="360"/>
-      </w:pPr>
-      <w:rPr>
-        <w:rFonts w:ascii="Wingdings" w:hAnsi="Wingdings" w:hint="default"/>
-        <w:sz w:val="20"/>
-      </w:rPr>
-    </w:lvl>
-    <w:lvl w:ilvl="5" w:tentative="1">
-      <w:start w:val="1"/>
-      <w:numFmt w:val="bullet"/>
-      <w:lvlText w:val=""/>
-      <w:lvlJc w:val="left"/>
-      <w:pPr>
-        <w:tabs>
-          <w:tab w:val="num" w:pos="4320"/>
-        </w:tabs>
-        <w:ind w:left="4320" w:hanging="360"/>
-      </w:pPr>
-      <w:rPr>
-        <w:rFonts w:ascii="Wingdings" w:hAnsi="Wingdings" w:hint="default"/>
-        <w:sz w:val="20"/>
-      </w:rPr>
-    </w:lvl>
-    <w:lvl w:ilvl="6" w:tentative="1">
-      <w:start w:val="1"/>
-      <w:numFmt w:val="bullet"/>
-      <w:lvlText w:val=""/>
-      <w:lvlJc w:val="left"/>
-      <w:pPr>
-        <w:tabs>
-          <w:tab w:val="num" w:pos="5040"/>
-        </w:tabs>
-        <w:ind w:left="5040" w:hanging="360"/>
-      </w:pPr>
-      <w:rPr>
-        <w:rFonts w:ascii="Wingdings" w:hAnsi="Wingdings" w:hint="default"/>
-        <w:sz w:val="20"/>
-      </w:rPr>
-    </w:lvl>
-    <w:lvl w:ilvl="7" w:tentative="1">
-      <w:start w:val="1"/>
-      <w:numFmt w:val="bullet"/>
-      <w:lvlText w:val=""/>
-      <w:lvlJc w:val="left"/>
-      <w:pPr>
-        <w:tabs>
-          <w:tab w:val="num" w:pos="5760"/>
-        </w:tabs>
-        <w:ind w:left="5760" w:hanging="360"/>
-      </w:pPr>
-      <w:rPr>
-        <w:rFonts w:ascii="Wingdings" w:hAnsi="Wingdings" w:hint="default"/>
-        <w:sz w:val="20"/>
-      </w:rPr>
-    </w:lvl>
-    <w:lvl w:ilvl="8" w:tentative="1">
-      <w:start w:val="1"/>
-      <w:numFmt w:val="bullet"/>
-      <w:lvlText w:val=""/>
-      <w:lvlJc w:val="left"/>
-      <w:pPr>
-        <w:tabs>
-          <w:tab w:val="num" w:pos="6480"/>
-        </w:tabs>
-        <w:ind w:left="6480" w:hanging="360"/>
-      </w:pPr>
-      <w:rPr>
-        <w:rFonts w:ascii="Wingdings" w:hAnsi="Wingdings" w:hint="default"/>
-        <w:sz w:val="20"/>
-      </w:rPr>
-    </w:lvl>
-  </w:abstractNum>
-  <w:abstractNum w:abstractNumId="3" w15:restartNumberingAfterBreak="0">
-    <w:nsid w:val="71BA2C80"/>
-    <w:multiLevelType w:val="multilevel"/>
-    <w:tmpl w:val="C31EEA72"/>
-    <w:lvl w:ilvl="0">
-      <w:start w:val="1"/>
-      <w:numFmt w:val="bullet"/>
-      <w:lvlText w:val=""/>
-      <w:lvlJc w:val="left"/>
-      <w:pPr>
-        <w:tabs>
-          <w:tab w:val="num" w:pos="720"/>
-        </w:tabs>
-        <w:ind w:left="720" w:hanging="360"/>
-      </w:pPr>
-      <w:rPr>
-        <w:rFonts w:ascii="Symbol" w:hAnsi="Symbol" w:hint="default"/>
-        <w:sz w:val="20"/>
-      </w:rPr>
-    </w:lvl>
-    <w:lvl w:ilvl="1" w:tentative="1">
-      <w:start w:val="1"/>
-      <w:numFmt w:val="bullet"/>
-      <w:lvlText w:val="o"/>
-      <w:lvlJc w:val="left"/>
-      <w:pPr>
-        <w:tabs>
-          <w:tab w:val="num" w:pos="1440"/>
-        </w:tabs>
-        <w:ind w:left="1440" w:hanging="360"/>
-      </w:pPr>
-      <w:rPr>
-        <w:rFonts w:ascii="Courier New" w:hAnsi="Courier New" w:hint="default"/>
-        <w:sz w:val="20"/>
-      </w:rPr>
-    </w:lvl>
-    <w:lvl w:ilvl="2" w:tentative="1">
-      <w:start w:val="1"/>
-      <w:numFmt w:val="bullet"/>
-      <w:lvlText w:val=""/>
-      <w:lvlJc w:val="left"/>
-      <w:pPr>
-        <w:tabs>
-          <w:tab w:val="num" w:pos="2160"/>
-        </w:tabs>
-        <w:ind w:left="2160" w:hanging="360"/>
-      </w:pPr>
-      <w:rPr>
-        <w:rFonts w:ascii="Wingdings" w:hAnsi="Wingdings" w:hint="default"/>
-        <w:sz w:val="20"/>
-      </w:rPr>
-    </w:lvl>
-    <w:lvl w:ilvl="3" w:tentative="1">
-      <w:start w:val="1"/>
-      <w:numFmt w:val="bullet"/>
-      <w:lvlText w:val=""/>
-      <w:lvlJc w:val="left"/>
-      <w:pPr>
-        <w:tabs>
-          <w:tab w:val="num" w:pos="2880"/>
-        </w:tabs>
-        <w:ind w:left="2880" w:hanging="360"/>
-      </w:pPr>
-      <w:rPr>
-        <w:rFonts w:ascii="Wingdings" w:hAnsi="Wingdings" w:hint="default"/>
-        <w:sz w:val="20"/>
-      </w:rPr>
-    </w:lvl>
-    <w:lvl w:ilvl="4" w:tentative="1">
-      <w:start w:val="1"/>
-      <w:numFmt w:val="bullet"/>
-      <w:lvlText w:val=""/>
-      <w:lvlJc w:val="left"/>
-      <w:pPr>
-        <w:tabs>
-          <w:tab w:val="num" w:pos="3600"/>
-        </w:tabs>
-        <w:ind w:left="3600" w:hanging="360"/>
-      </w:pPr>
-      <w:rPr>
-        <w:rFonts w:ascii="Wingdings" w:hAnsi="Wingdings" w:hint="default"/>
-        <w:sz w:val="20"/>
-      </w:rPr>
-    </w:lvl>
-    <w:lvl w:ilvl="5" w:tentative="1">
-      <w:start w:val="1"/>
-      <w:numFmt w:val="bullet"/>
-      <w:lvlText w:val=""/>
-      <w:lvlJc w:val="left"/>
-      <w:pPr>
-        <w:tabs>
-          <w:tab w:val="num" w:pos="4320"/>
-        </w:tabs>
-        <w:ind w:left="4320" w:hanging="360"/>
-      </w:pPr>
-      <w:rPr>
-        <w:rFonts w:ascii="Wingdings" w:hAnsi="Wingdings" w:hint="default"/>
-        <w:sz w:val="20"/>
-      </w:rPr>
-    </w:lvl>
-    <w:lvl w:ilvl="6" w:tentative="1">
-      <w:start w:val="1"/>
-      <w:numFmt w:val="bullet"/>
-      <w:lvlText w:val=""/>
-      <w:lvlJc w:val="left"/>
-      <w:pPr>
-        <w:tabs>
-          <w:tab w:val="num" w:pos="5040"/>
-        </w:tabs>
-        <w:ind w:left="5040" w:hanging="360"/>
-      </w:pPr>
-      <w:rPr>
-        <w:rFonts w:ascii="Wingdings" w:hAnsi="Wingdings" w:hint="default"/>
-        <w:sz w:val="20"/>
-      </w:rPr>
-    </w:lvl>
-    <w:lvl w:ilvl="7" w:tentative="1">
-      <w:start w:val="1"/>
-      <w:numFmt w:val="bullet"/>
-      <w:lvlText w:val=""/>
-      <w:lvlJc w:val="left"/>
-      <w:pPr>
-        <w:tabs>
-          <w:tab w:val="num" w:pos="5760"/>
-        </w:tabs>
-        <w:ind w:left="5760" w:hanging="360"/>
-      </w:pPr>
-      <w:rPr>
-        <w:rFonts w:ascii="Wingdings" w:hAnsi="Wingdings" w:hint="default"/>
-        <w:sz w:val="20"/>
-      </w:rPr>
-    </w:lvl>
-    <w:lvl w:ilvl="8" w:tentative="1">
-      <w:start w:val="1"/>
-      <w:numFmt w:val="bullet"/>
-      <w:lvlText w:val=""/>
-      <w:lvlJc w:val="left"/>
-      <w:pPr>
-        <w:tabs>
-          <w:tab w:val="num" w:pos="6480"/>
-        </w:tabs>
-        <w:ind w:left="6480" w:hanging="360"/>
-      </w:pPr>
-      <w:rPr>
-        <w:rFonts w:ascii="Wingdings" w:hAnsi="Wingdings" w:hint="default"/>
-        <w:sz w:val="20"/>
-      </w:rPr>
-    </w:lvl>
-  </w:abstractNum>
-  <w:num w:numId="1" w16cid:durableId="259223381">
-    <w:abstractNumId w:val="0"/>
-  </w:num>
-  <w:num w:numId="2" w16cid:durableId="94837077">
-    <w:abstractNumId w:val="1"/>
-  </w:num>
-  <w:num w:numId="3" w16cid:durableId="356928633">
-    <w:abstractNumId w:val="2"/>
-  </w:num>
-  <w:num w:numId="4" w16cid:durableId="1681007498">
-    <w:abstractNumId w:val="3"/>
-  </w:num>
-</w:numbering>
 </file>
 
 <file path=word/styles.xml><?xml version="1.0" encoding="utf-8"?>
@@ -8478,6 +7247,19 @@
       <w:szCs w:val="22"/>
     </w:rPr>
   </w:style>
+  <w:style w:type="paragraph" w:customStyle="1" w:styleId="vineta">
+    <w:name w:val="vineta"/>
+    <w:basedOn w:val="Normal"/>
+    <w:pPr>
+      <w:spacing w:after="40"/>
+      <w:ind w:left="280" w:hanging="200"/>
+    </w:pPr>
+    <w:rPr>
+      <w:rFonts w:ascii="Arial" w:hAnsi="Arial" w:cs="Arial"/>
+      <w:sz w:val="22"/>
+      <w:szCs w:val="22"/>
+    </w:rPr>
+  </w:style>
   <w:style w:type="paragraph" w:customStyle="1" w:styleId="pie">
     <w:name w:val="pie"/>
     <w:basedOn w:val="Normal"/>
@@ -8513,7 +7295,7 @@
     <w:link w:val="EncabezadoCar"/>
     <w:uiPriority w:val="99"/>
     <w:unhideWhenUsed/>
-    <w:rsid w:val="006E0B96"/>
+    <w:rsid w:val="003F6B8E"/>
     <w:pPr>
       <w:tabs>
         <w:tab w:val="center" w:pos="4252"/>
@@ -8526,7 +7308,7 @@
     <w:basedOn w:val="Fuentedeprrafopredeter"/>
     <w:link w:val="Encabezado"/>
     <w:uiPriority w:val="99"/>
-    <w:rsid w:val="006E0B96"/>
+    <w:rsid w:val="003F6B8E"/>
     <w:rPr>
       <w:rFonts w:eastAsiaTheme="minorEastAsia"/>
       <w:sz w:val="24"/>
@@ -8539,7 +7321,7 @@
     <w:link w:val="PiedepginaCar"/>
     <w:uiPriority w:val="99"/>
     <w:unhideWhenUsed/>
-    <w:rsid w:val="006E0B96"/>
+    <w:rsid w:val="003F6B8E"/>
     <w:pPr>
       <w:tabs>
         <w:tab w:val="center" w:pos="4252"/>
@@ -8552,7 +7334,7 @@
     <w:basedOn w:val="Fuentedeprrafopredeter"/>
     <w:link w:val="Piedepgina"/>
     <w:uiPriority w:val="99"/>
-    <w:rsid w:val="006E0B96"/>
+    <w:rsid w:val="003F6B8E"/>
     <w:rPr>
       <w:rFonts w:eastAsiaTheme="minorEastAsia"/>
       <w:sz w:val="24"/>
@@ -8565,7 +7347,7 @@
     <w:uiPriority w:val="99"/>
     <w:semiHidden/>
     <w:unhideWhenUsed/>
-    <w:rsid w:val="006E0B96"/>
+    <w:rsid w:val="003F6B8E"/>
   </w:style>
 </w:styles>
 </file>

</xml_diff>

<commit_message>
Informe: roles por áreas de trabajo en vez de módulos del curso
</commit_message>
<xml_diff>
--- a/docs/Informe_Ejecutivo_ZBE_Bilbao_HaizeLab.docx
+++ b/docs/Informe_Ejecutivo_ZBE_Bilbao_HaizeLab.docx
@@ -4338,7 +4338,7 @@
           <w:noProof/>
         </w:rPr>
         <w:drawing>
-          <wp:inline distT="0" distB="0" distL="0" distR="0" wp14:anchorId="6941075E" wp14:editId="080B751E">
+          <wp:inline distT="0" distB="0" distL="0" distR="0" wp14:anchorId="045FF44C" wp14:editId="7AE2A449">
             <wp:extent cx="4046220" cy="2103120"/>
             <wp:effectExtent l="0" t="0" r="0" b="0"/>
             <wp:docPr id="1" name="Imagen 1"/>
@@ -4455,7 +4455,7 @@
           <w:noProof/>
         </w:rPr>
         <w:drawing>
-          <wp:inline distT="0" distB="0" distL="0" distR="0" wp14:anchorId="557ACD61" wp14:editId="2E302515">
+          <wp:inline distT="0" distB="0" distL="0" distR="0" wp14:anchorId="5816F3C7" wp14:editId="470A8D7C">
             <wp:extent cx="2971800" cy="1920240"/>
             <wp:effectExtent l="0" t="0" r="0" b="3810"/>
             <wp:docPr id="2" name="Imagen 2"/>
@@ -4696,7 +4696,7 @@
           <w:noProof/>
         </w:rPr>
         <w:drawing>
-          <wp:inline distT="0" distB="0" distL="0" distR="0" wp14:anchorId="3FDD2CE7" wp14:editId="013D77F8">
+          <wp:inline distT="0" distB="0" distL="0" distR="0" wp14:anchorId="36F0B7C0" wp14:editId="61E5C6DA">
             <wp:extent cx="2971800" cy="1920240"/>
             <wp:effectExtent l="0" t="0" r="0" b="3810"/>
             <wp:docPr id="3" name="Imagen 3"/>
@@ -5763,8 +5763,8 @@
       </w:tblPr>
       <w:tblGrid>
         <w:gridCol w:w="646"/>
-        <w:gridCol w:w="3809"/>
-        <w:gridCol w:w="5168"/>
+        <w:gridCol w:w="3886"/>
+        <w:gridCol w:w="5091"/>
       </w:tblGrid>
       <w:tr>
         <w:tc>
@@ -5996,7 +5996,7 @@
                 <w:sz w:val="22"/>
                 <w:szCs w:val="22"/>
               </w:rPr>
-              <w:t>Iñigo Guzmán (Lead Data Engineer; responsable de Big Data Aplicado)</w:t>
+              <w:t>Iñigo Guzmán (Lead Data Engineer · Datos e infraestructura)</w:t>
             </w:r>
           </w:p>
         </w:tc>
@@ -6106,7 +6106,7 @@
                 <w:sz w:val="22"/>
                 <w:szCs w:val="22"/>
               </w:rPr>
-              <w:t>Iñigo Guzmán (Lead Data Engineer; responsable de Big Data Aplicado)</w:t>
+              <w:t>Iñigo Guzmán (Lead Data Engineer · Datos e infraestructura)</w:t>
             </w:r>
           </w:p>
         </w:tc>
@@ -6216,7 +6216,7 @@
                 <w:sz w:val="22"/>
                 <w:szCs w:val="22"/>
               </w:rPr>
-              <w:t>Alfred Gabriel (Product Owner; responsable de Programación de IA)</w:t>
+              <w:t>Alfred Gabriel (Product Owner · Relación con el cliente y desarrollo)</w:t>
             </w:r>
           </w:p>
         </w:tc>
@@ -6326,7 +6326,7 @@
                 <w:sz w:val="22"/>
                 <w:szCs w:val="22"/>
               </w:rPr>
-              <w:t>Kerman Latorre (Scrum Master; responsable de Modelos de IA)</w:t>
+              <w:t>Kerman Latorre (Scrum Master · Análisis y modelado)</w:t>
             </w:r>
           </w:p>
         </w:tc>
@@ -6436,7 +6436,7 @@
                 <w:sz w:val="22"/>
                 <w:szCs w:val="22"/>
               </w:rPr>
-              <w:t>Iñigo Guzmán (Lead Data Engineer; responsable de Big Data Aplicado)</w:t>
+              <w:t>Iñigo Guzmán (Lead Data Engineer · Datos e infraestructura)</w:t>
             </w:r>
           </w:p>
         </w:tc>
@@ -6546,7 +6546,7 @@
                 <w:sz w:val="22"/>
                 <w:szCs w:val="22"/>
               </w:rPr>
-              <w:t>Alfred Gabriel (Product Owner; responsable de Programación de IA)</w:t>
+              <w:t>Alfred Gabriel (Product Owner · Relación con el cliente y desarrollo)</w:t>
             </w:r>
           </w:p>
         </w:tc>
@@ -7295,7 +7295,7 @@
     <w:link w:val="EncabezadoCar"/>
     <w:uiPriority w:val="99"/>
     <w:unhideWhenUsed/>
-    <w:rsid w:val="003F6B8E"/>
+    <w:rsid w:val="00525E24"/>
     <w:pPr>
       <w:tabs>
         <w:tab w:val="center" w:pos="4252"/>
@@ -7308,7 +7308,7 @@
     <w:basedOn w:val="Fuentedeprrafopredeter"/>
     <w:link w:val="Encabezado"/>
     <w:uiPriority w:val="99"/>
-    <w:rsid w:val="003F6B8E"/>
+    <w:rsid w:val="00525E24"/>
     <w:rPr>
       <w:rFonts w:eastAsiaTheme="minorEastAsia"/>
       <w:sz w:val="24"/>
@@ -7321,7 +7321,7 @@
     <w:link w:val="PiedepginaCar"/>
     <w:uiPriority w:val="99"/>
     <w:unhideWhenUsed/>
-    <w:rsid w:val="003F6B8E"/>
+    <w:rsid w:val="00525E24"/>
     <w:pPr>
       <w:tabs>
         <w:tab w:val="center" w:pos="4252"/>
@@ -7334,7 +7334,7 @@
     <w:basedOn w:val="Fuentedeprrafopredeter"/>
     <w:link w:val="Piedepgina"/>
     <w:uiPriority w:val="99"/>
-    <w:rsid w:val="003F6B8E"/>
+    <w:rsid w:val="00525E24"/>
     <w:rPr>
       <w:rFonts w:eastAsiaTheme="minorEastAsia"/>
       <w:sz w:val="24"/>
@@ -7347,7 +7347,7 @@
     <w:uiPriority w:val="99"/>
     <w:semiHidden/>
     <w:unhideWhenUsed/>
-    <w:rsid w:val="003F6B8E"/>
+    <w:rsid w:val="00525E24"/>
   </w:style>
 </w:styles>
 </file>

</xml_diff>

<commit_message>
Describir la frecuencia de la calidad del aire según los ficheros descargados
- MIA, informe SBD y notebook: «datos horarios por estación, según los propios ficheros descargados»
- Se quita cualquier afirmación sobre cada cuánto se actualiza la web del Gobierno Vasco
- Informe SBD: anchos de la tabla de fuentes y figura 1 a 14 cm para mantener 4 páginas de cuerpo
</commit_message>
<xml_diff>
--- a/docs/Informe_Ejecutivo_ZBE_Bilbao_HaizeLab.docx
+++ b/docs/Informe_Ejecutivo_ZBE_Bilbao_HaizeLab.docx
@@ -1394,10 +1394,10 @@
         <w:tblLook w:val="04A0" w:firstRow="1" w:lastRow="0" w:firstColumn="1" w:lastColumn="0" w:noHBand="0" w:noVBand="1"/>
       </w:tblPr>
       <w:tblGrid>
-        <w:gridCol w:w="1468"/>
-        <w:gridCol w:w="3758"/>
-        <w:gridCol w:w="1598"/>
-        <w:gridCol w:w="1725"/>
+        <w:gridCol w:w="1449"/>
+        <w:gridCol w:w="3084"/>
+        <w:gridCol w:w="2461"/>
+        <w:gridCol w:w="1555"/>
         <w:gridCol w:w="1074"/>
       </w:tblGrid>
       <w:tr>
@@ -1712,7 +1712,7 @@
                 <w:sz w:val="22"/>
                 <w:szCs w:val="22"/>
               </w:rPr>
-              <w:t>CSV anual; horaria</w:t>
+              <w:t>CSV; datos horarios por estación, según los propios ficheros descargados</w:t>
             </w:r>
           </w:p>
         </w:tc>
@@ -1765,7 +1765,15 @@
                 <w:sz w:val="22"/>
                 <w:szCs w:val="22"/>
               </w:rPr>
-              <w:t xml:space="preserve"> y SO</w:t>
+              <w:t xml:space="preserve"> </w:t>
+            </w:r>
+            <w:r>
+              <w:rPr>
+                <w:rFonts w:ascii="Arial" w:eastAsia="Times New Roman" w:hAnsi="Arial" w:cs="Arial"/>
+                <w:sz w:val="22"/>
+                <w:szCs w:val="22"/>
+              </w:rPr>
+              <w:t>y SO</w:t>
             </w:r>
             <w:r>
               <w:rPr>
@@ -2236,10 +2244,7 @@
         <w:t>Filas:</w:t>
       </w:r>
       <w:r>
-        <w:t xml:space="preserve"> </w:t>
-      </w:r>
-      <w:r>
-        <w:t>336.480 crudas, sin fechas no válidas ni repetidas. Se estudian 332.619, hasta el 30/09/2026, para que las cifras no cambien cuando se publican datos nuevos (Grafana puede mostrar datos posteriores).</w:t>
+        <w:t xml:space="preserve"> 336.480 crudas, sin fechas no válidas ni repetidas. Se estudian 332.619, hasta el 30/09/2026, para que las cifras no cambien cuando se publican datos nuevos (Grafana puede mostrar datos posteriores).</w:t>
       </w:r>
     </w:p>
     <w:p>
@@ -2247,6 +2252,7 @@
         <w:pStyle w:val="vineta"/>
       </w:pPr>
       <w:r>
+        <w:lastRenderedPageBreak/>
         <w:t>•  </w:t>
       </w:r>
       <w:r>
@@ -2265,7 +2271,6 @@
         <w:pStyle w:val="vineta"/>
       </w:pPr>
       <w:r>
-        <w:lastRenderedPageBreak/>
         <w:t>•  </w:t>
       </w:r>
       <w:r>
@@ -4338,9 +4343,9 @@
           <w:noProof/>
         </w:rPr>
         <w:drawing>
-          <wp:inline distT="0" distB="0" distL="0" distR="0" wp14:anchorId="045FF44C" wp14:editId="7AE2A449">
-            <wp:extent cx="4046220" cy="2103120"/>
-            <wp:effectExtent l="0" t="0" r="0" b="0"/>
+          <wp:inline distT="0" distB="0" distL="0" distR="0" wp14:anchorId="52550E2C" wp14:editId="07CDB459">
+            <wp:extent cx="3779520" cy="1958340"/>
+            <wp:effectExtent l="0" t="0" r="0" b="3810"/>
             <wp:docPr id="1" name="Imagen 1"/>
             <wp:cNvGraphicFramePr>
               <a:graphicFrameLocks xmlns:a="http://schemas.openxmlformats.org/drawingml/2006/main" noChangeAspect="1"/>
@@ -4370,7 +4375,7 @@
                   <pic:spPr bwMode="auto">
                     <a:xfrm>
                       <a:off x="0" y="0"/>
-                      <a:ext cx="4046220" cy="2103120"/>
+                      <a:ext cx="3779520" cy="1958340"/>
                     </a:xfrm>
                     <a:prstGeom prst="rect">
                       <a:avLst/>
@@ -4455,7 +4460,7 @@
           <w:noProof/>
         </w:rPr>
         <w:drawing>
-          <wp:inline distT="0" distB="0" distL="0" distR="0" wp14:anchorId="5816F3C7" wp14:editId="470A8D7C">
+          <wp:inline distT="0" distB="0" distL="0" distR="0" wp14:anchorId="391A390E" wp14:editId="5A6C4CDE">
             <wp:extent cx="2971800" cy="1920240"/>
             <wp:effectExtent l="0" t="0" r="0" b="3810"/>
             <wp:docPr id="2" name="Imagen 2"/>
@@ -4696,7 +4701,7 @@
           <w:noProof/>
         </w:rPr>
         <w:drawing>
-          <wp:inline distT="0" distB="0" distL="0" distR="0" wp14:anchorId="36F0B7C0" wp14:editId="61E5C6DA">
+          <wp:inline distT="0" distB="0" distL="0" distR="0" wp14:anchorId="5D75C074" wp14:editId="7D0F98F8">
             <wp:extent cx="2971800" cy="1920240"/>
             <wp:effectExtent l="0" t="0" r="0" b="3810"/>
             <wp:docPr id="3" name="Imagen 3"/>
@@ -7295,7 +7300,7 @@
     <w:link w:val="EncabezadoCar"/>
     <w:uiPriority w:val="99"/>
     <w:unhideWhenUsed/>
-    <w:rsid w:val="00525E24"/>
+    <w:rsid w:val="006A1684"/>
     <w:pPr>
       <w:tabs>
         <w:tab w:val="center" w:pos="4252"/>
@@ -7308,7 +7313,7 @@
     <w:basedOn w:val="Fuentedeprrafopredeter"/>
     <w:link w:val="Encabezado"/>
     <w:uiPriority w:val="99"/>
-    <w:rsid w:val="00525E24"/>
+    <w:rsid w:val="006A1684"/>
     <w:rPr>
       <w:rFonts w:eastAsiaTheme="minorEastAsia"/>
       <w:sz w:val="24"/>
@@ -7321,7 +7326,7 @@
     <w:link w:val="PiedepginaCar"/>
     <w:uiPriority w:val="99"/>
     <w:unhideWhenUsed/>
-    <w:rsid w:val="00525E24"/>
+    <w:rsid w:val="006A1684"/>
     <w:pPr>
       <w:tabs>
         <w:tab w:val="center" w:pos="4252"/>
@@ -7334,7 +7339,7 @@
     <w:basedOn w:val="Fuentedeprrafopredeter"/>
     <w:link w:val="Piedepgina"/>
     <w:uiPriority w:val="99"/>
-    <w:rsid w:val="00525E24"/>
+    <w:rsid w:val="006A1684"/>
     <w:rPr>
       <w:rFonts w:eastAsiaTheme="minorEastAsia"/>
       <w:sz w:val="24"/>
@@ -7347,7 +7352,7 @@
     <w:uiPriority w:val="99"/>
     <w:semiHidden/>
     <w:unhideWhenUsed/>
-    <w:rsid w:val="00525E24"/>
+    <w:rsid w:val="006A1684"/>
   </w:style>
 </w:styles>
 </file>

</xml_diff>

<commit_message>
Regenerar el informe SBD y el MIA sin pendientes
</commit_message>
<xml_diff>
--- a/docs/Informe_Ejecutivo_ZBE_Bilbao_HaizeLab.docx
+++ b/docs/Informe_Ejecutivo_ZBE_Bilbao_HaizeLab.docx
@@ -1394,10 +1394,10 @@
         <w:tblLook w:val="04A0" w:firstRow="1" w:lastRow="0" w:firstColumn="1" w:lastColumn="0" w:noHBand="0" w:noVBand="1"/>
       </w:tblPr>
       <w:tblGrid>
-        <w:gridCol w:w="1449"/>
-        <w:gridCol w:w="3084"/>
-        <w:gridCol w:w="2461"/>
-        <w:gridCol w:w="1555"/>
+        <w:gridCol w:w="1423"/>
+        <w:gridCol w:w="3989"/>
+        <w:gridCol w:w="1812"/>
+        <w:gridCol w:w="1325"/>
         <w:gridCol w:w="1074"/>
       </w:tblGrid>
       <w:tr>
@@ -2082,7 +2082,7 @@
                 <w:sz w:val="22"/>
                 <w:szCs w:val="22"/>
               </w:rPr>
-              <w:t>Elaboración propia: fases y festivos de Bilbao [PENDIENTE DE VERIFICAR la fuente de los festivos]</w:t>
+              <w:t>Elaboración propia: fases de la ZBE y lista de festivos de Bilbao escrita en ingesta/descargar_y_limpiar.py (no contrastada con un calendario oficial)</w:t>
             </w:r>
           </w:p>
         </w:tc>
@@ -2300,7 +2300,10 @@
         <w:t>NaN</w:t>
       </w:r>
       <w:r>
-        <w:t xml:space="preserve"> (celda vacía). Un 0 bajaría la media sin motivo y borrar la fila perdería los demás datos de esa hora.</w:t>
+        <w:t xml:space="preserve"> </w:t>
+      </w:r>
+      <w:r>
+        <w:t>(celda vacía). Un 0 bajaría la media sin motivo y borrar la fila perdería los demás datos de esa hora.</w:t>
       </w:r>
     </w:p>
     <w:p>
@@ -2318,10 +2321,7 @@
         <w:t>Unidades y hora:</w:t>
       </w:r>
       <w:r>
-        <w:t xml:space="preserve"> </w:t>
-      </w:r>
-      <w:r>
-        <w:t>el viento llega en km/h (media 8,85) y se pasa a m/s dividiendo entre 3,6 (media 2,46). La hora llega en GMT y se pasa a la de Madrid, que es la del horario de la ZBE.</w:t>
+        <w:t xml:space="preserve"> el viento llega en km/h (media 8,85) y se pasa a m/s dividiendo entre 3,6 (media 2,46). La hora llega en GMT y se pasa a la de Madrid, que es la del horario de la ZBE.</w:t>
       </w:r>
     </w:p>
     <w:p>
@@ -2366,7 +2366,10 @@
         <w:t>Integración:</w:t>
       </w:r>
       <w:r>
-        <w:t xml:space="preserve"> a cada medición se le une el calendario (por fecha) y el viento (por hora): 332.619 filas antes y 332.619 después, 0 repetidas.</w:t>
+        <w:t xml:space="preserve"> </w:t>
+      </w:r>
+      <w:r>
+        <w:t>a cada medición se le une el calendario (por fecha) y el viento (por hora): 332.619 filas antes y 332.619 después, 0 repetidas.</w:t>
       </w:r>
     </w:p>
     <w:p>
@@ -2398,10 +2401,7 @@
         <w:t>Dentro (tratamiento):</w:t>
       </w:r>
       <w:r>
-        <w:t xml:space="preserve"> </w:t>
-      </w:r>
-      <w:r>
-        <w:t>Mazarredo y Mª Díaz de Haro, dentro de la ZBE.</w:t>
+        <w:t xml:space="preserve"> Mazarredo y Mª Díaz de Haro, dentro de la ZBE.</w:t>
       </w:r>
     </w:p>
     <w:p>
@@ -2446,7 +2446,10 @@
         <w:t>Fondo:</w:t>
       </w:r>
       <w:r>
-        <w:t xml:space="preserve"> Arraiz, en un monte lejos del tráfico (8,73 µg/m³ antes de la ZBE, frente a 18,25 en el control). No se parece a una estación urbana, así que no entra en el control.</w:t>
+        <w:t xml:space="preserve"> </w:t>
+      </w:r>
+      <w:r>
+        <w:t>Arraiz, en un monte lejos del tráfico (8,73 µg/m³ antes de la ZBE, frente a 18,25 en el control). No se parece a una estación urbana, así que no entra en el control.</w:t>
       </w:r>
     </w:p>
     <w:p>
@@ -2491,7 +2494,10 @@
         <w:t>Efecto neto</w:t>
       </w:r>
       <w:r>
-        <w:t xml:space="preserve"> = caída bruta dentro − caída bruta fuera (método de diferencias en diferencias, estadístico). Mirar solo dentro mezclaría la ZBE con lo que habría bajado igualmente; restar lo que bajó fuera lo separa.</w:t>
+        <w:t xml:space="preserve"> </w:t>
+      </w:r>
+      <w:r>
+        <w:t>= caída bruta dentro − caída bruta fuera (método de diferencias en diferencias, estadístico). Mirar solo dentro mezclaría la ZBE con lo que habría bajado igualmente; restar lo que bajó fuera lo separa.</w:t>
       </w:r>
     </w:p>
     <w:p>
@@ -4342,8 +4348,9 @@
         <w:rPr>
           <w:noProof/>
         </w:rPr>
+        <w:lastRenderedPageBreak/>
         <w:drawing>
-          <wp:inline distT="0" distB="0" distL="0" distR="0" wp14:anchorId="52550E2C" wp14:editId="07CDB459">
+          <wp:inline distT="0" distB="0" distL="0" distR="0" wp14:anchorId="30F8A26D" wp14:editId="7D053DF3">
             <wp:extent cx="3779520" cy="1958340"/>
             <wp:effectExtent l="0" t="0" r="0" b="3810"/>
             <wp:docPr id="1" name="Imagen 1"/>
@@ -4460,7 +4467,7 @@
           <w:noProof/>
         </w:rPr>
         <w:drawing>
-          <wp:inline distT="0" distB="0" distL="0" distR="0" wp14:anchorId="391A390E" wp14:editId="5A6C4CDE">
+          <wp:inline distT="0" distB="0" distL="0" distR="0" wp14:anchorId="28FBF0F3" wp14:editId="65D02416">
             <wp:extent cx="2971800" cy="1920240"/>
             <wp:effectExtent l="0" t="0" r="0" b="3810"/>
             <wp:docPr id="2" name="Imagen 2"/>
@@ -4700,8 +4707,9 @@
         <w:rPr>
           <w:noProof/>
         </w:rPr>
+        <w:lastRenderedPageBreak/>
         <w:drawing>
-          <wp:inline distT="0" distB="0" distL="0" distR="0" wp14:anchorId="5D75C074" wp14:editId="7D0F98F8">
+          <wp:inline distT="0" distB="0" distL="0" distR="0" wp14:anchorId="07BE4F37" wp14:editId="593BCA63">
             <wp:extent cx="2971800" cy="1920240"/>
             <wp:effectExtent l="0" t="0" r="0" b="3810"/>
             <wp:docPr id="3" name="Imagen 3"/>
@@ -4898,7 +4906,7 @@
         <w:t xml:space="preserve"> </w:t>
       </w:r>
       <w:r>
-        <w:t>solo hay 2 estaciones dentro y el control es desigual (Europa baja un 26,8 %, más que las de dentro). Comprobar si esa estación tuvo cambios propios, como obras, traslado o cambio de sensor [PENDIENTE DE VERIFICAR POR EL EQUIPO], y valorar más puntos de medida dentro de la ZBE.</w:t>
+        <w:t>solo hay 2 estaciones dentro y el control es desigual. No hemos comprobado si la estación de Europa tuvo cambios propios (obras, traslado o sensor); su bajada (−26,8 %), mayor que la de las estaciones de dentro, se trata como una limitación del grupo de control. Conviene valorar más puntos de medida dentro de la ZBE.</w:t>
       </w:r>
     </w:p>
     <w:p>
@@ -4922,7 +4930,10 @@
         <w:t>2</w:t>
       </w:r>
       <w:r>
-        <w:t xml:space="preserve"> en el aire, no lo que emiten los coches.</w:t>
+        <w:t xml:space="preserve"> </w:t>
+      </w:r>
+      <w:r>
+        <w:t>en el aire, no lo que emiten los coches.</w:t>
       </w:r>
     </w:p>
     <w:p>
@@ -5443,6 +5454,7 @@
                 <w:sz w:val="22"/>
                 <w:szCs w:val="22"/>
               </w:rPr>
+              <w:lastRenderedPageBreak/>
               <w:t>Grafana 11.2</w:t>
             </w:r>
           </w:p>
@@ -7300,7 +7312,7 @@
     <w:link w:val="EncabezadoCar"/>
     <w:uiPriority w:val="99"/>
     <w:unhideWhenUsed/>
-    <w:rsid w:val="006A1684"/>
+    <w:rsid w:val="00D77B3B"/>
     <w:pPr>
       <w:tabs>
         <w:tab w:val="center" w:pos="4252"/>
@@ -7313,7 +7325,7 @@
     <w:basedOn w:val="Fuentedeprrafopredeter"/>
     <w:link w:val="Encabezado"/>
     <w:uiPriority w:val="99"/>
-    <w:rsid w:val="006A1684"/>
+    <w:rsid w:val="00D77B3B"/>
     <w:rPr>
       <w:rFonts w:eastAsiaTheme="minorEastAsia"/>
       <w:sz w:val="24"/>
@@ -7326,7 +7338,7 @@
     <w:link w:val="PiedepginaCar"/>
     <w:uiPriority w:val="99"/>
     <w:unhideWhenUsed/>
-    <w:rsid w:val="006A1684"/>
+    <w:rsid w:val="00D77B3B"/>
     <w:pPr>
       <w:tabs>
         <w:tab w:val="center" w:pos="4252"/>
@@ -7339,7 +7351,7 @@
     <w:basedOn w:val="Fuentedeprrafopredeter"/>
     <w:link w:val="Piedepgina"/>
     <w:uiPriority w:val="99"/>
-    <w:rsid w:val="006A1684"/>
+    <w:rsid w:val="00D77B3B"/>
     <w:rPr>
       <w:rFonts w:eastAsiaTheme="minorEastAsia"/>
       <w:sz w:val="24"/>
@@ -7352,7 +7364,7 @@
     <w:uiPriority w:val="99"/>
     <w:semiHidden/>
     <w:unhideWhenUsed/>
-    <w:rsid w:val="006A1684"/>
+    <w:rsid w:val="00D77B3B"/>
   </w:style>
 </w:styles>
 </file>

</xml_diff>

<commit_message>
Explicar en el informe SBD qué es NaN y por qué se usa
La viñeta de valores negativos define NaN, pone el ejemplo del sensor
de Europa y explica por qué no se pone un 0 ni se borra la fila. Para
seguir en 4 páginas de cuerpo se quita una frase repetida del método
y se acortan dos frases sin cambiar su sentido.

Closes #26
</commit_message>
<xml_diff>
--- a/docs/Informe_Ejecutivo_ZBE_Bilbao_HaizeLab.docx
+++ b/docs/Informe_Ejecutivo_ZBE_Bilbao_HaizeLab.docx
@@ -2234,6 +2234,7 @@
         <w:pStyle w:val="vineta"/>
       </w:pPr>
       <w:r>
+        <w:lastRenderedPageBreak/>
         <w:t>•  </w:t>
       </w:r>
       <w:r>
@@ -2252,7 +2253,6 @@
         <w:pStyle w:val="vineta"/>
       </w:pPr>
       <w:r>
-        <w:lastRenderedPageBreak/>
         <w:t>•  </w:t>
       </w:r>
       <w:r>
@@ -2300,10 +2300,26 @@
         <w:t>NaN</w:t>
       </w:r>
       <w:r>
-        <w:t xml:space="preserve"> </w:t>
-      </w:r>
-      <w:r>
-        <w:t>(celda vacía). Un 0 bajaría la media sin motivo y borrar la fila perdería los demás datos de esa hora.</w:t>
+        <w:t xml:space="preserve"> (</w:t>
+      </w:r>
+      <w:r>
+        <w:rPr>
+          <w:i/>
+          <w:iCs/>
+        </w:rPr>
+        <w:t>Not a Number</w:t>
+      </w:r>
+      <w:r>
+        <w:t>): celda sin dato, como cuando el sensor de Europa no midió; las medias no la cuentan. Un 0 diría que el aire estaba limpio y bajaría la media; borrar la fila perdería los demás datos de esa hora (SO</w:t>
+      </w:r>
+      <w:r>
+        <w:rPr>
+          <w:vertAlign w:val="subscript"/>
+        </w:rPr>
+        <w:t>2</w:t>
+      </w:r>
+      <w:r>
+        <w:t>, viento).</w:t>
       </w:r>
     </w:p>
     <w:p>
@@ -2348,7 +2364,10 @@
         <w:t>2</w:t>
       </w:r>
       <w:r>
-        <w:t xml:space="preserve"> ÷ horas que debería haber: 96,66 % en total, de 91,98 % (Mª Díaz de Haro) a 99,07 % (Erandio). Meteorología: 100 %.</w:t>
+        <w:t xml:space="preserve"> </w:t>
+      </w:r>
+      <w:r>
+        <w:t>÷ horas que debería haber: 96,66 % en total, de 91,98 % (Mª Díaz de Haro) a 99,07 % (Erandio). Meteorología: 100 %.</w:t>
       </w:r>
     </w:p>
     <w:p>
@@ -2366,10 +2385,7 @@
         <w:t>Integración:</w:t>
       </w:r>
       <w:r>
-        <w:t xml:space="preserve"> </w:t>
-      </w:r>
-      <w:r>
-        <w:t>a cada medición se le une el calendario (por fecha) y el viento (por hora): 332.619 filas antes y 332.619 después, 0 repetidas.</w:t>
+        <w:t xml:space="preserve"> a cada medición se le une el calendario (por fecha) y el viento (por hora): 332.619 filas antes y 332.619 después, 0 repetidas.</w:t>
       </w:r>
     </w:p>
     <w:p>
@@ -2419,7 +2435,10 @@
         <w:t>Fuera (control):</w:t>
       </w:r>
       <w:r>
-        <w:t xml:space="preserve"> Europa, Barakaldo, Basauri, Erandio y Castrejana. Mismo tiempo atmosférico y mismo tipo de coches que el centro, pero sin ZBE: muestran lo que habría bajado el NO</w:t>
+        <w:t xml:space="preserve"> </w:t>
+      </w:r>
+      <w:r>
+        <w:t>Europa, Barakaldo, Basauri, Erandio y Castrejana. Mismo tiempo atmosférico y tipo de coches que el centro, pero sin ZBE: muestran lo que habría bajado el NO</w:t>
       </w:r>
       <w:r>
         <w:rPr>
@@ -2446,10 +2465,7 @@
         <w:t>Fondo:</w:t>
       </w:r>
       <w:r>
-        <w:t xml:space="preserve"> </w:t>
-      </w:r>
-      <w:r>
-        <w:t>Arraiz, en un monte lejos del tráfico (8,73 µg/m³ antes de la ZBE, frente a 18,25 en el control). No se parece a una estación urbana, así que no entra en el control.</w:t>
+        <w:t xml:space="preserve"> Arraiz, en un monte lejos del tráfico (8,73 µg/m³ antes de la ZBE, frente a 18,25 en el control). No se parece a una estación urbana, así que no entra en el control.</w:t>
       </w:r>
     </w:p>
     <w:p>
@@ -2497,7 +2513,7 @@
         <w:t xml:space="preserve"> </w:t>
       </w:r>
       <w:r>
-        <w:t>= caída bruta dentro − caída bruta fuera (método de diferencias en diferencias, estadístico). Mirar solo dentro mezclaría la ZBE con lo que habría bajado igualmente; restar lo que bajó fuera lo separa.</w:t>
+        <w:t>= caída bruta dentro − caída bruta fuera (método de diferencias en diferencias, estadístico).</w:t>
       </w:r>
     </w:p>
     <w:p>
@@ -2522,10 +2538,7 @@
         <w:t>intervalo del 95 %</w:t>
       </w:r>
       <w:r>
-        <w:t xml:space="preserve"> </w:t>
-      </w:r>
-      <w:r>
-        <w:t>recoge el 95 % central de los resultados; si no incluye el cero, la bajada no se explica por el azar.</w:t>
+        <w:t xml:space="preserve"> recoge el 95 % central de los resultados; si no incluye el cero, la bajada no se explica por el azar.</w:t>
       </w:r>
     </w:p>
     <w:tbl>
@@ -4241,10 +4254,7 @@
         <w:t>2</w:t>
       </w:r>
       <w:r>
-        <w:t xml:space="preserve"> </w:t>
-      </w:r>
-      <w:r>
-        <w:t xml:space="preserve">medio (µg/m³) en cada periodo. </w:t>
+        <w:t xml:space="preserve"> medio (µg/m³) en cada periodo. </w:t>
       </w:r>
       <w:r>
         <w:rPr>
@@ -4298,7 +4308,10 @@
         <w:t xml:space="preserve"> dentro más que fuera?</w:t>
       </w:r>
       <w:r>
-        <w:t xml:space="preserve"> Dentro: 25,50 → 21,91 µg/m³ (−3,59). Fuera: 18,25 → 16,29 (−1,96). Efecto neto: −3,59 − (−1,96) = </w:t>
+        <w:t xml:space="preserve"> </w:t>
+      </w:r>
+      <w:r>
+        <w:t xml:space="preserve">Dentro: 25,50 → 21,91 µg/m³ (−3,59). Fuera: 18,25 → 16,29 (−1,96). Efecto neto: −3,59 − (−1,96) = </w:t>
       </w:r>
       <w:r>
         <w:rPr>
@@ -4325,7 +4338,7 @@
         <w:t>Qué significa:</w:t>
       </w:r>
       <w:r>
-        <w:t xml:space="preserve"> de la bajada de 3,59 dentro, 1,96 se vio también fuera; la parte propia de dentro, 1,63, es la que se asocia a la ZBE. Es una estimación aproximada: de 2022 a 2023 el NO</w:t>
+        <w:t xml:space="preserve"> de la bajada de 3,59 dentro, 1,96 se vio también fuera; la parte propia de dentro, 1,63, se asocia a la ZBE. Es una estimación aproximada: de 2022 a 2023 el NO</w:t>
       </w:r>
       <w:r>
         <w:rPr>
@@ -4334,10 +4347,7 @@
         <w:t>2</w:t>
       </w:r>
       <w:r>
-        <w:t xml:space="preserve"> </w:t>
-      </w:r>
-      <w:r>
-        <w:t>cambió +0,10 dentro y −1,14 fuera, así que antes de la ZBE no iban del todo en paralelo.</w:t>
+        <w:t xml:space="preserve"> cambió +0,10 dentro y −1,14 fuera, así que antes de la ZBE no iban del todo en paralelo.</w:t>
       </w:r>
     </w:p>
     <w:p>
@@ -4348,9 +4358,8 @@
         <w:rPr>
           <w:noProof/>
         </w:rPr>
-        <w:lastRenderedPageBreak/>
         <w:drawing>
-          <wp:inline distT="0" distB="0" distL="0" distR="0" wp14:anchorId="30F8A26D" wp14:editId="7D053DF3">
+          <wp:inline distT="0" distB="0" distL="0" distR="0" wp14:anchorId="10CA5ECD" wp14:editId="67253F93">
             <wp:extent cx="3779520" cy="1958340"/>
             <wp:effectExtent l="0" t="0" r="0" b="3810"/>
             <wp:docPr id="1" name="Imagen 1"/>
@@ -4455,7 +4464,13 @@
         <w:t>Qué significa:</w:t>
       </w:r>
       <w:r>
-        <w:t xml:space="preserve"> −2,93 es un efecto neto, no una caída. La bajada propia de dentro es mayor cuando la ZBE está activa, como cabe esperar si se debe a ella.</w:t>
+        <w:t xml:space="preserve"> </w:t>
+      </w:r>
+      <w:r>
+        <w:t>−</w:t>
+      </w:r>
+      <w:r>
+        <w:t>2,93 es un efecto neto, no una caída. La bajada propia de dentro es mayor cuando la ZBE está activa, como cabe esperar si se debe a ella.</w:t>
       </w:r>
     </w:p>
     <w:p>
@@ -4467,7 +4482,7 @@
           <w:noProof/>
         </w:rPr>
         <w:drawing>
-          <wp:inline distT="0" distB="0" distL="0" distR="0" wp14:anchorId="28FBF0F3" wp14:editId="65D02416">
+          <wp:inline distT="0" distB="0" distL="0" distR="0" wp14:anchorId="27DA5E25" wp14:editId="4139F2D2">
             <wp:extent cx="2971800" cy="1920240"/>
             <wp:effectExtent l="0" t="0" r="0" b="3810"/>
             <wp:docPr id="2" name="Imagen 2"/>
@@ -4553,10 +4568,7 @@
         <w:t>1,23</w:t>
       </w:r>
       <w:r>
-        <w:t xml:space="preserve"> </w:t>
-      </w:r>
-      <w:r>
-        <w:t xml:space="preserve">(intervalo de −2,05 a −0,42). </w:t>
+        <w:t xml:space="preserve"> (intervalo de −2,05 a −0,42). </w:t>
       </w:r>
       <w:r>
         <w:rPr>
@@ -4683,10 +4695,7 @@
         <w:t>0,52</w:t>
       </w:r>
       <w:r>
-        <w:t xml:space="preserve"> </w:t>
-      </w:r>
-      <w:r>
-        <w:t xml:space="preserve">(intervalo de −1,72 a 0,74). </w:t>
+        <w:t xml:space="preserve"> (intervalo de −1,72 a 0,74). </w:t>
       </w:r>
       <w:r>
         <w:rPr>
@@ -4707,9 +4716,8 @@
         <w:rPr>
           <w:noProof/>
         </w:rPr>
-        <w:lastRenderedPageBreak/>
         <w:drawing>
-          <wp:inline distT="0" distB="0" distL="0" distR="0" wp14:anchorId="07BE4F37" wp14:editId="593BCA63">
+          <wp:inline distT="0" distB="0" distL="0" distR="0" wp14:anchorId="4C59A076" wp14:editId="748F86F9">
             <wp:extent cx="2971800" cy="1920240"/>
             <wp:effectExtent l="0" t="0" r="0" b="3810"/>
             <wp:docPr id="3" name="Imagen 3"/>
@@ -5454,7 +5462,6 @@
                 <w:sz w:val="22"/>
                 <w:szCs w:val="22"/>
               </w:rPr>
-              <w:lastRenderedPageBreak/>
               <w:t>Grafana 11.2</w:t>
             </w:r>
           </w:p>
@@ -7312,7 +7319,7 @@
     <w:link w:val="EncabezadoCar"/>
     <w:uiPriority w:val="99"/>
     <w:unhideWhenUsed/>
-    <w:rsid w:val="00D77B3B"/>
+    <w:rsid w:val="00E87B5C"/>
     <w:pPr>
       <w:tabs>
         <w:tab w:val="center" w:pos="4252"/>
@@ -7325,7 +7332,7 @@
     <w:basedOn w:val="Fuentedeprrafopredeter"/>
     <w:link w:val="Encabezado"/>
     <w:uiPriority w:val="99"/>
-    <w:rsid w:val="00D77B3B"/>
+    <w:rsid w:val="00E87B5C"/>
     <w:rPr>
       <w:rFonts w:eastAsiaTheme="minorEastAsia"/>
       <w:sz w:val="24"/>
@@ -7338,7 +7345,7 @@
     <w:link w:val="PiedepginaCar"/>
     <w:uiPriority w:val="99"/>
     <w:unhideWhenUsed/>
-    <w:rsid w:val="00D77B3B"/>
+    <w:rsid w:val="00E87B5C"/>
     <w:pPr>
       <w:tabs>
         <w:tab w:val="center" w:pos="4252"/>
@@ -7351,7 +7358,7 @@
     <w:basedOn w:val="Fuentedeprrafopredeter"/>
     <w:link w:val="Piedepgina"/>
     <w:uiPriority w:val="99"/>
-    <w:rsid w:val="00D77B3B"/>
+    <w:rsid w:val="00E87B5C"/>
     <w:rPr>
       <w:rFonts w:eastAsiaTheme="minorEastAsia"/>
       <w:sz w:val="24"/>
@@ -7364,7 +7371,7 @@
     <w:uiPriority w:val="99"/>
     <w:semiHidden/>
     <w:unhideWhenUsed/>
-    <w:rsid w:val="00D77B3B"/>
+    <w:rsid w:val="00E87B5C"/>
   </w:style>
 </w:styles>
 </file>

</xml_diff>